<commit_message>
Update about, add research page test
</commit_message>
<xml_diff>
--- a/content/website-texts.docx
+++ b/content/website-texts.docx
@@ -44,15 +44,16 @@
         </w:rPr>
       </w:pPr>
       <w:r>
-        <w:t xml:space="preserve">I am an applied economist working in environmental and development economics. My research studies how households, governments and international and non-governmental </w:t>
-      </w:r>
-      <w:proofErr w:type="spellStart"/>
-      <w:r>
-        <w:t>organisations</w:t>
-      </w:r>
-      <w:proofErr w:type="spellEnd"/>
-      <w:r>
-        <w:t xml:space="preserve"> in low- and middle-income countries respond to environmental shocks. I combine (quasi-)experimental research designs with household survey, administrative and spatial data.</w:t>
+        <w:t>I am an applied economist working in environmental and development economics. My research studies how households, governments and international and non-governmental organisations in low- and middle-income countries respond to environmental shocks. I combine (quasi-)experimental research designs with household survey, administrative and spatial data.</w:t>
+      </w:r>
+      <w:r>
+        <w:t xml:space="preserve"> </w:t>
+      </w:r>
+      <w:r>
+        <w:t>I have conducted extensive fieldwork in Mongolia, Vietnam, and Ghana</w:t>
+      </w:r>
+      <w:r>
+        <w:t>.</w:t>
       </w:r>
     </w:p>
     <w:p>
@@ -63,15 +64,13 @@
         <w:t xml:space="preserve"> (</w:t>
       </w:r>
       <w:r>
-        <w:t>Berlin Office), where I am part of the research group on "Climate Impacts and Adaptation" and the Policy Lab on "Climate Change, Development and Migration". I am a J-PAL Invited Researcher and an organizing member of the Development Economics Network Berlin (</w:t>
-      </w:r>
-      <w:proofErr w:type="spellStart"/>
-      <w:r>
-        <w:t>DENeB</w:t>
-      </w:r>
-      <w:proofErr w:type="spellEnd"/>
-      <w:r>
-        <w:t>)</w:t>
+        <w:t>Berlin Office), where I am part of the research group on "Climate Impacts and Adaptation" and the Policy Lab on "Climate Change, Development and Migration". I am a J-PAL Invited Researcher and an organi</w:t>
+      </w:r>
+      <w:r>
+        <w:t>s</w:t>
+      </w:r>
+      <w:r>
+        <w:t>ing member of the Development Economics Network Berlin (DENeB)</w:t>
       </w:r>
       <w:r>
         <w:t>.</w:t>
@@ -81,138 +80,1562 @@
     <w:p>
       <w:r>
         <w:t>------------------------------------------------------------------------------</w:t>
+      </w:r>
+    </w:p>
+    <w:p/>
+    <w:p>
+      <w:r>
+        <w:t>*Get in touch at lukas.mogge [@] rwi-essen.de*</w:t>
+      </w:r>
+    </w:p>
+    <w:p>
+      <w:r>
+        <w:br w:type="page"/>
+      </w:r>
+    </w:p>
+    <w:p>
+      <w:pPr>
+        <w:pStyle w:val="Heading1"/>
+      </w:pPr>
+      <w:r>
+        <w:lastRenderedPageBreak/>
+        <w:t>2. Research page intro</w:t>
+      </w:r>
+    </w:p>
+    <w:p>
+      <w:r>
+        <w:rPr>
+          <w:i/>
+          <w:color w:val="808080"/>
+        </w:rPr>
+        <w:t>Goes in: _pages/research.md (optional intro prose). A sentence or two framing your research as a whole. Draft here:</w:t>
+      </w:r>
+    </w:p>
+    <w:p>
+      <w:r>
+        <w:t>Selected research</w:t>
+      </w:r>
+      <w:r>
+        <w:t xml:space="preserve"> </w:t>
+      </w:r>
+      <w:r>
+        <w:t>by theme</w:t>
+      </w:r>
+    </w:p>
+    <w:p>
+      <w:pPr>
+        <w:pStyle w:val="Heading1"/>
+      </w:pPr>
+      <w:r>
+        <w:t>3. Research pieces</w:t>
+      </w:r>
+    </w:p>
+    <w:p>
+      <w:r>
+        <w:rPr>
+          <w:i/>
+          <w:color w:val="808080"/>
+        </w:rPr>
+        <w:t>Goes in: one _projects/&lt;slug&gt;.md per piece. For each, draft title + body text. Group each under one topic. You decide how much text each gets.</w:t>
+      </w:r>
+    </w:p>
+    <w:p>
+      <w:pPr>
+        <w:pStyle w:val="Heading2"/>
+      </w:pPr>
+      <w:r>
+        <w:t>Topic: Weather risk</w:t>
+      </w:r>
+      <w:r>
+        <w:t xml:space="preserve">, </w:t>
+      </w:r>
+      <w:r>
+        <w:t>risk management</w:t>
+      </w:r>
+      <w:r>
+        <w:t>, and assistance</w:t>
+      </w:r>
+    </w:p>
+    <w:p>
+      <w:r>
+        <w:t xml:space="preserve">[With picture]: </w:t>
+      </w:r>
+      <w:r>
+        <w:t>assets/img/</w:t>
+      </w:r>
+      <w:r>
+        <w:t>IBLI_demand_2012_2022</w:t>
+      </w:r>
+      <w:r>
+        <w:t>.png</w:t>
+      </w:r>
+    </w:p>
+    <w:p>
+      <w:pPr>
+        <w:rPr>
+          <w:rFonts w:ascii="Georgia" w:hAnsi="Georgia"/>
+          <w:b/>
+          <w:bCs/>
+        </w:rPr>
+      </w:pPr>
+      <w:r>
+        <w:rPr>
+          <w:rFonts w:ascii="Georgia" w:hAnsi="Georgia"/>
+          <w:b/>
+          <w:bCs/>
+        </w:rPr>
+        <w:t xml:space="preserve">[Title] </w:t>
+      </w:r>
+      <w:r>
+        <w:rPr>
+          <w:rFonts w:ascii="Georgia" w:hAnsi="Georgia"/>
+          <w:b/>
+          <w:bCs/>
+        </w:rPr>
+        <w:t>Perception and protection: The effect of risk exposure on demand for index insurance in Mongolia (202</w:t>
+      </w:r>
+      <w:r>
+        <w:rPr>
+          <w:rFonts w:ascii="Georgia" w:hAnsi="Georgia"/>
+          <w:b/>
+          <w:bCs/>
+        </w:rPr>
+        <w:t>5</w:t>
+      </w:r>
+      <w:r>
+        <w:rPr>
+          <w:rFonts w:ascii="Georgia" w:hAnsi="Georgia"/>
+          <w:b/>
+          <w:bCs/>
+        </w:rPr>
+        <w:t>)</w:t>
+      </w:r>
+    </w:p>
+    <w:p>
+      <w:pPr>
+        <w:rPr>
+          <w:rFonts w:ascii="Georgia" w:hAnsi="Georgia"/>
+        </w:rPr>
+      </w:pPr>
+      <w:r>
+        <w:rPr>
+          <w:rFonts w:ascii="Georgia" w:hAnsi="Georgia"/>
+        </w:rPr>
+        <w:t xml:space="preserve">[Co-authors] </w:t>
+      </w:r>
+      <w:r>
+        <w:rPr>
+          <w:rFonts w:ascii="Georgia" w:hAnsi="Georgia"/>
+        </w:rPr>
+        <w:t>With Kati Kraehnert</w:t>
+      </w:r>
+    </w:p>
+    <w:p>
+      <w:pPr>
+        <w:rPr>
+          <w:rFonts w:ascii="Georgia" w:hAnsi="Georgia"/>
+          <w:i/>
+          <w:iCs/>
+        </w:rPr>
+      </w:pPr>
+      <w:r>
+        <w:rPr>
+          <w:rFonts w:ascii="Georgia" w:hAnsi="Georgia"/>
+          <w:i/>
+          <w:iCs/>
+        </w:rPr>
+        <w:t xml:space="preserve">[Journal] </w:t>
+      </w:r>
+      <w:r>
+        <w:rPr>
+          <w:rFonts w:ascii="Georgia" w:hAnsi="Georgia"/>
+          <w:i/>
+          <w:iCs/>
+        </w:rPr>
+        <w:t xml:space="preserve">Journal of Environmental Economics and Management </w:t>
+      </w:r>
+    </w:p>
+    <w:p>
+      <w:r>
+        <w:t>[Body text]</w:t>
+      </w:r>
+      <w:r>
+        <w:t xml:space="preserve"> </w:t>
+      </w:r>
+      <w:r>
+        <w:t xml:space="preserve">This study looks at how risk exposure shapes demand for index-based insurance </w:t>
+      </w:r>
+      <w:r>
+        <w:t xml:space="preserve">among herding households </w:t>
+      </w:r>
+      <w:r>
+        <w:t xml:space="preserve">in </w:t>
+      </w:r>
+      <w:r>
+        <w:t xml:space="preserve">rural </w:t>
+      </w:r>
+      <w:r>
+        <w:t>Mongolia</w:t>
+      </w:r>
+      <w:r>
+        <w:t xml:space="preserve"> where extreme winters pose a threat to livestock and the livelihoods of those who depend on it</w:t>
+      </w:r>
+      <w:r>
+        <w:t xml:space="preserve">. </w:t>
+      </w:r>
+      <w:r>
+        <w:t xml:space="preserve">We draw on district-level data </w:t>
+      </w:r>
+      <w:r>
+        <w:t xml:space="preserve">on livestock mortality and insurance uptake, </w:t>
+      </w:r>
+      <w:r>
+        <w:t>covering the whole country</w:t>
+      </w:r>
+      <w:r>
+        <w:t xml:space="preserve"> and</w:t>
+      </w:r>
+      <w:r>
+        <w:t xml:space="preserve"> spanning eleven years. Results indicate that demand for index insurance increases in areas exposed to adverse winter conditions during the insurance sales period, when pastoralists have to decide about </w:t>
+      </w:r>
+      <w:r>
+        <w:t>buying</w:t>
+      </w:r>
+      <w:r>
+        <w:t xml:space="preserve"> insurance coverage for next year’s winter. These results are best explained by availability bias, with households adapting their risk perception in response to adverse weather conditions.</w:t>
+      </w:r>
+    </w:p>
+    <w:p>
+      <w:r>
+        <w:t xml:space="preserve">Journal link: </w:t>
+      </w:r>
+      <w:hyperlink r:id="rId6" w:history="1">
+        <w:r>
+          <w:rPr>
+            <w:rStyle w:val="Hyperlink"/>
+          </w:rPr>
+          <w:t>https://doi.org/10.1016/j.jeem.2024.103113</w:t>
+        </w:r>
+      </w:hyperlink>
+      <w:r>
+        <w:t xml:space="preserve"> </w:t>
+      </w:r>
+    </w:p>
+    <w:p>
+      <w:r>
+        <w:t xml:space="preserve">Replication package: </w:t>
+      </w:r>
+      <w:hyperlink r:id="rId7" w:history="1">
+        <w:r>
+          <w:rPr>
+            <w:rStyle w:val="Hyperlink"/>
+          </w:rPr>
+          <w:t>https://doi.org/10.7910/DVN/GDGLID</w:t>
+        </w:r>
+      </w:hyperlink>
+      <w:r>
+        <w:t xml:space="preserve"> </w:t>
       </w:r>
     </w:p>
     <w:p/>
     <w:p>
       <w:pPr>
         <w:rPr>
+          <w:rFonts w:ascii="Georgia" w:hAnsi="Georgia"/>
           <w:b/>
           <w:bCs/>
         </w:rPr>
       </w:pPr>
       <w:r>
-        <w:t xml:space="preserve">*Get in touch at </w:t>
-      </w:r>
-      <w:proofErr w:type="spellStart"/>
-      <w:r>
-        <w:t>lukas.mogge</w:t>
-      </w:r>
-      <w:proofErr w:type="spellEnd"/>
-      <w:r>
-        <w:t xml:space="preserve"> [@] rwi-essen.de*</w:t>
+        <w:rPr>
+          <w:rFonts w:ascii="Georgia" w:hAnsi="Georgia"/>
+          <w:b/>
+          <w:bCs/>
+        </w:rPr>
+        <w:t xml:space="preserve">[Title] </w:t>
+      </w:r>
+      <w:r>
+        <w:rPr>
+          <w:rFonts w:ascii="Georgia" w:hAnsi="Georgia"/>
+          <w:b/>
+          <w:bCs/>
+        </w:rPr>
+        <w:t>Anticipatory cash transfers in the context of weather disasters (2025)</w:t>
       </w:r>
     </w:p>
+    <w:p>
+      <w:r>
+        <w:t>[With picture]: assets/img/</w:t>
+      </w:r>
+      <w:r>
+        <w:t>dzud_risk_map_2021</w:t>
+      </w:r>
+      <w:r>
+        <w:t>.png</w:t>
+      </w:r>
+    </w:p>
+    <w:p>
+      <w:pPr>
+        <w:rPr>
+          <w:rFonts w:ascii="Georgia" w:hAnsi="Georgia"/>
+        </w:rPr>
+      </w:pPr>
+      <w:r>
+        <w:rPr>
+          <w:rFonts w:ascii="Georgia" w:hAnsi="Georgia"/>
+        </w:rPr>
+        <w:t xml:space="preserve">[Co-authors] </w:t>
+      </w:r>
+      <w:r>
+        <w:rPr>
+          <w:rFonts w:ascii="Georgia" w:hAnsi="Georgia"/>
+        </w:rPr>
+        <w:t>With Julian Roeckert and Kati Kraehnert</w:t>
+      </w:r>
+    </w:p>
+    <w:p>
+      <w:pPr>
+        <w:rPr>
+          <w:rFonts w:ascii="Georgia" w:hAnsi="Georgia"/>
+          <w:i/>
+          <w:iCs/>
+        </w:rPr>
+      </w:pPr>
+      <w:r>
+        <w:rPr>
+          <w:rFonts w:ascii="Georgia" w:hAnsi="Georgia"/>
+          <w:i/>
+          <w:iCs/>
+        </w:rPr>
+        <w:t xml:space="preserve">[Journal] </w:t>
+      </w:r>
+      <w:r>
+        <w:rPr>
+          <w:rFonts w:ascii="Georgia" w:hAnsi="Georgia"/>
+          <w:i/>
+          <w:iCs/>
+        </w:rPr>
+        <w:t>Journal of the Association of Environmental and Resource Economists</w:t>
+      </w:r>
+    </w:p>
+    <w:p>
+      <w:r>
+        <w:t xml:space="preserve">[Body text] </w:t>
+      </w:r>
+      <w:r>
+        <w:t xml:space="preserve">We analyze the impact of anticipatory humanitarian cash transfers distributed to pastoralist households in Mongolia before an extreme winter event reached its peak. For recipients with smaller herds before the disaster, the receipt of anticipatory cash transfers </w:t>
+      </w:r>
+      <w:r>
+        <w:lastRenderedPageBreak/>
+        <w:t>increases their post-disaster herd size, herd-related investments, and home consumption of livestock. No significant effects of the intervention are detected when considering the full sample, including relatively wealthy pastoralists. The paper includes a discussion of the practical challenges in evaluating (anticipatory) humanitarian interventions.</w:t>
+      </w:r>
+    </w:p>
+    <w:p>
+      <w:r>
+        <w:t xml:space="preserve">Journal link: </w:t>
+      </w:r>
+      <w:hyperlink r:id="rId8">
+        <w:r>
+          <w:rPr>
+            <w:rFonts w:ascii="Georgia" w:eastAsia="Georgia" w:hAnsi="Georgia" w:cs="Georgia"/>
+            <w:color w:val="0000FF"/>
+            <w:sz w:val="21"/>
+            <w:szCs w:val="21"/>
+            <w:u w:val="single"/>
+          </w:rPr>
+          <w:t>https://doi.org/10.1086/735534</w:t>
+        </w:r>
+      </w:hyperlink>
+      <w:r>
+        <w:t xml:space="preserve"> </w:t>
+      </w:r>
+    </w:p>
+    <w:p>
+      <w:r>
+        <w:t xml:space="preserve">Policy Brief: </w:t>
+      </w:r>
+      <w:hyperlink r:id="rId9" w:history="1">
+        <w:r>
+          <w:rPr>
+            <w:rStyle w:val="Hyperlink"/>
+          </w:rPr>
+          <w:t>https://www.rwi-essen.de/fileadmin/user_upload/RWI/Publikationen/Impact_Notes/rwi-impact_note_anticipatory_humanitarian_action.pdf</w:t>
+        </w:r>
+      </w:hyperlink>
+      <w:r>
+        <w:t xml:space="preserve"> </w:t>
+      </w:r>
+    </w:p>
+    <w:p>
+      <w:r>
+        <w:t xml:space="preserve">Replication package: </w:t>
+      </w:r>
+      <w:hyperlink r:id="rId10">
+        <w:r>
+          <w:rPr>
+            <w:rFonts w:ascii="Georgia" w:eastAsia="Georgia" w:hAnsi="Georgia" w:cs="Georgia"/>
+            <w:color w:val="0000FF"/>
+            <w:sz w:val="21"/>
+            <w:szCs w:val="21"/>
+            <w:u w:val="single"/>
+          </w:rPr>
+          <w:t>https://doi.org/10.7910/DVN/GDGLID</w:t>
+        </w:r>
+      </w:hyperlink>
+    </w:p>
+    <w:p/>
+    <w:p>
+      <w:pPr>
+        <w:rPr>
+          <w:rFonts w:ascii="Georgia" w:hAnsi="Georgia"/>
+          <w:b/>
+          <w:bCs/>
+        </w:rPr>
+      </w:pPr>
+      <w:r>
+        <w:rPr>
+          <w:rFonts w:ascii="Georgia" w:hAnsi="Georgia"/>
+          <w:b/>
+          <w:bCs/>
+        </w:rPr>
+        <w:t xml:space="preserve">[Title] </w:t>
+      </w:r>
+      <w:r>
+        <w:rPr>
+          <w:rFonts w:ascii="Georgia" w:hAnsi="Georgia"/>
+          <w:b/>
+          <w:bCs/>
+        </w:rPr>
+        <w:t>Charity hazard in climate adaptation: The effect of anticipatory cash transfers on demand for weather insurance</w:t>
+      </w:r>
+      <w:r>
+        <w:rPr>
+          <w:rFonts w:ascii="Georgia" w:hAnsi="Georgia"/>
+          <w:b/>
+          <w:bCs/>
+        </w:rPr>
+        <w:t xml:space="preserve"> (Working Paper)</w:t>
+      </w:r>
+    </w:p>
+    <w:p>
+      <w:pPr>
+        <w:rPr>
+          <w:rFonts w:ascii="Georgia" w:hAnsi="Georgia"/>
+        </w:rPr>
+      </w:pPr>
+      <w:r>
+        <w:rPr>
+          <w:rFonts w:ascii="Georgia" w:hAnsi="Georgia"/>
+        </w:rPr>
+        <w:t xml:space="preserve">[Co-authors] </w:t>
+      </w:r>
+      <w:r>
+        <w:rPr>
+          <w:rFonts w:ascii="Georgia" w:hAnsi="Georgia"/>
+        </w:rPr>
+        <w:t>With Julian Roeckert</w:t>
+      </w:r>
+      <w:r>
+        <w:rPr>
+          <w:rFonts w:ascii="Georgia" w:hAnsi="Georgia"/>
+        </w:rPr>
+        <w:t xml:space="preserve">, Svenja Fluhrer, </w:t>
+      </w:r>
+      <w:r>
+        <w:rPr>
+          <w:rFonts w:ascii="Georgia" w:hAnsi="Georgia"/>
+        </w:rPr>
+        <w:t>and Kati Kraehnert</w:t>
+      </w:r>
+    </w:p>
+    <w:p>
+      <w:pPr>
+        <w:rPr>
+          <w:rFonts w:ascii="Georgia" w:hAnsi="Georgia"/>
+          <w:i/>
+          <w:iCs/>
+        </w:rPr>
+      </w:pPr>
+      <w:r>
+        <w:rPr>
+          <w:rFonts w:ascii="Georgia" w:hAnsi="Georgia"/>
+          <w:i/>
+          <w:iCs/>
+        </w:rPr>
+        <w:t>[Journal] [N/A]</w:t>
+      </w:r>
+    </w:p>
+    <w:p>
+      <w:r>
+        <w:t xml:space="preserve">[Body text] </w:t>
+      </w:r>
+      <w:r>
+        <w:t xml:space="preserve">We examine if </w:t>
+      </w:r>
+      <w:r>
+        <w:t xml:space="preserve">receiving </w:t>
+      </w:r>
+      <w:r>
+        <w:t>anticipatory cash transfers crowds out demand for index-based livestock insurance in Mongolia, using a randomized cash transfer experiment during an extreme winter and linking household panel survey with insurance customer data. We find no evidence of charity hazard and can rule out large negative effects on insurance demand. Treatment effects differ by prior insurance experience. While previously uninsured households show no significant response, households with insurance experience are more likely to purchase insurance after the cash transfer. Our results suggest that, in contexts with incomplete assistance and established index insurance, anticipatory assistance need not undermine insurance demand.</w:t>
+      </w:r>
+    </w:p>
+    <w:p>
+      <w:r>
+        <w:t>W</w:t>
+      </w:r>
+      <w:r>
+        <w:t xml:space="preserve">orking paper </w:t>
+      </w:r>
+      <w:r>
+        <w:t xml:space="preserve">link: </w:t>
+      </w:r>
+      <w:hyperlink r:id="rId11" w:history="1">
+        <w:r>
+          <w:rPr>
+            <w:rStyle w:val="Hyperlink"/>
+            <w:rFonts w:ascii="Georgia" w:eastAsia="Georgia" w:hAnsi="Georgia" w:cs="Georgia"/>
+            <w:color w:val="0000FF"/>
+            <w:sz w:val="21"/>
+            <w:szCs w:val="21"/>
+          </w:rPr>
+          <w:t>https://doi.org/10.4419/96973386</w:t>
+        </w:r>
+      </w:hyperlink>
+    </w:p>
+    <w:p/>
+    <w:p>
+      <w:pPr>
+        <w:rPr>
+          <w:rFonts w:ascii="Georgia" w:hAnsi="Georgia"/>
+          <w:b/>
+          <w:bCs/>
+        </w:rPr>
+      </w:pPr>
+      <w:r>
+        <w:rPr>
+          <w:rFonts w:ascii="Georgia" w:hAnsi="Georgia"/>
+          <w:b/>
+          <w:bCs/>
+        </w:rPr>
+        <w:t xml:space="preserve">[Title] </w:t>
+      </w:r>
+      <w:r>
+        <w:rPr>
+          <w:rFonts w:ascii="Georgia" w:hAnsi="Georgia"/>
+          <w:b/>
+          <w:bCs/>
+        </w:rPr>
+        <w:t xml:space="preserve">Allocation of humanitarian aid after a weather disaster </w:t>
+      </w:r>
+      <w:r>
+        <w:rPr>
+          <w:rFonts w:ascii="Georgia" w:hAnsi="Georgia"/>
+          <w:b/>
+          <w:bCs/>
+        </w:rPr>
+        <w:t>(202</w:t>
+      </w:r>
+      <w:r>
+        <w:rPr>
+          <w:rFonts w:ascii="Georgia" w:hAnsi="Georgia"/>
+          <w:b/>
+          <w:bCs/>
+        </w:rPr>
+        <w:t>3</w:t>
+      </w:r>
+      <w:r>
+        <w:rPr>
+          <w:rFonts w:ascii="Georgia" w:hAnsi="Georgia"/>
+          <w:b/>
+          <w:bCs/>
+        </w:rPr>
+        <w:t>)</w:t>
+      </w:r>
+    </w:p>
+    <w:p>
+      <w:pPr>
+        <w:rPr>
+          <w:rFonts w:ascii="Georgia" w:hAnsi="Georgia"/>
+        </w:rPr>
+      </w:pPr>
+      <w:r>
+        <w:rPr>
+          <w:rFonts w:ascii="Georgia" w:hAnsi="Georgia"/>
+        </w:rPr>
+        <w:t xml:space="preserve">[Co-authors] With </w:t>
+      </w:r>
+      <w:r>
+        <w:rPr>
+          <w:rFonts w:ascii="Georgia" w:hAnsi="Georgia"/>
+        </w:rPr>
+        <w:t>Morag McDonald</w:t>
+      </w:r>
+      <w:r>
+        <w:rPr>
+          <w:rFonts w:ascii="Georgia" w:hAnsi="Georgia"/>
+        </w:rPr>
+        <w:t xml:space="preserve">, </w:t>
+      </w:r>
+      <w:r>
+        <w:rPr>
+          <w:rFonts w:ascii="Georgia" w:hAnsi="Georgia"/>
+        </w:rPr>
+        <w:t>Christian Knoth</w:t>
+      </w:r>
+      <w:r>
+        <w:rPr>
+          <w:rFonts w:ascii="Georgia" w:hAnsi="Georgia"/>
+        </w:rPr>
+        <w:t>, H</w:t>
+      </w:r>
+      <w:r>
+        <w:rPr>
+          <w:rFonts w:ascii="Georgia" w:hAnsi="Georgia"/>
+        </w:rPr>
+        <w:t>enning Teickner</w:t>
+      </w:r>
+      <w:r>
+        <w:rPr>
+          <w:rFonts w:ascii="Georgia" w:hAnsi="Georgia"/>
+        </w:rPr>
+        <w:t xml:space="preserve">, </w:t>
+      </w:r>
+      <w:r>
+        <w:rPr>
+          <w:rFonts w:ascii="Georgia" w:hAnsi="Georgia"/>
+        </w:rPr>
+        <w:t>Myagmartseren Purevtseren</w:t>
+      </w:r>
+      <w:r>
+        <w:rPr>
+          <w:rFonts w:ascii="Georgia" w:hAnsi="Georgia"/>
+        </w:rPr>
+        <w:t xml:space="preserve">, </w:t>
+      </w:r>
+      <w:r>
+        <w:rPr>
+          <w:rFonts w:ascii="Georgia" w:hAnsi="Georgia"/>
+        </w:rPr>
+        <w:t>Edzer Pebesma</w:t>
+      </w:r>
+      <w:r>
+        <w:rPr>
+          <w:rFonts w:ascii="Georgia" w:hAnsi="Georgia"/>
+        </w:rPr>
+        <w:t xml:space="preserve">, and </w:t>
+      </w:r>
+      <w:r>
+        <w:rPr>
+          <w:rFonts w:ascii="Georgia" w:hAnsi="Georgia"/>
+        </w:rPr>
+        <w:t>Kati Kraehnert</w:t>
+      </w:r>
+    </w:p>
+    <w:p>
+      <w:pPr>
+        <w:rPr>
+          <w:rFonts w:ascii="Georgia" w:hAnsi="Georgia"/>
+          <w:i/>
+          <w:iCs/>
+        </w:rPr>
+      </w:pPr>
+      <w:r>
+        <w:rPr>
+          <w:rFonts w:ascii="Georgia" w:hAnsi="Georgia"/>
+          <w:i/>
+          <w:iCs/>
+        </w:rPr>
+        <w:t xml:space="preserve">[Journal] World Development </w:t>
+      </w:r>
+    </w:p>
+    <w:p>
+      <w:r>
+        <w:t xml:space="preserve">[Body text] </w:t>
+      </w:r>
+      <w:r>
+        <w:t>This paper tests whether need or political economy factors determine the allocation of humanitarian aid in the wake of the 2015/16 winter disaster in Mongolia.</w:t>
+      </w:r>
+      <w:r>
+        <w:t xml:space="preserve"> </w:t>
+      </w:r>
+      <w:r>
+        <w:t>Using district-level data, we distinguish between humanitarian aid delivered by the Mongolian Government and international donors</w:t>
+      </w:r>
+      <w:r>
+        <w:t xml:space="preserve">. </w:t>
+      </w:r>
+      <w:r>
+        <w:t xml:space="preserve">Results show that projected need is the strongest predictor for the allocation of international humanitarian aid across districts. </w:t>
+      </w:r>
+      <w:r>
+        <w:lastRenderedPageBreak/>
+        <w:t>Projected need is less relevant for the allocation of governmental humanitarian aid. We do not find evidence that political alignment or core voter considerations matter for either governmental or international humanitarian aid.</w:t>
+      </w:r>
+    </w:p>
+    <w:p>
+      <w:r>
+        <w:t xml:space="preserve">Journal link: </w:t>
+      </w:r>
+      <w:hyperlink r:id="rId12" w:history="1">
+        <w:r>
+          <w:rPr>
+            <w:rStyle w:val="Hyperlink"/>
+          </w:rPr>
+          <w:t>https://doi.org/10.1016/j.worlddev.2023.106204</w:t>
+        </w:r>
+      </w:hyperlink>
+      <w:r>
+        <w:t xml:space="preserve"> </w:t>
+      </w:r>
+    </w:p>
+    <w:p/>
+    <w:p>
+      <w:pPr>
+        <w:rPr>
+          <w:rFonts w:ascii="Georgia" w:hAnsi="Georgia"/>
+          <w:b/>
+          <w:bCs/>
+        </w:rPr>
+      </w:pPr>
+      <w:r>
+        <w:rPr>
+          <w:rFonts w:ascii="Georgia" w:hAnsi="Georgia"/>
+          <w:b/>
+          <w:bCs/>
+        </w:rPr>
+        <w:t xml:space="preserve">[Title] </w:t>
+      </w:r>
+      <w:r>
+        <w:rPr>
+          <w:rFonts w:ascii="Georgia" w:hAnsi="Georgia"/>
+          <w:b/>
+          <w:bCs/>
+        </w:rPr>
+        <w:t xml:space="preserve">Stated and </w:t>
+      </w:r>
+      <w:r>
+        <w:rPr>
+          <w:rFonts w:ascii="Georgia" w:hAnsi="Georgia"/>
+          <w:b/>
+          <w:bCs/>
+        </w:rPr>
+        <w:t>r</w:t>
+      </w:r>
+      <w:r>
+        <w:rPr>
+          <w:rFonts w:ascii="Georgia" w:hAnsi="Georgia"/>
+          <w:b/>
+          <w:bCs/>
+        </w:rPr>
+        <w:t xml:space="preserve">ealized </w:t>
+      </w:r>
+      <w:r>
+        <w:rPr>
+          <w:rFonts w:ascii="Georgia" w:hAnsi="Georgia"/>
+          <w:b/>
+          <w:bCs/>
+        </w:rPr>
+        <w:t>d</w:t>
+      </w:r>
+      <w:r>
+        <w:rPr>
+          <w:rFonts w:ascii="Georgia" w:hAnsi="Georgia"/>
+          <w:b/>
+          <w:bCs/>
+        </w:rPr>
+        <w:t xml:space="preserve">emand for </w:t>
+      </w:r>
+      <w:r>
+        <w:rPr>
+          <w:rFonts w:ascii="Georgia" w:hAnsi="Georgia"/>
+          <w:b/>
+          <w:bCs/>
+        </w:rPr>
+        <w:t>p</w:t>
+      </w:r>
+      <w:r>
+        <w:rPr>
+          <w:rFonts w:ascii="Georgia" w:hAnsi="Georgia"/>
+          <w:b/>
+          <w:bCs/>
+        </w:rPr>
+        <w:t xml:space="preserve">arametric </w:t>
+      </w:r>
+      <w:r>
+        <w:rPr>
+          <w:rFonts w:ascii="Georgia" w:hAnsi="Georgia"/>
+          <w:b/>
+          <w:bCs/>
+        </w:rPr>
+        <w:t>r</w:t>
+      </w:r>
+      <w:r>
+        <w:rPr>
+          <w:rFonts w:ascii="Georgia" w:hAnsi="Georgia"/>
+          <w:b/>
+          <w:bCs/>
+        </w:rPr>
+        <w:t xml:space="preserve">ainfall </w:t>
+      </w:r>
+      <w:r>
+        <w:rPr>
+          <w:rFonts w:ascii="Georgia" w:hAnsi="Georgia"/>
+          <w:b/>
+          <w:bCs/>
+        </w:rPr>
+        <w:t>i</w:t>
+      </w:r>
+      <w:r>
+        <w:rPr>
+          <w:rFonts w:ascii="Georgia" w:hAnsi="Georgia"/>
+          <w:b/>
+          <w:bCs/>
+        </w:rPr>
+        <w:t xml:space="preserve">nsurance </w:t>
+      </w:r>
+      <w:r>
+        <w:rPr>
+          <w:rFonts w:ascii="Georgia" w:hAnsi="Georgia"/>
+          <w:b/>
+          <w:bCs/>
+        </w:rPr>
+        <w:t>a</w:t>
+      </w:r>
+      <w:r>
+        <w:rPr>
+          <w:rFonts w:ascii="Georgia" w:hAnsi="Georgia"/>
+          <w:b/>
+          <w:bCs/>
+        </w:rPr>
+        <w:t xml:space="preserve">mong </w:t>
+      </w:r>
+      <w:r>
+        <w:rPr>
+          <w:rFonts w:ascii="Georgia" w:hAnsi="Georgia"/>
+          <w:b/>
+          <w:bCs/>
+        </w:rPr>
+        <w:t>r</w:t>
+      </w:r>
+      <w:r>
+        <w:rPr>
+          <w:rFonts w:ascii="Georgia" w:hAnsi="Georgia"/>
+          <w:b/>
+          <w:bCs/>
+        </w:rPr>
+        <w:t xml:space="preserve">ice </w:t>
+      </w:r>
+      <w:r>
+        <w:rPr>
+          <w:rFonts w:ascii="Georgia" w:hAnsi="Georgia"/>
+          <w:b/>
+          <w:bCs/>
+        </w:rPr>
+        <w:t>f</w:t>
+      </w:r>
+      <w:r>
+        <w:rPr>
+          <w:rFonts w:ascii="Georgia" w:hAnsi="Georgia"/>
+          <w:b/>
+          <w:bCs/>
+        </w:rPr>
+        <w:t xml:space="preserve">armers in Vietnam </w:t>
+      </w:r>
+      <w:r>
+        <w:rPr>
+          <w:rFonts w:ascii="Georgia" w:hAnsi="Georgia"/>
+          <w:b/>
+          <w:bCs/>
+        </w:rPr>
+        <w:t>(Working Paper)</w:t>
+      </w:r>
+    </w:p>
+    <w:p>
+      <w:pPr>
+        <w:rPr>
+          <w:rFonts w:ascii="Georgia" w:hAnsi="Georgia"/>
+        </w:rPr>
+      </w:pPr>
+      <w:r>
+        <w:rPr>
+          <w:rFonts w:ascii="Georgia" w:hAnsi="Georgia"/>
+        </w:rPr>
+        <w:t xml:space="preserve">[Co-authors] </w:t>
+      </w:r>
+      <w:r>
+        <w:rPr>
+          <w:rFonts w:ascii="Georgia" w:hAnsi="Georgia"/>
+        </w:rPr>
+        <w:t>With Julian Roeckert</w:t>
+      </w:r>
+      <w:r>
+        <w:rPr>
+          <w:rFonts w:ascii="Georgia" w:hAnsi="Georgia"/>
+        </w:rPr>
+        <w:t xml:space="preserve">, </w:t>
+      </w:r>
+      <w:r>
+        <w:rPr>
+          <w:rFonts w:ascii="Georgia" w:hAnsi="Georgia"/>
+        </w:rPr>
+        <w:t>E</w:t>
+      </w:r>
+      <w:r>
+        <w:rPr>
+          <w:rFonts w:ascii="Georgia" w:hAnsi="Georgia"/>
+        </w:rPr>
+        <w:t>mmanuel</w:t>
+      </w:r>
+      <w:r>
+        <w:rPr>
+          <w:rFonts w:ascii="Georgia" w:hAnsi="Georgia"/>
+        </w:rPr>
+        <w:t xml:space="preserve"> Nshakira-Rukundo</w:t>
+      </w:r>
+      <w:r>
+        <w:rPr>
+          <w:rFonts w:ascii="Georgia" w:hAnsi="Georgia"/>
+        </w:rPr>
+        <w:t xml:space="preserve">, </w:t>
+      </w:r>
+      <w:r>
+        <w:rPr>
+          <w:rFonts w:ascii="Georgia" w:hAnsi="Georgia"/>
+        </w:rPr>
+        <w:t>and Kati Kraehnert</w:t>
+      </w:r>
+    </w:p>
+    <w:p>
+      <w:pPr>
+        <w:rPr>
+          <w:rFonts w:ascii="Georgia" w:hAnsi="Georgia"/>
+          <w:i/>
+          <w:iCs/>
+        </w:rPr>
+      </w:pPr>
+      <w:r>
+        <w:rPr>
+          <w:rFonts w:ascii="Georgia" w:hAnsi="Georgia"/>
+          <w:i/>
+          <w:iCs/>
+        </w:rPr>
+        <w:t xml:space="preserve">[Journal] </w:t>
+      </w:r>
+      <w:r>
+        <w:rPr>
+          <w:rFonts w:ascii="Georgia" w:hAnsi="Georgia"/>
+          <w:i/>
+          <w:iCs/>
+        </w:rPr>
+        <w:t>Under review at Geneva Papers on Risk and Insurance - Issues and Practice</w:t>
+      </w:r>
+    </w:p>
+    <w:p>
+      <w:r>
+        <w:t xml:space="preserve">[Body text] </w:t>
+      </w:r>
+      <w:r>
+        <w:t>We study stated and realized demand for a new parametric insurance product against excessive rainfall among rice farmers in Vietnam’s Mekong Delta</w:t>
+      </w:r>
+      <w:r>
+        <w:t xml:space="preserve">. </w:t>
+      </w:r>
+      <w:r>
+        <w:t>Using a household survey of 3,000 rice-farming households, we elicit willingness to pay: 33% of respondents report a WTP of at least half the market price, and 18% report a WTP equal to or higher than the market price. Yet when insurance agents offered the product at a subsidized price below respondents’ stated WTP, no respondent purchased it. We discuss mechanisms that may explain this discrepancy between stated and realized demand, including limited incentive compatibility of the WTP elicitation mechanism, changes in valuations, and contextual barriers to insurance adoption.</w:t>
+      </w:r>
+    </w:p>
+    <w:p>
+      <w:r>
+        <w:t>W</w:t>
+      </w:r>
+      <w:r>
+        <w:t xml:space="preserve">orking paper </w:t>
+      </w:r>
+      <w:r>
+        <w:t xml:space="preserve">link: </w:t>
+      </w:r>
+      <w:hyperlink r:id="rId13" w:history="1">
+        <w:r>
+          <w:rPr>
+            <w:rStyle w:val="Hyperlink"/>
+          </w:rPr>
+          <w:t>https://doi.org/10.4419/96973405</w:t>
+        </w:r>
+      </w:hyperlink>
+      <w:r>
+        <w:t xml:space="preserve"> </w:t>
+      </w:r>
+    </w:p>
+    <w:p/>
+    <w:p/>
+    <w:p>
+      <w:pPr>
+        <w:pStyle w:val="Heading2"/>
+      </w:pPr>
+      <w:r>
+        <w:t>Topic: Temperature effects</w:t>
+      </w:r>
+    </w:p>
+    <w:p/>
+    <w:p>
+      <w:pPr>
+        <w:rPr>
+          <w:rFonts w:ascii="Georgia" w:hAnsi="Georgia"/>
+          <w:b/>
+          <w:bCs/>
+        </w:rPr>
+      </w:pPr>
+      <w:r>
+        <w:rPr>
+          <w:rFonts w:ascii="Georgia" w:hAnsi="Georgia"/>
+          <w:b/>
+          <w:bCs/>
+        </w:rPr>
+        <w:t xml:space="preserve">[Title] </w:t>
+      </w:r>
+      <w:r>
+        <w:rPr>
+          <w:rFonts w:ascii="Georgia" w:hAnsi="Georgia"/>
+          <w:b/>
+          <w:bCs/>
+        </w:rPr>
+        <w:t>Heat and violence against children</w:t>
+      </w:r>
+      <w:r>
+        <w:rPr>
+          <w:rFonts w:ascii="Georgia" w:hAnsi="Georgia"/>
+          <w:b/>
+          <w:bCs/>
+        </w:rPr>
+        <w:t xml:space="preserve"> in schools and homes</w:t>
+      </w:r>
+      <w:r>
+        <w:rPr>
+          <w:rFonts w:ascii="Georgia" w:hAnsi="Georgia"/>
+          <w:b/>
+          <w:bCs/>
+        </w:rPr>
+        <w:t xml:space="preserve"> </w:t>
+      </w:r>
+      <w:r>
+        <w:rPr>
+          <w:rFonts w:ascii="Georgia" w:hAnsi="Georgia"/>
+          <w:b/>
+          <w:bCs/>
+        </w:rPr>
+        <w:t>(Work in progress)</w:t>
+      </w:r>
+    </w:p>
+    <w:p>
+      <w:pPr>
+        <w:rPr>
+          <w:rFonts w:ascii="Georgia" w:hAnsi="Georgia"/>
+        </w:rPr>
+      </w:pPr>
+      <w:r>
+        <w:rPr>
+          <w:rFonts w:ascii="Georgia" w:hAnsi="Georgia"/>
+        </w:rPr>
+        <w:t xml:space="preserve">[Co-authors] </w:t>
+      </w:r>
+      <w:r>
+        <w:rPr>
+          <w:rFonts w:ascii="Georgia" w:hAnsi="Georgia"/>
+        </w:rPr>
+        <w:t>With Julian Roeckert</w:t>
+      </w:r>
+      <w:r>
+        <w:rPr>
+          <w:rFonts w:ascii="Georgia" w:hAnsi="Georgia"/>
+        </w:rPr>
+        <w:t xml:space="preserve"> </w:t>
+      </w:r>
+      <w:r>
+        <w:rPr>
+          <w:rFonts w:ascii="Georgia" w:hAnsi="Georgia"/>
+        </w:rPr>
+        <w:t xml:space="preserve">and </w:t>
+      </w:r>
+      <w:r>
+        <w:rPr>
+          <w:rFonts w:ascii="Georgia" w:hAnsi="Georgia"/>
+        </w:rPr>
+        <w:t>Giulia Malevolti</w:t>
+      </w:r>
+    </w:p>
+    <w:p>
+      <w:pPr>
+        <w:rPr>
+          <w:rFonts w:ascii="Georgia" w:hAnsi="Georgia"/>
+          <w:i/>
+          <w:iCs/>
+        </w:rPr>
+      </w:pPr>
+      <w:r>
+        <w:rPr>
+          <w:rFonts w:ascii="Georgia" w:hAnsi="Georgia"/>
+          <w:i/>
+          <w:iCs/>
+        </w:rPr>
+        <w:t>[Journal] [N/A</w:t>
+      </w:r>
+      <w:r>
+        <w:rPr>
+          <w:rFonts w:ascii="Georgia" w:hAnsi="Georgia"/>
+          <w:i/>
+          <w:iCs/>
+        </w:rPr>
+        <w:t>]</w:t>
+      </w:r>
+    </w:p>
+    <w:p>
+      <w:r>
+        <w:t xml:space="preserve">[Body text] </w:t>
+      </w:r>
+      <w:r>
+        <w:t>Extreme heat can pose risks to human health, including increasing psychological stress and aggression. We study whether the impact of ambient temperature affects violence against children using three waves of panel data of school children in Ghana, Tanzania, and Uganda.</w:t>
+      </w:r>
+      <w:r>
+        <w:t xml:space="preserve"> Working Paper coming soon. </w:t>
+      </w:r>
+    </w:p>
+    <w:p/>
+    <w:p>
+      <w:pPr>
+        <w:pStyle w:val="Heading2"/>
+      </w:pPr>
+      <w:r>
+        <w:lastRenderedPageBreak/>
+        <w:t xml:space="preserve">Topic: </w:t>
+      </w:r>
+      <w:r>
+        <w:t>Meta Science and many</w:t>
+      </w:r>
+      <w:r>
+        <w:t>-</w:t>
+      </w:r>
+      <w:r>
+        <w:t>researcher projects</w:t>
+      </w:r>
+    </w:p>
+    <w:p>
+      <w:r>
+        <w:t>[</w:t>
+      </w:r>
+      <w:r>
+        <w:t>Intro sentence to topic</w:t>
+      </w:r>
+      <w:r>
+        <w:t>]</w:t>
+      </w:r>
+      <w:r>
+        <w:t xml:space="preserve"> </w:t>
+      </w:r>
+      <w:r>
+        <w:t>I am interested in how research itself is conducted, and in what empirical work can and cannot deliver. In recent years, I have contributed to several meta-science projects.</w:t>
+      </w:r>
+    </w:p>
+    <w:p>
+      <w:pPr>
+        <w:rPr>
+          <w:rFonts w:ascii="Georgia" w:hAnsi="Georgia"/>
+          <w:b/>
+          <w:bCs/>
+        </w:rPr>
+      </w:pPr>
+      <w:r>
+        <w:rPr>
+          <w:rFonts w:ascii="Georgia" w:hAnsi="Georgia"/>
+          <w:b/>
+          <w:bCs/>
+        </w:rPr>
+        <w:t xml:space="preserve">[Title] </w:t>
+      </w:r>
+      <w:r>
+        <w:rPr>
+          <w:rFonts w:ascii="Georgia" w:hAnsi="Georgia"/>
+          <w:b/>
+          <w:bCs/>
+        </w:rPr>
+        <w:t xml:space="preserve">The </w:t>
+      </w:r>
+      <w:r>
+        <w:rPr>
+          <w:rFonts w:ascii="Georgia" w:hAnsi="Georgia"/>
+          <w:b/>
+          <w:bCs/>
+        </w:rPr>
+        <w:t>s</w:t>
+      </w:r>
+      <w:r>
+        <w:rPr>
+          <w:rFonts w:ascii="Georgia" w:hAnsi="Georgia"/>
+          <w:b/>
+          <w:bCs/>
+        </w:rPr>
+        <w:t xml:space="preserve">ources of </w:t>
+      </w:r>
+      <w:r>
+        <w:rPr>
+          <w:rFonts w:ascii="Georgia" w:hAnsi="Georgia"/>
+          <w:b/>
+          <w:bCs/>
+        </w:rPr>
+        <w:t>r</w:t>
+      </w:r>
+      <w:r>
+        <w:rPr>
+          <w:rFonts w:ascii="Georgia" w:hAnsi="Georgia"/>
+          <w:b/>
+          <w:bCs/>
+        </w:rPr>
+        <w:t xml:space="preserve">esearcher </w:t>
+      </w:r>
+      <w:r>
+        <w:rPr>
+          <w:rFonts w:ascii="Georgia" w:hAnsi="Georgia"/>
+          <w:b/>
+          <w:bCs/>
+        </w:rPr>
+        <w:t>v</w:t>
+      </w:r>
+      <w:r>
+        <w:rPr>
+          <w:rFonts w:ascii="Georgia" w:hAnsi="Georgia"/>
+          <w:b/>
+          <w:bCs/>
+        </w:rPr>
+        <w:t xml:space="preserve">ariation in </w:t>
+      </w:r>
+      <w:r>
+        <w:rPr>
+          <w:rFonts w:ascii="Georgia" w:hAnsi="Georgia"/>
+          <w:b/>
+          <w:bCs/>
+        </w:rPr>
+        <w:t>E</w:t>
+      </w:r>
+      <w:r>
+        <w:rPr>
+          <w:rFonts w:ascii="Georgia" w:hAnsi="Georgia"/>
+          <w:b/>
+          <w:bCs/>
+        </w:rPr>
+        <w:t xml:space="preserve">conomics </w:t>
+      </w:r>
+      <w:r>
+        <w:rPr>
+          <w:rFonts w:ascii="Georgia" w:hAnsi="Georgia"/>
+          <w:b/>
+          <w:bCs/>
+        </w:rPr>
+        <w:t>(Working Paper)</w:t>
+      </w:r>
+    </w:p>
+    <w:p>
+      <w:pPr>
+        <w:rPr>
+          <w:rFonts w:ascii="Georgia" w:hAnsi="Georgia"/>
+        </w:rPr>
+      </w:pPr>
+      <w:r>
+        <w:rPr>
+          <w:rFonts w:ascii="Georgia" w:hAnsi="Georgia"/>
+        </w:rPr>
+        <w:t xml:space="preserve">[Co-authors] </w:t>
+      </w:r>
+      <w:r>
+        <w:rPr>
+          <w:rFonts w:ascii="Georgia" w:hAnsi="Georgia"/>
+        </w:rPr>
+        <w:t xml:space="preserve">With </w:t>
+      </w:r>
+      <w:r>
+        <w:rPr>
+          <w:rFonts w:ascii="Georgia" w:hAnsi="Georgia"/>
+        </w:rPr>
+        <w:t>Nick Huntington-Klein, Claus C. Portner</w:t>
+      </w:r>
+      <w:r>
+        <w:rPr>
+          <w:rFonts w:ascii="Georgia" w:hAnsi="Georgia"/>
+        </w:rPr>
+        <w:t xml:space="preserve"> (Lead authors) and the </w:t>
+      </w:r>
+      <w:r>
+        <w:rPr>
+          <w:rFonts w:ascii="Georgia" w:hAnsi="Georgia"/>
+        </w:rPr>
+        <w:t>Many Economists Collaborative on Researcher Variation</w:t>
+      </w:r>
+    </w:p>
+    <w:p>
+      <w:pPr>
+        <w:rPr>
+          <w:rFonts w:ascii="Georgia" w:hAnsi="Georgia"/>
+          <w:i/>
+          <w:iCs/>
+        </w:rPr>
+      </w:pPr>
+      <w:r>
+        <w:rPr>
+          <w:rFonts w:ascii="Georgia" w:hAnsi="Georgia"/>
+          <w:i/>
+          <w:iCs/>
+        </w:rPr>
+        <w:t>[Journal] Accepted</w:t>
+      </w:r>
+      <w:r>
+        <w:rPr>
+          <w:rFonts w:ascii="Georgia" w:hAnsi="Georgia"/>
+          <w:i/>
+          <w:iCs/>
+        </w:rPr>
+        <w:t xml:space="preserve"> at </w:t>
+      </w:r>
+      <w:r>
+        <w:rPr>
+          <w:rFonts w:ascii="Georgia" w:hAnsi="Georgia"/>
+          <w:i/>
+          <w:iCs/>
+        </w:rPr>
+        <w:t>Journal of Economic Literature</w:t>
+      </w:r>
+    </w:p>
+    <w:p>
+      <w:r>
+        <w:t xml:space="preserve">[Body text] I participated in this project as part of the </w:t>
+      </w:r>
+      <w:r>
+        <w:t>Many Economists Collaborative on Researcher Variation</w:t>
+      </w:r>
+      <w:r>
+        <w:t xml:space="preserve"> which consists of 146 research teams. Each team completed the same causal inference tasks three times under varying constraints. </w:t>
+      </w:r>
+    </w:p>
+    <w:p>
+      <w:r>
+        <w:t>W</w:t>
+      </w:r>
+      <w:r>
+        <w:t xml:space="preserve">orking paper </w:t>
+      </w:r>
+      <w:r>
+        <w:t xml:space="preserve">link: </w:t>
+      </w:r>
+      <w:hyperlink r:id="rId14" w:history="1">
+        <w:r>
+          <w:rPr>
+            <w:rStyle w:val="Hyperlink"/>
+          </w:rPr>
+          <w:t>https://www.nber.org/papers/w33729</w:t>
+        </w:r>
+      </w:hyperlink>
+      <w:r>
+        <w:t xml:space="preserve"> </w:t>
+      </w:r>
+    </w:p>
+    <w:p/>
+    <w:p>
+      <w:pPr>
+        <w:rPr>
+          <w:rFonts w:ascii="Georgia" w:hAnsi="Georgia"/>
+          <w:b/>
+          <w:bCs/>
+        </w:rPr>
+      </w:pPr>
+      <w:r>
+        <w:rPr>
+          <w:rFonts w:ascii="Georgia" w:hAnsi="Georgia"/>
+          <w:b/>
+          <w:bCs/>
+        </w:rPr>
+        <w:t>[Title] #ManyDaughters (Research project)</w:t>
+      </w:r>
+    </w:p>
+    <w:p>
+      <w:r>
+        <w:t xml:space="preserve">[Project coordinators] </w:t>
+      </w:r>
+      <w:r>
+        <w:t>David Albrecht, Aurélien Baillon, Anna Dreber, Felix Holzmeister, Taisuke Imai, Magnus Johannesson, Levent Neyse, Severine Toussaert</w:t>
+      </w:r>
+    </w:p>
+    <w:p>
+      <w:r>
+        <w:t>[Body text]</w:t>
+      </w:r>
+      <w:r>
+        <w:t xml:space="preserve"> Another many-researcher </w:t>
+      </w:r>
+      <w:r>
+        <w:t xml:space="preserve">project. Here I participated as </w:t>
+      </w:r>
+      <w:r>
+        <w:t>part of a</w:t>
+      </w:r>
+      <w:r>
+        <w:t xml:space="preserve"> research team together with Julian Roeckert. The project </w:t>
+      </w:r>
+      <w:r>
+        <w:t>stud</w:t>
+      </w:r>
+      <w:r>
+        <w:t>ies the</w:t>
+      </w:r>
+      <w:r>
+        <w:t xml:space="preserve"> </w:t>
+      </w:r>
+      <w:r>
+        <w:t>variation in analytical choices and findings</w:t>
+      </w:r>
+      <w:r>
+        <w:t xml:space="preserve">. Currently, the feedback from the participating research teams is </w:t>
+      </w:r>
+      <w:r>
+        <w:t>incorporated</w:t>
+      </w:r>
+      <w:r>
+        <w:t xml:space="preserve"> into the pa</w:t>
+      </w:r>
+      <w:r>
+        <w:t>p</w:t>
+      </w:r>
+      <w:r>
+        <w:t>er draft.</w:t>
+      </w:r>
+    </w:p>
+    <w:p>
+      <w:r>
+        <w:t xml:space="preserve">Project website: </w:t>
+      </w:r>
+      <w:hyperlink r:id="rId15" w:history="1">
+        <w:r>
+          <w:rPr>
+            <w:rStyle w:val="Hyperlink"/>
+          </w:rPr>
+          <w:t>https://www.manydaughters.com/</w:t>
+        </w:r>
+      </w:hyperlink>
+      <w:r>
+        <w:t xml:space="preserve"> </w:t>
+      </w:r>
+    </w:p>
+    <w:p/>
+    <w:p>
+      <w:pPr>
+        <w:rPr>
+          <w:rFonts w:ascii="Georgia" w:hAnsi="Georgia"/>
+          <w:b/>
+          <w:bCs/>
+        </w:rPr>
+      </w:pPr>
+      <w:r>
+        <w:rPr>
+          <w:rFonts w:ascii="Georgia" w:hAnsi="Georgia"/>
+          <w:b/>
+          <w:bCs/>
+        </w:rPr>
+        <w:t xml:space="preserve">[Title] </w:t>
+      </w:r>
+      <w:r>
+        <w:rPr>
+          <w:rFonts w:ascii="Georgia" w:hAnsi="Georgia"/>
+          <w:b/>
+          <w:bCs/>
+        </w:rPr>
+        <w:t xml:space="preserve">Robustness and Replicability in Economics </w:t>
+      </w:r>
+      <w:r>
+        <w:rPr>
+          <w:rFonts w:ascii="Georgia" w:hAnsi="Georgia"/>
+          <w:b/>
+          <w:bCs/>
+        </w:rPr>
+        <w:t>(Research project)</w:t>
+      </w:r>
+    </w:p>
+    <w:p>
+      <w:r>
+        <w:t>[Project coordinators] Jörg</w:t>
+      </w:r>
+      <w:r>
+        <w:t xml:space="preserve"> Ankel-Peters</w:t>
+      </w:r>
+      <w:r>
+        <w:t xml:space="preserve">, </w:t>
+      </w:r>
+      <w:r>
+        <w:t>Florian Neubauer</w:t>
+      </w:r>
+      <w:r>
+        <w:t xml:space="preserve">, </w:t>
+      </w:r>
+      <w:r>
+        <w:t>Julian Rose</w:t>
+      </w:r>
+    </w:p>
+    <w:p>
+      <w:r>
+        <w:t xml:space="preserve">[Body text] </w:t>
+      </w:r>
+      <w:r>
+        <w:t>As part of this many-researcher project, I reproduce a study published in the Journal of Development Economics using the original dataset.</w:t>
+      </w:r>
+      <w:r>
+        <w:t xml:space="preserve"> The</w:t>
+      </w:r>
+      <w:r>
+        <w:t xml:space="preserve"> project will provide replicability rates by </w:t>
+      </w:r>
+      <w:r>
+        <w:t xml:space="preserve">collecting and analyzing </w:t>
+      </w:r>
+      <w:r>
+        <w:t>replication</w:t>
+      </w:r>
+      <w:r>
+        <w:t xml:space="preserve"> reports </w:t>
+      </w:r>
+      <w:r>
+        <w:t xml:space="preserve">of </w:t>
+      </w:r>
+      <w:r>
+        <w:t xml:space="preserve">over </w:t>
+      </w:r>
+      <w:r>
+        <w:t>6</w:t>
+      </w:r>
+      <w:r>
+        <w:t>0</w:t>
+      </w:r>
+      <w:r>
+        <w:t xml:space="preserve"> non-laboratory studies in economics.</w:t>
+      </w:r>
+    </w:p>
+    <w:p>
+      <w:r>
+        <w:t xml:space="preserve">Project website: </w:t>
+      </w:r>
+      <w:hyperlink r:id="rId16" w:history="1">
+        <w:r>
+          <w:rPr>
+            <w:rStyle w:val="Hyperlink"/>
+          </w:rPr>
+          <w:t>https://www.rwi-essen.de/en/projects/detail/robustness-and-replicability-in-economics-r2e-277</w:t>
+        </w:r>
+      </w:hyperlink>
+      <w:r>
+        <w:t xml:space="preserve"> </w:t>
+      </w:r>
+    </w:p>
+    <w:p/>
     <w:p>
       <w:pPr>
         <w:pStyle w:val="Heading1"/>
       </w:pPr>
       <w:r>
-        <w:t>2. Research page intro</w:t>
-      </w:r>
-    </w:p>
-    <w:p>
-      <w:r>
-        <w:rPr>
-          <w:i/>
-          <w:color w:val="808080"/>
-        </w:rPr>
-        <w:t>Goes in: _pages/research.md (optional intro prose). A sentence or two framing your research as a whole. Draft here:</w:t>
-      </w:r>
-    </w:p>
-    <w:p>
-      <w:r>
-        <w:t>[Draft your research-page intro here.]</w:t>
-      </w:r>
-    </w:p>
-    <w:p>
-      <w:pPr>
-        <w:pStyle w:val="Heading1"/>
-      </w:pPr>
-      <w:r>
-        <w:t>3. Research pieces</w:t>
-      </w:r>
-    </w:p>
-    <w:p>
-      <w:r>
-        <w:rPr>
-          <w:i/>
-          <w:color w:val="808080"/>
-        </w:rPr>
-        <w:t>Goes in: one _projects/&lt;slug&gt;.md per piece. For each, draft title + body text. Group each under one topic. You decide how much text each gets.</w:t>
-      </w:r>
-    </w:p>
-    <w:p>
-      <w:pPr>
-        <w:pStyle w:val="Heading2"/>
-      </w:pPr>
-      <w:r>
-        <w:t>Topic: Weather risk and risk management</w:t>
-      </w:r>
-    </w:p>
-    <w:p>
-      <w:r>
-        <w:t>[Piece title]</w:t>
-      </w:r>
-    </w:p>
-    <w:p>
-      <w:r>
         <w:lastRenderedPageBreak/>
-        <w:t>[Body text — a sentence to several paragraphs. Add links, coauthors, status.]</w:t>
-      </w:r>
-    </w:p>
-    <w:p/>
-    <w:p>
-      <w:r>
-        <w:t>[Piece title]</w:t>
-      </w:r>
-    </w:p>
-    <w:p>
-      <w:r>
-        <w:t>[Body text]</w:t>
-      </w:r>
-    </w:p>
-    <w:p>
-      <w:pPr>
-        <w:pStyle w:val="Heading2"/>
-      </w:pPr>
-      <w:r>
-        <w:t>Topic: Temperature effects</w:t>
-      </w:r>
-    </w:p>
-    <w:p>
-      <w:r>
-        <w:t>[Piece title]</w:t>
-      </w:r>
-    </w:p>
-    <w:p>
-      <w:r>
-        <w:t>[Body text]</w:t>
-      </w:r>
-    </w:p>
-    <w:p>
-      <w:pPr>
-        <w:pStyle w:val="Heading2"/>
-      </w:pPr>
-      <w:r>
-        <w:t>Topic: Other</w:t>
-      </w:r>
-    </w:p>
-    <w:p>
-      <w:r>
-        <w:t>[Piece title]</w:t>
-      </w:r>
-    </w:p>
-    <w:p>
-      <w:r>
-        <w:t>[Body text]</w:t>
-      </w:r>
-    </w:p>
-    <w:p>
-      <w:pPr>
-        <w:pStyle w:val="Heading1"/>
-      </w:pPr>
-      <w:r>
         <w:t>4. CV page intro (optional)</w:t>
       </w:r>
     </w:p>
@@ -1046,6 +2469,7 @@
   <w:style w:type="character" w:default="1" w:styleId="DefaultParagraphFont">
     <w:name w:val="Default Paragraph Font"/>
     <w:uiPriority w:val="1"/>
+    <w:semiHidden/>
     <w:unhideWhenUsed/>
   </w:style>
   <w:style w:type="table" w:default="1" w:styleId="TableNormal">
@@ -11821,6 +13245,41 @@
         <w:shd w:val="clear" w:color="auto" w:fill="FBCAA2" w:themeFill="accent6" w:themeFillTint="7F"/>
       </w:tcPr>
     </w:tblStylePr>
+  </w:style>
+  <w:style w:type="character" w:styleId="Hyperlink">
+    <w:name w:val="Hyperlink"/>
+    <w:basedOn w:val="DefaultParagraphFont"/>
+    <w:uiPriority w:val="99"/>
+    <w:unhideWhenUsed/>
+    <w:rsid w:val="003B10B0"/>
+    <w:rPr>
+      <w:color w:val="0000FF" w:themeColor="hyperlink"/>
+      <w:u w:val="single"/>
+    </w:rPr>
+  </w:style>
+  <w:style w:type="character" w:styleId="UnresolvedMention">
+    <w:name w:val="Unresolved Mention"/>
+    <w:basedOn w:val="DefaultParagraphFont"/>
+    <w:uiPriority w:val="99"/>
+    <w:semiHidden/>
+    <w:unhideWhenUsed/>
+    <w:rsid w:val="003B10B0"/>
+    <w:rPr>
+      <w:color w:val="605E5C"/>
+      <w:shd w:val="clear" w:color="auto" w:fill="E1DFDD"/>
+    </w:rPr>
+  </w:style>
+  <w:style w:type="character" w:styleId="FollowedHyperlink">
+    <w:name w:val="FollowedHyperlink"/>
+    <w:basedOn w:val="DefaultParagraphFont"/>
+    <w:uiPriority w:val="99"/>
+    <w:semiHidden/>
+    <w:unhideWhenUsed/>
+    <w:rsid w:val="006629F4"/>
+    <w:rPr>
+      <w:color w:val="800080" w:themeColor="followedHyperlink"/>
+      <w:u w:val="single"/>
+    </w:rPr>
   </w:style>
 </w:styles>
 </file>

</xml_diff>

<commit_message>
Deploying to gh-pages from @ lukasmogge/lukasmogge.github.io@302cea19f115a63a02b6ea373f15ee4174e191cf 🚀
</commit_message>
<xml_diff>
--- a/content/website-texts.docx
+++ b/content/website-texts.docx
@@ -44,15 +44,16 @@
         </w:rPr>
       </w:pPr>
       <w:r>
-        <w:t xml:space="preserve">I am an applied economist working in environmental and development economics. My research studies how households, governments and international and non-governmental </w:t>
-      </w:r>
-      <w:proofErr w:type="spellStart"/>
-      <w:r>
-        <w:t>organisations</w:t>
-      </w:r>
-      <w:proofErr w:type="spellEnd"/>
-      <w:r>
-        <w:t xml:space="preserve"> in low- and middle-income countries respond to environmental shocks. I combine (quasi-)experimental research designs with household survey, administrative and spatial data.</w:t>
+        <w:t>I am an applied economist working in environmental and development economics. My research studies how households, governments and international and non-governmental organisations in low- and middle-income countries respond to environmental shocks. I combine (quasi-)experimental research designs with household survey, administrative and spatial data.</w:t>
+      </w:r>
+      <w:r>
+        <w:t xml:space="preserve"> </w:t>
+      </w:r>
+      <w:r>
+        <w:t>I have conducted extensive fieldwork in Mongolia, Vietnam, and Ghana</w:t>
+      </w:r>
+      <w:r>
+        <w:t>.</w:t>
       </w:r>
     </w:p>
     <w:p>
@@ -63,15 +64,13 @@
         <w:t xml:space="preserve"> (</w:t>
       </w:r>
       <w:r>
-        <w:t>Berlin Office), where I am part of the research group on "Climate Impacts and Adaptation" and the Policy Lab on "Climate Change, Development and Migration". I am a J-PAL Invited Researcher and an organizing member of the Development Economics Network Berlin (</w:t>
-      </w:r>
-      <w:proofErr w:type="spellStart"/>
-      <w:r>
-        <w:t>DENeB</w:t>
-      </w:r>
-      <w:proofErr w:type="spellEnd"/>
-      <w:r>
-        <w:t>)</w:t>
+        <w:t>Berlin Office), where I am part of the research group on "Climate Impacts and Adaptation" and the Policy Lab on "Climate Change, Development and Migration". I am a J-PAL Invited Researcher and an organi</w:t>
+      </w:r>
+      <w:r>
+        <w:t>s</w:t>
+      </w:r>
+      <w:r>
+        <w:t>ing member of the Development Economics Network Berlin (DENeB)</w:t>
       </w:r>
       <w:r>
         <w:t>.</w:t>
@@ -81,138 +80,1562 @@
     <w:p>
       <w:r>
         <w:t>------------------------------------------------------------------------------</w:t>
+      </w:r>
+    </w:p>
+    <w:p/>
+    <w:p>
+      <w:r>
+        <w:t>*Get in touch at lukas.mogge [@] rwi-essen.de*</w:t>
+      </w:r>
+    </w:p>
+    <w:p>
+      <w:r>
+        <w:br w:type="page"/>
+      </w:r>
+    </w:p>
+    <w:p>
+      <w:pPr>
+        <w:pStyle w:val="Heading1"/>
+      </w:pPr>
+      <w:r>
+        <w:lastRenderedPageBreak/>
+        <w:t>2. Research page intro</w:t>
+      </w:r>
+    </w:p>
+    <w:p>
+      <w:r>
+        <w:rPr>
+          <w:i/>
+          <w:color w:val="808080"/>
+        </w:rPr>
+        <w:t>Goes in: _pages/research.md (optional intro prose). A sentence or two framing your research as a whole. Draft here:</w:t>
+      </w:r>
+    </w:p>
+    <w:p>
+      <w:r>
+        <w:t>Selected research</w:t>
+      </w:r>
+      <w:r>
+        <w:t xml:space="preserve"> </w:t>
+      </w:r>
+      <w:r>
+        <w:t>by theme</w:t>
+      </w:r>
+    </w:p>
+    <w:p>
+      <w:pPr>
+        <w:pStyle w:val="Heading1"/>
+      </w:pPr>
+      <w:r>
+        <w:t>3. Research pieces</w:t>
+      </w:r>
+    </w:p>
+    <w:p>
+      <w:r>
+        <w:rPr>
+          <w:i/>
+          <w:color w:val="808080"/>
+        </w:rPr>
+        <w:t>Goes in: one _projects/&lt;slug&gt;.md per piece. For each, draft title + body text. Group each under one topic. You decide how much text each gets.</w:t>
+      </w:r>
+    </w:p>
+    <w:p>
+      <w:pPr>
+        <w:pStyle w:val="Heading2"/>
+      </w:pPr>
+      <w:r>
+        <w:t>Topic: Weather risk</w:t>
+      </w:r>
+      <w:r>
+        <w:t xml:space="preserve">, </w:t>
+      </w:r>
+      <w:r>
+        <w:t>risk management</w:t>
+      </w:r>
+      <w:r>
+        <w:t>, and assistance</w:t>
+      </w:r>
+    </w:p>
+    <w:p>
+      <w:r>
+        <w:t xml:space="preserve">[With picture]: </w:t>
+      </w:r>
+      <w:r>
+        <w:t>assets/img/</w:t>
+      </w:r>
+      <w:r>
+        <w:t>IBLI_demand_2012_2022</w:t>
+      </w:r>
+      <w:r>
+        <w:t>.png</w:t>
+      </w:r>
+    </w:p>
+    <w:p>
+      <w:pPr>
+        <w:rPr>
+          <w:rFonts w:ascii="Georgia" w:hAnsi="Georgia"/>
+          <w:b/>
+          <w:bCs/>
+        </w:rPr>
+      </w:pPr>
+      <w:r>
+        <w:rPr>
+          <w:rFonts w:ascii="Georgia" w:hAnsi="Georgia"/>
+          <w:b/>
+          <w:bCs/>
+        </w:rPr>
+        <w:t xml:space="preserve">[Title] </w:t>
+      </w:r>
+      <w:r>
+        <w:rPr>
+          <w:rFonts w:ascii="Georgia" w:hAnsi="Georgia"/>
+          <w:b/>
+          <w:bCs/>
+        </w:rPr>
+        <w:t>Perception and protection: The effect of risk exposure on demand for index insurance in Mongolia (202</w:t>
+      </w:r>
+      <w:r>
+        <w:rPr>
+          <w:rFonts w:ascii="Georgia" w:hAnsi="Georgia"/>
+          <w:b/>
+          <w:bCs/>
+        </w:rPr>
+        <w:t>5</w:t>
+      </w:r>
+      <w:r>
+        <w:rPr>
+          <w:rFonts w:ascii="Georgia" w:hAnsi="Georgia"/>
+          <w:b/>
+          <w:bCs/>
+        </w:rPr>
+        <w:t>)</w:t>
+      </w:r>
+    </w:p>
+    <w:p>
+      <w:pPr>
+        <w:rPr>
+          <w:rFonts w:ascii="Georgia" w:hAnsi="Georgia"/>
+        </w:rPr>
+      </w:pPr>
+      <w:r>
+        <w:rPr>
+          <w:rFonts w:ascii="Georgia" w:hAnsi="Georgia"/>
+        </w:rPr>
+        <w:t xml:space="preserve">[Co-authors] </w:t>
+      </w:r>
+      <w:r>
+        <w:rPr>
+          <w:rFonts w:ascii="Georgia" w:hAnsi="Georgia"/>
+        </w:rPr>
+        <w:t>With Kati Kraehnert</w:t>
+      </w:r>
+    </w:p>
+    <w:p>
+      <w:pPr>
+        <w:rPr>
+          <w:rFonts w:ascii="Georgia" w:hAnsi="Georgia"/>
+          <w:i/>
+          <w:iCs/>
+        </w:rPr>
+      </w:pPr>
+      <w:r>
+        <w:rPr>
+          <w:rFonts w:ascii="Georgia" w:hAnsi="Georgia"/>
+          <w:i/>
+          <w:iCs/>
+        </w:rPr>
+        <w:t xml:space="preserve">[Journal] </w:t>
+      </w:r>
+      <w:r>
+        <w:rPr>
+          <w:rFonts w:ascii="Georgia" w:hAnsi="Georgia"/>
+          <w:i/>
+          <w:iCs/>
+        </w:rPr>
+        <w:t xml:space="preserve">Journal of Environmental Economics and Management </w:t>
+      </w:r>
+    </w:p>
+    <w:p>
+      <w:r>
+        <w:t>[Body text]</w:t>
+      </w:r>
+      <w:r>
+        <w:t xml:space="preserve"> </w:t>
+      </w:r>
+      <w:r>
+        <w:t xml:space="preserve">This study looks at how risk exposure shapes demand for index-based insurance </w:t>
+      </w:r>
+      <w:r>
+        <w:t xml:space="preserve">among herding households </w:t>
+      </w:r>
+      <w:r>
+        <w:t xml:space="preserve">in </w:t>
+      </w:r>
+      <w:r>
+        <w:t xml:space="preserve">rural </w:t>
+      </w:r>
+      <w:r>
+        <w:t>Mongolia</w:t>
+      </w:r>
+      <w:r>
+        <w:t xml:space="preserve"> where extreme winters pose a threat to livestock and the livelihoods of those who depend on it</w:t>
+      </w:r>
+      <w:r>
+        <w:t xml:space="preserve">. </w:t>
+      </w:r>
+      <w:r>
+        <w:t xml:space="preserve">We draw on district-level data </w:t>
+      </w:r>
+      <w:r>
+        <w:t xml:space="preserve">on livestock mortality and insurance uptake, </w:t>
+      </w:r>
+      <w:r>
+        <w:t>covering the whole country</w:t>
+      </w:r>
+      <w:r>
+        <w:t xml:space="preserve"> and</w:t>
+      </w:r>
+      <w:r>
+        <w:t xml:space="preserve"> spanning eleven years. Results indicate that demand for index insurance increases in areas exposed to adverse winter conditions during the insurance sales period, when pastoralists have to decide about </w:t>
+      </w:r>
+      <w:r>
+        <w:t>buying</w:t>
+      </w:r>
+      <w:r>
+        <w:t xml:space="preserve"> insurance coverage for next year’s winter. These results are best explained by availability bias, with households adapting their risk perception in response to adverse weather conditions.</w:t>
+      </w:r>
+    </w:p>
+    <w:p>
+      <w:r>
+        <w:t xml:space="preserve">Journal link: </w:t>
+      </w:r>
+      <w:hyperlink r:id="rId6" w:history="1">
+        <w:r>
+          <w:rPr>
+            <w:rStyle w:val="Hyperlink"/>
+          </w:rPr>
+          <w:t>https://doi.org/10.1016/j.jeem.2024.103113</w:t>
+        </w:r>
+      </w:hyperlink>
+      <w:r>
+        <w:t xml:space="preserve"> </w:t>
+      </w:r>
+    </w:p>
+    <w:p>
+      <w:r>
+        <w:t xml:space="preserve">Replication package: </w:t>
+      </w:r>
+      <w:hyperlink r:id="rId7" w:history="1">
+        <w:r>
+          <w:rPr>
+            <w:rStyle w:val="Hyperlink"/>
+          </w:rPr>
+          <w:t>https://doi.org/10.7910/DVN/GDGLID</w:t>
+        </w:r>
+      </w:hyperlink>
+      <w:r>
+        <w:t xml:space="preserve"> </w:t>
       </w:r>
     </w:p>
     <w:p/>
     <w:p>
       <w:pPr>
         <w:rPr>
+          <w:rFonts w:ascii="Georgia" w:hAnsi="Georgia"/>
           <w:b/>
           <w:bCs/>
         </w:rPr>
       </w:pPr>
       <w:r>
-        <w:t xml:space="preserve">*Get in touch at </w:t>
-      </w:r>
-      <w:proofErr w:type="spellStart"/>
-      <w:r>
-        <w:t>lukas.mogge</w:t>
-      </w:r>
-      <w:proofErr w:type="spellEnd"/>
-      <w:r>
-        <w:t xml:space="preserve"> [@] rwi-essen.de*</w:t>
+        <w:rPr>
+          <w:rFonts w:ascii="Georgia" w:hAnsi="Georgia"/>
+          <w:b/>
+          <w:bCs/>
+        </w:rPr>
+        <w:t xml:space="preserve">[Title] </w:t>
+      </w:r>
+      <w:r>
+        <w:rPr>
+          <w:rFonts w:ascii="Georgia" w:hAnsi="Georgia"/>
+          <w:b/>
+          <w:bCs/>
+        </w:rPr>
+        <w:t>Anticipatory cash transfers in the context of weather disasters (2025)</w:t>
       </w:r>
     </w:p>
+    <w:p>
+      <w:r>
+        <w:t>[With picture]: assets/img/</w:t>
+      </w:r>
+      <w:r>
+        <w:t>dzud_risk_map_2021</w:t>
+      </w:r>
+      <w:r>
+        <w:t>.png</w:t>
+      </w:r>
+    </w:p>
+    <w:p>
+      <w:pPr>
+        <w:rPr>
+          <w:rFonts w:ascii="Georgia" w:hAnsi="Georgia"/>
+        </w:rPr>
+      </w:pPr>
+      <w:r>
+        <w:rPr>
+          <w:rFonts w:ascii="Georgia" w:hAnsi="Georgia"/>
+        </w:rPr>
+        <w:t xml:space="preserve">[Co-authors] </w:t>
+      </w:r>
+      <w:r>
+        <w:rPr>
+          <w:rFonts w:ascii="Georgia" w:hAnsi="Georgia"/>
+        </w:rPr>
+        <w:t>With Julian Roeckert and Kati Kraehnert</w:t>
+      </w:r>
+    </w:p>
+    <w:p>
+      <w:pPr>
+        <w:rPr>
+          <w:rFonts w:ascii="Georgia" w:hAnsi="Georgia"/>
+          <w:i/>
+          <w:iCs/>
+        </w:rPr>
+      </w:pPr>
+      <w:r>
+        <w:rPr>
+          <w:rFonts w:ascii="Georgia" w:hAnsi="Georgia"/>
+          <w:i/>
+          <w:iCs/>
+        </w:rPr>
+        <w:t xml:space="preserve">[Journal] </w:t>
+      </w:r>
+      <w:r>
+        <w:rPr>
+          <w:rFonts w:ascii="Georgia" w:hAnsi="Georgia"/>
+          <w:i/>
+          <w:iCs/>
+        </w:rPr>
+        <w:t>Journal of the Association of Environmental and Resource Economists</w:t>
+      </w:r>
+    </w:p>
+    <w:p>
+      <w:r>
+        <w:t xml:space="preserve">[Body text] </w:t>
+      </w:r>
+      <w:r>
+        <w:t xml:space="preserve">We analyze the impact of anticipatory humanitarian cash transfers distributed to pastoralist households in Mongolia before an extreme winter event reached its peak. For recipients with smaller herds before the disaster, the receipt of anticipatory cash transfers </w:t>
+      </w:r>
+      <w:r>
+        <w:lastRenderedPageBreak/>
+        <w:t>increases their post-disaster herd size, herd-related investments, and home consumption of livestock. No significant effects of the intervention are detected when considering the full sample, including relatively wealthy pastoralists. The paper includes a discussion of the practical challenges in evaluating (anticipatory) humanitarian interventions.</w:t>
+      </w:r>
+    </w:p>
+    <w:p>
+      <w:r>
+        <w:t xml:space="preserve">Journal link: </w:t>
+      </w:r>
+      <w:hyperlink r:id="rId8">
+        <w:r>
+          <w:rPr>
+            <w:rFonts w:ascii="Georgia" w:eastAsia="Georgia" w:hAnsi="Georgia" w:cs="Georgia"/>
+            <w:color w:val="0000FF"/>
+            <w:sz w:val="21"/>
+            <w:szCs w:val="21"/>
+            <w:u w:val="single"/>
+          </w:rPr>
+          <w:t>https://doi.org/10.1086/735534</w:t>
+        </w:r>
+      </w:hyperlink>
+      <w:r>
+        <w:t xml:space="preserve"> </w:t>
+      </w:r>
+    </w:p>
+    <w:p>
+      <w:r>
+        <w:t xml:space="preserve">Policy Brief: </w:t>
+      </w:r>
+      <w:hyperlink r:id="rId9" w:history="1">
+        <w:r>
+          <w:rPr>
+            <w:rStyle w:val="Hyperlink"/>
+          </w:rPr>
+          <w:t>https://www.rwi-essen.de/fileadmin/user_upload/RWI/Publikationen/Impact_Notes/rwi-impact_note_anticipatory_humanitarian_action.pdf</w:t>
+        </w:r>
+      </w:hyperlink>
+      <w:r>
+        <w:t xml:space="preserve"> </w:t>
+      </w:r>
+    </w:p>
+    <w:p>
+      <w:r>
+        <w:t xml:space="preserve">Replication package: </w:t>
+      </w:r>
+      <w:hyperlink r:id="rId10">
+        <w:r>
+          <w:rPr>
+            <w:rFonts w:ascii="Georgia" w:eastAsia="Georgia" w:hAnsi="Georgia" w:cs="Georgia"/>
+            <w:color w:val="0000FF"/>
+            <w:sz w:val="21"/>
+            <w:szCs w:val="21"/>
+            <w:u w:val="single"/>
+          </w:rPr>
+          <w:t>https://doi.org/10.7910/DVN/GDGLID</w:t>
+        </w:r>
+      </w:hyperlink>
+    </w:p>
+    <w:p/>
+    <w:p>
+      <w:pPr>
+        <w:rPr>
+          <w:rFonts w:ascii="Georgia" w:hAnsi="Georgia"/>
+          <w:b/>
+          <w:bCs/>
+        </w:rPr>
+      </w:pPr>
+      <w:r>
+        <w:rPr>
+          <w:rFonts w:ascii="Georgia" w:hAnsi="Georgia"/>
+          <w:b/>
+          <w:bCs/>
+        </w:rPr>
+        <w:t xml:space="preserve">[Title] </w:t>
+      </w:r>
+      <w:r>
+        <w:rPr>
+          <w:rFonts w:ascii="Georgia" w:hAnsi="Georgia"/>
+          <w:b/>
+          <w:bCs/>
+        </w:rPr>
+        <w:t>Charity hazard in climate adaptation: The effect of anticipatory cash transfers on demand for weather insurance</w:t>
+      </w:r>
+      <w:r>
+        <w:rPr>
+          <w:rFonts w:ascii="Georgia" w:hAnsi="Georgia"/>
+          <w:b/>
+          <w:bCs/>
+        </w:rPr>
+        <w:t xml:space="preserve"> (Working Paper)</w:t>
+      </w:r>
+    </w:p>
+    <w:p>
+      <w:pPr>
+        <w:rPr>
+          <w:rFonts w:ascii="Georgia" w:hAnsi="Georgia"/>
+        </w:rPr>
+      </w:pPr>
+      <w:r>
+        <w:rPr>
+          <w:rFonts w:ascii="Georgia" w:hAnsi="Georgia"/>
+        </w:rPr>
+        <w:t xml:space="preserve">[Co-authors] </w:t>
+      </w:r>
+      <w:r>
+        <w:rPr>
+          <w:rFonts w:ascii="Georgia" w:hAnsi="Georgia"/>
+        </w:rPr>
+        <w:t>With Julian Roeckert</w:t>
+      </w:r>
+      <w:r>
+        <w:rPr>
+          <w:rFonts w:ascii="Georgia" w:hAnsi="Georgia"/>
+        </w:rPr>
+        <w:t xml:space="preserve">, Svenja Fluhrer, </w:t>
+      </w:r>
+      <w:r>
+        <w:rPr>
+          <w:rFonts w:ascii="Georgia" w:hAnsi="Georgia"/>
+        </w:rPr>
+        <w:t>and Kati Kraehnert</w:t>
+      </w:r>
+    </w:p>
+    <w:p>
+      <w:pPr>
+        <w:rPr>
+          <w:rFonts w:ascii="Georgia" w:hAnsi="Georgia"/>
+          <w:i/>
+          <w:iCs/>
+        </w:rPr>
+      </w:pPr>
+      <w:r>
+        <w:rPr>
+          <w:rFonts w:ascii="Georgia" w:hAnsi="Georgia"/>
+          <w:i/>
+          <w:iCs/>
+        </w:rPr>
+        <w:t>[Journal] [N/A]</w:t>
+      </w:r>
+    </w:p>
+    <w:p>
+      <w:r>
+        <w:t xml:space="preserve">[Body text] </w:t>
+      </w:r>
+      <w:r>
+        <w:t xml:space="preserve">We examine if </w:t>
+      </w:r>
+      <w:r>
+        <w:t xml:space="preserve">receiving </w:t>
+      </w:r>
+      <w:r>
+        <w:t>anticipatory cash transfers crowds out demand for index-based livestock insurance in Mongolia, using a randomized cash transfer experiment during an extreme winter and linking household panel survey with insurance customer data. We find no evidence of charity hazard and can rule out large negative effects on insurance demand. Treatment effects differ by prior insurance experience. While previously uninsured households show no significant response, households with insurance experience are more likely to purchase insurance after the cash transfer. Our results suggest that, in contexts with incomplete assistance and established index insurance, anticipatory assistance need not undermine insurance demand.</w:t>
+      </w:r>
+    </w:p>
+    <w:p>
+      <w:r>
+        <w:t>W</w:t>
+      </w:r>
+      <w:r>
+        <w:t xml:space="preserve">orking paper </w:t>
+      </w:r>
+      <w:r>
+        <w:t xml:space="preserve">link: </w:t>
+      </w:r>
+      <w:hyperlink r:id="rId11" w:history="1">
+        <w:r>
+          <w:rPr>
+            <w:rStyle w:val="Hyperlink"/>
+            <w:rFonts w:ascii="Georgia" w:eastAsia="Georgia" w:hAnsi="Georgia" w:cs="Georgia"/>
+            <w:color w:val="0000FF"/>
+            <w:sz w:val="21"/>
+            <w:szCs w:val="21"/>
+          </w:rPr>
+          <w:t>https://doi.org/10.4419/96973386</w:t>
+        </w:r>
+      </w:hyperlink>
+    </w:p>
+    <w:p/>
+    <w:p>
+      <w:pPr>
+        <w:rPr>
+          <w:rFonts w:ascii="Georgia" w:hAnsi="Georgia"/>
+          <w:b/>
+          <w:bCs/>
+        </w:rPr>
+      </w:pPr>
+      <w:r>
+        <w:rPr>
+          <w:rFonts w:ascii="Georgia" w:hAnsi="Georgia"/>
+          <w:b/>
+          <w:bCs/>
+        </w:rPr>
+        <w:t xml:space="preserve">[Title] </w:t>
+      </w:r>
+      <w:r>
+        <w:rPr>
+          <w:rFonts w:ascii="Georgia" w:hAnsi="Georgia"/>
+          <w:b/>
+          <w:bCs/>
+        </w:rPr>
+        <w:t xml:space="preserve">Allocation of humanitarian aid after a weather disaster </w:t>
+      </w:r>
+      <w:r>
+        <w:rPr>
+          <w:rFonts w:ascii="Georgia" w:hAnsi="Georgia"/>
+          <w:b/>
+          <w:bCs/>
+        </w:rPr>
+        <w:t>(202</w:t>
+      </w:r>
+      <w:r>
+        <w:rPr>
+          <w:rFonts w:ascii="Georgia" w:hAnsi="Georgia"/>
+          <w:b/>
+          <w:bCs/>
+        </w:rPr>
+        <w:t>3</w:t>
+      </w:r>
+      <w:r>
+        <w:rPr>
+          <w:rFonts w:ascii="Georgia" w:hAnsi="Georgia"/>
+          <w:b/>
+          <w:bCs/>
+        </w:rPr>
+        <w:t>)</w:t>
+      </w:r>
+    </w:p>
+    <w:p>
+      <w:pPr>
+        <w:rPr>
+          <w:rFonts w:ascii="Georgia" w:hAnsi="Georgia"/>
+        </w:rPr>
+      </w:pPr>
+      <w:r>
+        <w:rPr>
+          <w:rFonts w:ascii="Georgia" w:hAnsi="Georgia"/>
+        </w:rPr>
+        <w:t xml:space="preserve">[Co-authors] With </w:t>
+      </w:r>
+      <w:r>
+        <w:rPr>
+          <w:rFonts w:ascii="Georgia" w:hAnsi="Georgia"/>
+        </w:rPr>
+        <w:t>Morag McDonald</w:t>
+      </w:r>
+      <w:r>
+        <w:rPr>
+          <w:rFonts w:ascii="Georgia" w:hAnsi="Georgia"/>
+        </w:rPr>
+        <w:t xml:space="preserve">, </w:t>
+      </w:r>
+      <w:r>
+        <w:rPr>
+          <w:rFonts w:ascii="Georgia" w:hAnsi="Georgia"/>
+        </w:rPr>
+        <w:t>Christian Knoth</w:t>
+      </w:r>
+      <w:r>
+        <w:rPr>
+          <w:rFonts w:ascii="Georgia" w:hAnsi="Georgia"/>
+        </w:rPr>
+        <w:t>, H</w:t>
+      </w:r>
+      <w:r>
+        <w:rPr>
+          <w:rFonts w:ascii="Georgia" w:hAnsi="Georgia"/>
+        </w:rPr>
+        <w:t>enning Teickner</w:t>
+      </w:r>
+      <w:r>
+        <w:rPr>
+          <w:rFonts w:ascii="Georgia" w:hAnsi="Georgia"/>
+        </w:rPr>
+        <w:t xml:space="preserve">, </w:t>
+      </w:r>
+      <w:r>
+        <w:rPr>
+          <w:rFonts w:ascii="Georgia" w:hAnsi="Georgia"/>
+        </w:rPr>
+        <w:t>Myagmartseren Purevtseren</w:t>
+      </w:r>
+      <w:r>
+        <w:rPr>
+          <w:rFonts w:ascii="Georgia" w:hAnsi="Georgia"/>
+        </w:rPr>
+        <w:t xml:space="preserve">, </w:t>
+      </w:r>
+      <w:r>
+        <w:rPr>
+          <w:rFonts w:ascii="Georgia" w:hAnsi="Georgia"/>
+        </w:rPr>
+        <w:t>Edzer Pebesma</w:t>
+      </w:r>
+      <w:r>
+        <w:rPr>
+          <w:rFonts w:ascii="Georgia" w:hAnsi="Georgia"/>
+        </w:rPr>
+        <w:t xml:space="preserve">, and </w:t>
+      </w:r>
+      <w:r>
+        <w:rPr>
+          <w:rFonts w:ascii="Georgia" w:hAnsi="Georgia"/>
+        </w:rPr>
+        <w:t>Kati Kraehnert</w:t>
+      </w:r>
+    </w:p>
+    <w:p>
+      <w:pPr>
+        <w:rPr>
+          <w:rFonts w:ascii="Georgia" w:hAnsi="Georgia"/>
+          <w:i/>
+          <w:iCs/>
+        </w:rPr>
+      </w:pPr>
+      <w:r>
+        <w:rPr>
+          <w:rFonts w:ascii="Georgia" w:hAnsi="Georgia"/>
+          <w:i/>
+          <w:iCs/>
+        </w:rPr>
+        <w:t xml:space="preserve">[Journal] World Development </w:t>
+      </w:r>
+    </w:p>
+    <w:p>
+      <w:r>
+        <w:t xml:space="preserve">[Body text] </w:t>
+      </w:r>
+      <w:r>
+        <w:t>This paper tests whether need or political economy factors determine the allocation of humanitarian aid in the wake of the 2015/16 winter disaster in Mongolia.</w:t>
+      </w:r>
+      <w:r>
+        <w:t xml:space="preserve"> </w:t>
+      </w:r>
+      <w:r>
+        <w:t>Using district-level data, we distinguish between humanitarian aid delivered by the Mongolian Government and international donors</w:t>
+      </w:r>
+      <w:r>
+        <w:t xml:space="preserve">. </w:t>
+      </w:r>
+      <w:r>
+        <w:t xml:space="preserve">Results show that projected need is the strongest predictor for the allocation of international humanitarian aid across districts. </w:t>
+      </w:r>
+      <w:r>
+        <w:lastRenderedPageBreak/>
+        <w:t>Projected need is less relevant for the allocation of governmental humanitarian aid. We do not find evidence that political alignment or core voter considerations matter for either governmental or international humanitarian aid.</w:t>
+      </w:r>
+    </w:p>
+    <w:p>
+      <w:r>
+        <w:t xml:space="preserve">Journal link: </w:t>
+      </w:r>
+      <w:hyperlink r:id="rId12" w:history="1">
+        <w:r>
+          <w:rPr>
+            <w:rStyle w:val="Hyperlink"/>
+          </w:rPr>
+          <w:t>https://doi.org/10.1016/j.worlddev.2023.106204</w:t>
+        </w:r>
+      </w:hyperlink>
+      <w:r>
+        <w:t xml:space="preserve"> </w:t>
+      </w:r>
+    </w:p>
+    <w:p/>
+    <w:p>
+      <w:pPr>
+        <w:rPr>
+          <w:rFonts w:ascii="Georgia" w:hAnsi="Georgia"/>
+          <w:b/>
+          <w:bCs/>
+        </w:rPr>
+      </w:pPr>
+      <w:r>
+        <w:rPr>
+          <w:rFonts w:ascii="Georgia" w:hAnsi="Georgia"/>
+          <w:b/>
+          <w:bCs/>
+        </w:rPr>
+        <w:t xml:space="preserve">[Title] </w:t>
+      </w:r>
+      <w:r>
+        <w:rPr>
+          <w:rFonts w:ascii="Georgia" w:hAnsi="Georgia"/>
+          <w:b/>
+          <w:bCs/>
+        </w:rPr>
+        <w:t xml:space="preserve">Stated and </w:t>
+      </w:r>
+      <w:r>
+        <w:rPr>
+          <w:rFonts w:ascii="Georgia" w:hAnsi="Georgia"/>
+          <w:b/>
+          <w:bCs/>
+        </w:rPr>
+        <w:t>r</w:t>
+      </w:r>
+      <w:r>
+        <w:rPr>
+          <w:rFonts w:ascii="Georgia" w:hAnsi="Georgia"/>
+          <w:b/>
+          <w:bCs/>
+        </w:rPr>
+        <w:t xml:space="preserve">ealized </w:t>
+      </w:r>
+      <w:r>
+        <w:rPr>
+          <w:rFonts w:ascii="Georgia" w:hAnsi="Georgia"/>
+          <w:b/>
+          <w:bCs/>
+        </w:rPr>
+        <w:t>d</w:t>
+      </w:r>
+      <w:r>
+        <w:rPr>
+          <w:rFonts w:ascii="Georgia" w:hAnsi="Georgia"/>
+          <w:b/>
+          <w:bCs/>
+        </w:rPr>
+        <w:t xml:space="preserve">emand for </w:t>
+      </w:r>
+      <w:r>
+        <w:rPr>
+          <w:rFonts w:ascii="Georgia" w:hAnsi="Georgia"/>
+          <w:b/>
+          <w:bCs/>
+        </w:rPr>
+        <w:t>p</w:t>
+      </w:r>
+      <w:r>
+        <w:rPr>
+          <w:rFonts w:ascii="Georgia" w:hAnsi="Georgia"/>
+          <w:b/>
+          <w:bCs/>
+        </w:rPr>
+        <w:t xml:space="preserve">arametric </w:t>
+      </w:r>
+      <w:r>
+        <w:rPr>
+          <w:rFonts w:ascii="Georgia" w:hAnsi="Georgia"/>
+          <w:b/>
+          <w:bCs/>
+        </w:rPr>
+        <w:t>r</w:t>
+      </w:r>
+      <w:r>
+        <w:rPr>
+          <w:rFonts w:ascii="Georgia" w:hAnsi="Georgia"/>
+          <w:b/>
+          <w:bCs/>
+        </w:rPr>
+        <w:t xml:space="preserve">ainfall </w:t>
+      </w:r>
+      <w:r>
+        <w:rPr>
+          <w:rFonts w:ascii="Georgia" w:hAnsi="Georgia"/>
+          <w:b/>
+          <w:bCs/>
+        </w:rPr>
+        <w:t>i</w:t>
+      </w:r>
+      <w:r>
+        <w:rPr>
+          <w:rFonts w:ascii="Georgia" w:hAnsi="Georgia"/>
+          <w:b/>
+          <w:bCs/>
+        </w:rPr>
+        <w:t xml:space="preserve">nsurance </w:t>
+      </w:r>
+      <w:r>
+        <w:rPr>
+          <w:rFonts w:ascii="Georgia" w:hAnsi="Georgia"/>
+          <w:b/>
+          <w:bCs/>
+        </w:rPr>
+        <w:t>a</w:t>
+      </w:r>
+      <w:r>
+        <w:rPr>
+          <w:rFonts w:ascii="Georgia" w:hAnsi="Georgia"/>
+          <w:b/>
+          <w:bCs/>
+        </w:rPr>
+        <w:t xml:space="preserve">mong </w:t>
+      </w:r>
+      <w:r>
+        <w:rPr>
+          <w:rFonts w:ascii="Georgia" w:hAnsi="Georgia"/>
+          <w:b/>
+          <w:bCs/>
+        </w:rPr>
+        <w:t>r</w:t>
+      </w:r>
+      <w:r>
+        <w:rPr>
+          <w:rFonts w:ascii="Georgia" w:hAnsi="Georgia"/>
+          <w:b/>
+          <w:bCs/>
+        </w:rPr>
+        <w:t xml:space="preserve">ice </w:t>
+      </w:r>
+      <w:r>
+        <w:rPr>
+          <w:rFonts w:ascii="Georgia" w:hAnsi="Georgia"/>
+          <w:b/>
+          <w:bCs/>
+        </w:rPr>
+        <w:t>f</w:t>
+      </w:r>
+      <w:r>
+        <w:rPr>
+          <w:rFonts w:ascii="Georgia" w:hAnsi="Georgia"/>
+          <w:b/>
+          <w:bCs/>
+        </w:rPr>
+        <w:t xml:space="preserve">armers in Vietnam </w:t>
+      </w:r>
+      <w:r>
+        <w:rPr>
+          <w:rFonts w:ascii="Georgia" w:hAnsi="Georgia"/>
+          <w:b/>
+          <w:bCs/>
+        </w:rPr>
+        <w:t>(Working Paper)</w:t>
+      </w:r>
+    </w:p>
+    <w:p>
+      <w:pPr>
+        <w:rPr>
+          <w:rFonts w:ascii="Georgia" w:hAnsi="Georgia"/>
+        </w:rPr>
+      </w:pPr>
+      <w:r>
+        <w:rPr>
+          <w:rFonts w:ascii="Georgia" w:hAnsi="Georgia"/>
+        </w:rPr>
+        <w:t xml:space="preserve">[Co-authors] </w:t>
+      </w:r>
+      <w:r>
+        <w:rPr>
+          <w:rFonts w:ascii="Georgia" w:hAnsi="Georgia"/>
+        </w:rPr>
+        <w:t>With Julian Roeckert</w:t>
+      </w:r>
+      <w:r>
+        <w:rPr>
+          <w:rFonts w:ascii="Georgia" w:hAnsi="Georgia"/>
+        </w:rPr>
+        <w:t xml:space="preserve">, </w:t>
+      </w:r>
+      <w:r>
+        <w:rPr>
+          <w:rFonts w:ascii="Georgia" w:hAnsi="Georgia"/>
+        </w:rPr>
+        <w:t>E</w:t>
+      </w:r>
+      <w:r>
+        <w:rPr>
+          <w:rFonts w:ascii="Georgia" w:hAnsi="Georgia"/>
+        </w:rPr>
+        <w:t>mmanuel</w:t>
+      </w:r>
+      <w:r>
+        <w:rPr>
+          <w:rFonts w:ascii="Georgia" w:hAnsi="Georgia"/>
+        </w:rPr>
+        <w:t xml:space="preserve"> Nshakira-Rukundo</w:t>
+      </w:r>
+      <w:r>
+        <w:rPr>
+          <w:rFonts w:ascii="Georgia" w:hAnsi="Georgia"/>
+        </w:rPr>
+        <w:t xml:space="preserve">, </w:t>
+      </w:r>
+      <w:r>
+        <w:rPr>
+          <w:rFonts w:ascii="Georgia" w:hAnsi="Georgia"/>
+        </w:rPr>
+        <w:t>and Kati Kraehnert</w:t>
+      </w:r>
+    </w:p>
+    <w:p>
+      <w:pPr>
+        <w:rPr>
+          <w:rFonts w:ascii="Georgia" w:hAnsi="Georgia"/>
+          <w:i/>
+          <w:iCs/>
+        </w:rPr>
+      </w:pPr>
+      <w:r>
+        <w:rPr>
+          <w:rFonts w:ascii="Georgia" w:hAnsi="Georgia"/>
+          <w:i/>
+          <w:iCs/>
+        </w:rPr>
+        <w:t xml:space="preserve">[Journal] </w:t>
+      </w:r>
+      <w:r>
+        <w:rPr>
+          <w:rFonts w:ascii="Georgia" w:hAnsi="Georgia"/>
+          <w:i/>
+          <w:iCs/>
+        </w:rPr>
+        <w:t>Under review at Geneva Papers on Risk and Insurance - Issues and Practice</w:t>
+      </w:r>
+    </w:p>
+    <w:p>
+      <w:r>
+        <w:t xml:space="preserve">[Body text] </w:t>
+      </w:r>
+      <w:r>
+        <w:t>We study stated and realized demand for a new parametric insurance product against excessive rainfall among rice farmers in Vietnam’s Mekong Delta</w:t>
+      </w:r>
+      <w:r>
+        <w:t xml:space="preserve">. </w:t>
+      </w:r>
+      <w:r>
+        <w:t>Using a household survey of 3,000 rice-farming households, we elicit willingness to pay: 33% of respondents report a WTP of at least half the market price, and 18% report a WTP equal to or higher than the market price. Yet when insurance agents offered the product at a subsidized price below respondents’ stated WTP, no respondent purchased it. We discuss mechanisms that may explain this discrepancy between stated and realized demand, including limited incentive compatibility of the WTP elicitation mechanism, changes in valuations, and contextual barriers to insurance adoption.</w:t>
+      </w:r>
+    </w:p>
+    <w:p>
+      <w:r>
+        <w:t>W</w:t>
+      </w:r>
+      <w:r>
+        <w:t xml:space="preserve">orking paper </w:t>
+      </w:r>
+      <w:r>
+        <w:t xml:space="preserve">link: </w:t>
+      </w:r>
+      <w:hyperlink r:id="rId13" w:history="1">
+        <w:r>
+          <w:rPr>
+            <w:rStyle w:val="Hyperlink"/>
+          </w:rPr>
+          <w:t>https://doi.org/10.4419/96973405</w:t>
+        </w:r>
+      </w:hyperlink>
+      <w:r>
+        <w:t xml:space="preserve"> </w:t>
+      </w:r>
+    </w:p>
+    <w:p/>
+    <w:p/>
+    <w:p>
+      <w:pPr>
+        <w:pStyle w:val="Heading2"/>
+      </w:pPr>
+      <w:r>
+        <w:t>Topic: Temperature effects</w:t>
+      </w:r>
+    </w:p>
+    <w:p/>
+    <w:p>
+      <w:pPr>
+        <w:rPr>
+          <w:rFonts w:ascii="Georgia" w:hAnsi="Georgia"/>
+          <w:b/>
+          <w:bCs/>
+        </w:rPr>
+      </w:pPr>
+      <w:r>
+        <w:rPr>
+          <w:rFonts w:ascii="Georgia" w:hAnsi="Georgia"/>
+          <w:b/>
+          <w:bCs/>
+        </w:rPr>
+        <w:t xml:space="preserve">[Title] </w:t>
+      </w:r>
+      <w:r>
+        <w:rPr>
+          <w:rFonts w:ascii="Georgia" w:hAnsi="Georgia"/>
+          <w:b/>
+          <w:bCs/>
+        </w:rPr>
+        <w:t>Heat and violence against children</w:t>
+      </w:r>
+      <w:r>
+        <w:rPr>
+          <w:rFonts w:ascii="Georgia" w:hAnsi="Georgia"/>
+          <w:b/>
+          <w:bCs/>
+        </w:rPr>
+        <w:t xml:space="preserve"> in schools and homes</w:t>
+      </w:r>
+      <w:r>
+        <w:rPr>
+          <w:rFonts w:ascii="Georgia" w:hAnsi="Georgia"/>
+          <w:b/>
+          <w:bCs/>
+        </w:rPr>
+        <w:t xml:space="preserve"> </w:t>
+      </w:r>
+      <w:r>
+        <w:rPr>
+          <w:rFonts w:ascii="Georgia" w:hAnsi="Georgia"/>
+          <w:b/>
+          <w:bCs/>
+        </w:rPr>
+        <w:t>(Work in progress)</w:t>
+      </w:r>
+    </w:p>
+    <w:p>
+      <w:pPr>
+        <w:rPr>
+          <w:rFonts w:ascii="Georgia" w:hAnsi="Georgia"/>
+        </w:rPr>
+      </w:pPr>
+      <w:r>
+        <w:rPr>
+          <w:rFonts w:ascii="Georgia" w:hAnsi="Georgia"/>
+        </w:rPr>
+        <w:t xml:space="preserve">[Co-authors] </w:t>
+      </w:r>
+      <w:r>
+        <w:rPr>
+          <w:rFonts w:ascii="Georgia" w:hAnsi="Georgia"/>
+        </w:rPr>
+        <w:t>With Julian Roeckert</w:t>
+      </w:r>
+      <w:r>
+        <w:rPr>
+          <w:rFonts w:ascii="Georgia" w:hAnsi="Georgia"/>
+        </w:rPr>
+        <w:t xml:space="preserve"> </w:t>
+      </w:r>
+      <w:r>
+        <w:rPr>
+          <w:rFonts w:ascii="Georgia" w:hAnsi="Georgia"/>
+        </w:rPr>
+        <w:t xml:space="preserve">and </w:t>
+      </w:r>
+      <w:r>
+        <w:rPr>
+          <w:rFonts w:ascii="Georgia" w:hAnsi="Georgia"/>
+        </w:rPr>
+        <w:t>Giulia Malevolti</w:t>
+      </w:r>
+    </w:p>
+    <w:p>
+      <w:pPr>
+        <w:rPr>
+          <w:rFonts w:ascii="Georgia" w:hAnsi="Georgia"/>
+          <w:i/>
+          <w:iCs/>
+        </w:rPr>
+      </w:pPr>
+      <w:r>
+        <w:rPr>
+          <w:rFonts w:ascii="Georgia" w:hAnsi="Georgia"/>
+          <w:i/>
+          <w:iCs/>
+        </w:rPr>
+        <w:t>[Journal] [N/A</w:t>
+      </w:r>
+      <w:r>
+        <w:rPr>
+          <w:rFonts w:ascii="Georgia" w:hAnsi="Georgia"/>
+          <w:i/>
+          <w:iCs/>
+        </w:rPr>
+        <w:t>]</w:t>
+      </w:r>
+    </w:p>
+    <w:p>
+      <w:r>
+        <w:t xml:space="preserve">[Body text] </w:t>
+      </w:r>
+      <w:r>
+        <w:t>Extreme heat can pose risks to human health, including increasing psychological stress and aggression. We study whether the impact of ambient temperature affects violence against children using three waves of panel data of school children in Ghana, Tanzania, and Uganda.</w:t>
+      </w:r>
+      <w:r>
+        <w:t xml:space="preserve"> Working Paper coming soon. </w:t>
+      </w:r>
+    </w:p>
+    <w:p/>
+    <w:p>
+      <w:pPr>
+        <w:pStyle w:val="Heading2"/>
+      </w:pPr>
+      <w:r>
+        <w:lastRenderedPageBreak/>
+        <w:t xml:space="preserve">Topic: </w:t>
+      </w:r>
+      <w:r>
+        <w:t>Meta Science and many</w:t>
+      </w:r>
+      <w:r>
+        <w:t>-</w:t>
+      </w:r>
+      <w:r>
+        <w:t>researcher projects</w:t>
+      </w:r>
+    </w:p>
+    <w:p>
+      <w:r>
+        <w:t>[</w:t>
+      </w:r>
+      <w:r>
+        <w:t>Intro sentence to topic</w:t>
+      </w:r>
+      <w:r>
+        <w:t>]</w:t>
+      </w:r>
+      <w:r>
+        <w:t xml:space="preserve"> </w:t>
+      </w:r>
+      <w:r>
+        <w:t>I am interested in how research itself is conducted, and in what empirical work can and cannot deliver. In recent years, I have contributed to several meta-science projects.</w:t>
+      </w:r>
+    </w:p>
+    <w:p>
+      <w:pPr>
+        <w:rPr>
+          <w:rFonts w:ascii="Georgia" w:hAnsi="Georgia"/>
+          <w:b/>
+          <w:bCs/>
+        </w:rPr>
+      </w:pPr>
+      <w:r>
+        <w:rPr>
+          <w:rFonts w:ascii="Georgia" w:hAnsi="Georgia"/>
+          <w:b/>
+          <w:bCs/>
+        </w:rPr>
+        <w:t xml:space="preserve">[Title] </w:t>
+      </w:r>
+      <w:r>
+        <w:rPr>
+          <w:rFonts w:ascii="Georgia" w:hAnsi="Georgia"/>
+          <w:b/>
+          <w:bCs/>
+        </w:rPr>
+        <w:t xml:space="preserve">The </w:t>
+      </w:r>
+      <w:r>
+        <w:rPr>
+          <w:rFonts w:ascii="Georgia" w:hAnsi="Georgia"/>
+          <w:b/>
+          <w:bCs/>
+        </w:rPr>
+        <w:t>s</w:t>
+      </w:r>
+      <w:r>
+        <w:rPr>
+          <w:rFonts w:ascii="Georgia" w:hAnsi="Georgia"/>
+          <w:b/>
+          <w:bCs/>
+        </w:rPr>
+        <w:t xml:space="preserve">ources of </w:t>
+      </w:r>
+      <w:r>
+        <w:rPr>
+          <w:rFonts w:ascii="Georgia" w:hAnsi="Georgia"/>
+          <w:b/>
+          <w:bCs/>
+        </w:rPr>
+        <w:t>r</w:t>
+      </w:r>
+      <w:r>
+        <w:rPr>
+          <w:rFonts w:ascii="Georgia" w:hAnsi="Georgia"/>
+          <w:b/>
+          <w:bCs/>
+        </w:rPr>
+        <w:t xml:space="preserve">esearcher </w:t>
+      </w:r>
+      <w:r>
+        <w:rPr>
+          <w:rFonts w:ascii="Georgia" w:hAnsi="Georgia"/>
+          <w:b/>
+          <w:bCs/>
+        </w:rPr>
+        <w:t>v</w:t>
+      </w:r>
+      <w:r>
+        <w:rPr>
+          <w:rFonts w:ascii="Georgia" w:hAnsi="Georgia"/>
+          <w:b/>
+          <w:bCs/>
+        </w:rPr>
+        <w:t xml:space="preserve">ariation in </w:t>
+      </w:r>
+      <w:r>
+        <w:rPr>
+          <w:rFonts w:ascii="Georgia" w:hAnsi="Georgia"/>
+          <w:b/>
+          <w:bCs/>
+        </w:rPr>
+        <w:t>E</w:t>
+      </w:r>
+      <w:r>
+        <w:rPr>
+          <w:rFonts w:ascii="Georgia" w:hAnsi="Georgia"/>
+          <w:b/>
+          <w:bCs/>
+        </w:rPr>
+        <w:t xml:space="preserve">conomics </w:t>
+      </w:r>
+      <w:r>
+        <w:rPr>
+          <w:rFonts w:ascii="Georgia" w:hAnsi="Georgia"/>
+          <w:b/>
+          <w:bCs/>
+        </w:rPr>
+        <w:t>(Working Paper)</w:t>
+      </w:r>
+    </w:p>
+    <w:p>
+      <w:pPr>
+        <w:rPr>
+          <w:rFonts w:ascii="Georgia" w:hAnsi="Georgia"/>
+        </w:rPr>
+      </w:pPr>
+      <w:r>
+        <w:rPr>
+          <w:rFonts w:ascii="Georgia" w:hAnsi="Georgia"/>
+        </w:rPr>
+        <w:t xml:space="preserve">[Co-authors] </w:t>
+      </w:r>
+      <w:r>
+        <w:rPr>
+          <w:rFonts w:ascii="Georgia" w:hAnsi="Georgia"/>
+        </w:rPr>
+        <w:t xml:space="preserve">With </w:t>
+      </w:r>
+      <w:r>
+        <w:rPr>
+          <w:rFonts w:ascii="Georgia" w:hAnsi="Georgia"/>
+        </w:rPr>
+        <w:t>Nick Huntington-Klein, Claus C. Portner</w:t>
+      </w:r>
+      <w:r>
+        <w:rPr>
+          <w:rFonts w:ascii="Georgia" w:hAnsi="Georgia"/>
+        </w:rPr>
+        <w:t xml:space="preserve"> (Lead authors) and the </w:t>
+      </w:r>
+      <w:r>
+        <w:rPr>
+          <w:rFonts w:ascii="Georgia" w:hAnsi="Georgia"/>
+        </w:rPr>
+        <w:t>Many Economists Collaborative on Researcher Variation</w:t>
+      </w:r>
+    </w:p>
+    <w:p>
+      <w:pPr>
+        <w:rPr>
+          <w:rFonts w:ascii="Georgia" w:hAnsi="Georgia"/>
+          <w:i/>
+          <w:iCs/>
+        </w:rPr>
+      </w:pPr>
+      <w:r>
+        <w:rPr>
+          <w:rFonts w:ascii="Georgia" w:hAnsi="Georgia"/>
+          <w:i/>
+          <w:iCs/>
+        </w:rPr>
+        <w:t>[Journal] Accepted</w:t>
+      </w:r>
+      <w:r>
+        <w:rPr>
+          <w:rFonts w:ascii="Georgia" w:hAnsi="Georgia"/>
+          <w:i/>
+          <w:iCs/>
+        </w:rPr>
+        <w:t xml:space="preserve"> at </w:t>
+      </w:r>
+      <w:r>
+        <w:rPr>
+          <w:rFonts w:ascii="Georgia" w:hAnsi="Georgia"/>
+          <w:i/>
+          <w:iCs/>
+        </w:rPr>
+        <w:t>Journal of Economic Literature</w:t>
+      </w:r>
+    </w:p>
+    <w:p>
+      <w:r>
+        <w:t xml:space="preserve">[Body text] I participated in this project as part of the </w:t>
+      </w:r>
+      <w:r>
+        <w:t>Many Economists Collaborative on Researcher Variation</w:t>
+      </w:r>
+      <w:r>
+        <w:t xml:space="preserve"> which consists of 146 research teams. Each team completed the same causal inference tasks three times under varying constraints. </w:t>
+      </w:r>
+    </w:p>
+    <w:p>
+      <w:r>
+        <w:t>W</w:t>
+      </w:r>
+      <w:r>
+        <w:t xml:space="preserve">orking paper </w:t>
+      </w:r>
+      <w:r>
+        <w:t xml:space="preserve">link: </w:t>
+      </w:r>
+      <w:hyperlink r:id="rId14" w:history="1">
+        <w:r>
+          <w:rPr>
+            <w:rStyle w:val="Hyperlink"/>
+          </w:rPr>
+          <w:t>https://www.nber.org/papers/w33729</w:t>
+        </w:r>
+      </w:hyperlink>
+      <w:r>
+        <w:t xml:space="preserve"> </w:t>
+      </w:r>
+    </w:p>
+    <w:p/>
+    <w:p>
+      <w:pPr>
+        <w:rPr>
+          <w:rFonts w:ascii="Georgia" w:hAnsi="Georgia"/>
+          <w:b/>
+          <w:bCs/>
+        </w:rPr>
+      </w:pPr>
+      <w:r>
+        <w:rPr>
+          <w:rFonts w:ascii="Georgia" w:hAnsi="Georgia"/>
+          <w:b/>
+          <w:bCs/>
+        </w:rPr>
+        <w:t>[Title] #ManyDaughters (Research project)</w:t>
+      </w:r>
+    </w:p>
+    <w:p>
+      <w:r>
+        <w:t xml:space="preserve">[Project coordinators] </w:t>
+      </w:r>
+      <w:r>
+        <w:t>David Albrecht, Aurélien Baillon, Anna Dreber, Felix Holzmeister, Taisuke Imai, Magnus Johannesson, Levent Neyse, Severine Toussaert</w:t>
+      </w:r>
+    </w:p>
+    <w:p>
+      <w:r>
+        <w:t>[Body text]</w:t>
+      </w:r>
+      <w:r>
+        <w:t xml:space="preserve"> Another many-researcher </w:t>
+      </w:r>
+      <w:r>
+        <w:t xml:space="preserve">project. Here I participated as </w:t>
+      </w:r>
+      <w:r>
+        <w:t>part of a</w:t>
+      </w:r>
+      <w:r>
+        <w:t xml:space="preserve"> research team together with Julian Roeckert. The project </w:t>
+      </w:r>
+      <w:r>
+        <w:t>stud</w:t>
+      </w:r>
+      <w:r>
+        <w:t>ies the</w:t>
+      </w:r>
+      <w:r>
+        <w:t xml:space="preserve"> </w:t>
+      </w:r>
+      <w:r>
+        <w:t>variation in analytical choices and findings</w:t>
+      </w:r>
+      <w:r>
+        <w:t xml:space="preserve">. Currently, the feedback from the participating research teams is </w:t>
+      </w:r>
+      <w:r>
+        <w:t>incorporated</w:t>
+      </w:r>
+      <w:r>
+        <w:t xml:space="preserve"> into the pa</w:t>
+      </w:r>
+      <w:r>
+        <w:t>p</w:t>
+      </w:r>
+      <w:r>
+        <w:t>er draft.</w:t>
+      </w:r>
+    </w:p>
+    <w:p>
+      <w:r>
+        <w:t xml:space="preserve">Project website: </w:t>
+      </w:r>
+      <w:hyperlink r:id="rId15" w:history="1">
+        <w:r>
+          <w:rPr>
+            <w:rStyle w:val="Hyperlink"/>
+          </w:rPr>
+          <w:t>https://www.manydaughters.com/</w:t>
+        </w:r>
+      </w:hyperlink>
+      <w:r>
+        <w:t xml:space="preserve"> </w:t>
+      </w:r>
+    </w:p>
+    <w:p/>
+    <w:p>
+      <w:pPr>
+        <w:rPr>
+          <w:rFonts w:ascii="Georgia" w:hAnsi="Georgia"/>
+          <w:b/>
+          <w:bCs/>
+        </w:rPr>
+      </w:pPr>
+      <w:r>
+        <w:rPr>
+          <w:rFonts w:ascii="Georgia" w:hAnsi="Georgia"/>
+          <w:b/>
+          <w:bCs/>
+        </w:rPr>
+        <w:t xml:space="preserve">[Title] </w:t>
+      </w:r>
+      <w:r>
+        <w:rPr>
+          <w:rFonts w:ascii="Georgia" w:hAnsi="Georgia"/>
+          <w:b/>
+          <w:bCs/>
+        </w:rPr>
+        <w:t xml:space="preserve">Robustness and Replicability in Economics </w:t>
+      </w:r>
+      <w:r>
+        <w:rPr>
+          <w:rFonts w:ascii="Georgia" w:hAnsi="Georgia"/>
+          <w:b/>
+          <w:bCs/>
+        </w:rPr>
+        <w:t>(Research project)</w:t>
+      </w:r>
+    </w:p>
+    <w:p>
+      <w:r>
+        <w:t>[Project coordinators] Jörg</w:t>
+      </w:r>
+      <w:r>
+        <w:t xml:space="preserve"> Ankel-Peters</w:t>
+      </w:r>
+      <w:r>
+        <w:t xml:space="preserve">, </w:t>
+      </w:r>
+      <w:r>
+        <w:t>Florian Neubauer</w:t>
+      </w:r>
+      <w:r>
+        <w:t xml:space="preserve">, </w:t>
+      </w:r>
+      <w:r>
+        <w:t>Julian Rose</w:t>
+      </w:r>
+    </w:p>
+    <w:p>
+      <w:r>
+        <w:t xml:space="preserve">[Body text] </w:t>
+      </w:r>
+      <w:r>
+        <w:t>As part of this many-researcher project, I reproduce a study published in the Journal of Development Economics using the original dataset.</w:t>
+      </w:r>
+      <w:r>
+        <w:t xml:space="preserve"> The</w:t>
+      </w:r>
+      <w:r>
+        <w:t xml:space="preserve"> project will provide replicability rates by </w:t>
+      </w:r>
+      <w:r>
+        <w:t xml:space="preserve">collecting and analyzing </w:t>
+      </w:r>
+      <w:r>
+        <w:t>replication</w:t>
+      </w:r>
+      <w:r>
+        <w:t xml:space="preserve"> reports </w:t>
+      </w:r>
+      <w:r>
+        <w:t xml:space="preserve">of </w:t>
+      </w:r>
+      <w:r>
+        <w:t xml:space="preserve">over </w:t>
+      </w:r>
+      <w:r>
+        <w:t>6</w:t>
+      </w:r>
+      <w:r>
+        <w:t>0</w:t>
+      </w:r>
+      <w:r>
+        <w:t xml:space="preserve"> non-laboratory studies in economics.</w:t>
+      </w:r>
+    </w:p>
+    <w:p>
+      <w:r>
+        <w:t xml:space="preserve">Project website: </w:t>
+      </w:r>
+      <w:hyperlink r:id="rId16" w:history="1">
+        <w:r>
+          <w:rPr>
+            <w:rStyle w:val="Hyperlink"/>
+          </w:rPr>
+          <w:t>https://www.rwi-essen.de/en/projects/detail/robustness-and-replicability-in-economics-r2e-277</w:t>
+        </w:r>
+      </w:hyperlink>
+      <w:r>
+        <w:t xml:space="preserve"> </w:t>
+      </w:r>
+    </w:p>
+    <w:p/>
     <w:p>
       <w:pPr>
         <w:pStyle w:val="Heading1"/>
       </w:pPr>
       <w:r>
-        <w:t>2. Research page intro</w:t>
-      </w:r>
-    </w:p>
-    <w:p>
-      <w:r>
-        <w:rPr>
-          <w:i/>
-          <w:color w:val="808080"/>
-        </w:rPr>
-        <w:t>Goes in: _pages/research.md (optional intro prose). A sentence or two framing your research as a whole. Draft here:</w:t>
-      </w:r>
-    </w:p>
-    <w:p>
-      <w:r>
-        <w:t>[Draft your research-page intro here.]</w:t>
-      </w:r>
-    </w:p>
-    <w:p>
-      <w:pPr>
-        <w:pStyle w:val="Heading1"/>
-      </w:pPr>
-      <w:r>
-        <w:t>3. Research pieces</w:t>
-      </w:r>
-    </w:p>
-    <w:p>
-      <w:r>
-        <w:rPr>
-          <w:i/>
-          <w:color w:val="808080"/>
-        </w:rPr>
-        <w:t>Goes in: one _projects/&lt;slug&gt;.md per piece. For each, draft title + body text. Group each under one topic. You decide how much text each gets.</w:t>
-      </w:r>
-    </w:p>
-    <w:p>
-      <w:pPr>
-        <w:pStyle w:val="Heading2"/>
-      </w:pPr>
-      <w:r>
-        <w:t>Topic: Weather risk and risk management</w:t>
-      </w:r>
-    </w:p>
-    <w:p>
-      <w:r>
-        <w:t>[Piece title]</w:t>
-      </w:r>
-    </w:p>
-    <w:p>
-      <w:r>
         <w:lastRenderedPageBreak/>
-        <w:t>[Body text — a sentence to several paragraphs. Add links, coauthors, status.]</w:t>
-      </w:r>
-    </w:p>
-    <w:p/>
-    <w:p>
-      <w:r>
-        <w:t>[Piece title]</w:t>
-      </w:r>
-    </w:p>
-    <w:p>
-      <w:r>
-        <w:t>[Body text]</w:t>
-      </w:r>
-    </w:p>
-    <w:p>
-      <w:pPr>
-        <w:pStyle w:val="Heading2"/>
-      </w:pPr>
-      <w:r>
-        <w:t>Topic: Temperature effects</w:t>
-      </w:r>
-    </w:p>
-    <w:p>
-      <w:r>
-        <w:t>[Piece title]</w:t>
-      </w:r>
-    </w:p>
-    <w:p>
-      <w:r>
-        <w:t>[Body text]</w:t>
-      </w:r>
-    </w:p>
-    <w:p>
-      <w:pPr>
-        <w:pStyle w:val="Heading2"/>
-      </w:pPr>
-      <w:r>
-        <w:t>Topic: Other</w:t>
-      </w:r>
-    </w:p>
-    <w:p>
-      <w:r>
-        <w:t>[Piece title]</w:t>
-      </w:r>
-    </w:p>
-    <w:p>
-      <w:r>
-        <w:t>[Body text]</w:t>
-      </w:r>
-    </w:p>
-    <w:p>
-      <w:pPr>
-        <w:pStyle w:val="Heading1"/>
-      </w:pPr>
-      <w:r>
         <w:t>4. CV page intro (optional)</w:t>
       </w:r>
     </w:p>
@@ -1046,6 +2469,7 @@
   <w:style w:type="character" w:default="1" w:styleId="DefaultParagraphFont">
     <w:name w:val="Default Paragraph Font"/>
     <w:uiPriority w:val="1"/>
+    <w:semiHidden/>
     <w:unhideWhenUsed/>
   </w:style>
   <w:style w:type="table" w:default="1" w:styleId="TableNormal">
@@ -11821,6 +13245,41 @@
         <w:shd w:val="clear" w:color="auto" w:fill="FBCAA2" w:themeFill="accent6" w:themeFillTint="7F"/>
       </w:tcPr>
     </w:tblStylePr>
+  </w:style>
+  <w:style w:type="character" w:styleId="Hyperlink">
+    <w:name w:val="Hyperlink"/>
+    <w:basedOn w:val="DefaultParagraphFont"/>
+    <w:uiPriority w:val="99"/>
+    <w:unhideWhenUsed/>
+    <w:rsid w:val="003B10B0"/>
+    <w:rPr>
+      <w:color w:val="0000FF" w:themeColor="hyperlink"/>
+      <w:u w:val="single"/>
+    </w:rPr>
+  </w:style>
+  <w:style w:type="character" w:styleId="UnresolvedMention">
+    <w:name w:val="Unresolved Mention"/>
+    <w:basedOn w:val="DefaultParagraphFont"/>
+    <w:uiPriority w:val="99"/>
+    <w:semiHidden/>
+    <w:unhideWhenUsed/>
+    <w:rsid w:val="003B10B0"/>
+    <w:rPr>
+      <w:color w:val="605E5C"/>
+      <w:shd w:val="clear" w:color="auto" w:fill="E1DFDD"/>
+    </w:rPr>
+  </w:style>
+  <w:style w:type="character" w:styleId="FollowedHyperlink">
+    <w:name w:val="FollowedHyperlink"/>
+    <w:basedOn w:val="DefaultParagraphFont"/>
+    <w:uiPriority w:val="99"/>
+    <w:semiHidden/>
+    <w:unhideWhenUsed/>
+    <w:rsid w:val="006629F4"/>
+    <w:rPr>
+      <w:color w:val="800080" w:themeColor="followedHyperlink"/>
+      <w:u w:val="single"/>
+    </w:rPr>
   </w:style>
 </w:styles>
 </file>

</xml_diff>

<commit_message>
Updated text document and page setup
</commit_message>
<xml_diff>
--- a/content/website-texts.docx
+++ b/content/website-texts.docx
@@ -16,7 +16,23 @@
           <w:i/>
           <w:color w:val="808080"/>
         </w:rPr>
-        <w:t>Source of truth for all site prose. Rule: edit text HERE, then copy into the site files. Never edit prose directly in the site files (avoids drift). Keep this in your knowledge base; it is not part of the repo.</w:t>
+        <w:t xml:space="preserve">Source of truth for all site prose. Rule: edit text HERE, then </w:t>
+      </w:r>
+      <w:proofErr w:type="gramStart"/>
+      <w:r>
+        <w:rPr>
+          <w:i/>
+          <w:color w:val="808080"/>
+        </w:rPr>
+        <w:t>copy</w:t>
+      </w:r>
+      <w:proofErr w:type="gramEnd"/>
+      <w:r>
+        <w:rPr>
+          <w:i/>
+          <w:color w:val="808080"/>
+        </w:rPr>
+        <w:t xml:space="preserve"> into the site files. Never edit prose directly in the site files (avoids drift). Keep this in your knowledge base; it is not part of the repo.</w:t>
       </w:r>
     </w:p>
     <w:p>
@@ -44,7 +60,23 @@
         </w:rPr>
       </w:pPr>
       <w:r>
-        <w:t>I am an applied economist working in environmental and development economics. My research studies how households, governments and international and non-governmental organisations in low- and middle-income countries respond to environmental shocks. I combine (quasi-)experimental research designs with household survey, administrative and spatial data.</w:t>
+        <w:t xml:space="preserve">I am an applied economist working in environmental and development economics. My research studies how households, governments and international and non-governmental </w:t>
+      </w:r>
+      <w:proofErr w:type="spellStart"/>
+      <w:r>
+        <w:t>organisations</w:t>
+      </w:r>
+      <w:proofErr w:type="spellEnd"/>
+      <w:r>
+        <w:t xml:space="preserve"> in low- and middle-income countries respond to environmental shocks. I combine (quasi-)experimental research designs with household </w:t>
+      </w:r>
+      <w:proofErr w:type="gramStart"/>
+      <w:r>
+        <w:t>survey</w:t>
+      </w:r>
+      <w:proofErr w:type="gramEnd"/>
+      <w:r>
+        <w:t>, administrative and spatial data.</w:t>
       </w:r>
       <w:r>
         <w:t xml:space="preserve"> </w:t>
@@ -64,13 +96,29 @@
         <w:t xml:space="preserve"> (</w:t>
       </w:r>
       <w:r>
-        <w:t>Berlin Office), where I am part of the research group on "Climate Impacts and Adaptation" and the Policy Lab on "Climate Change, Development and Migration". I am a J-PAL Invited Researcher and an organi</w:t>
+        <w:t xml:space="preserve">Berlin Office), where I am part of the research group on "Climate Impacts and Adaptation" and the Policy Lab on "Climate Change, Development and Migration". I am a J-PAL Invited Researcher and an </w:t>
+      </w:r>
+      <w:proofErr w:type="spellStart"/>
+      <w:r>
+        <w:t>organi</w:t>
       </w:r>
       <w:r>
         <w:t>s</w:t>
       </w:r>
       <w:r>
-        <w:t>ing member of the Development Economics Network Berlin (DENeB)</w:t>
+        <w:t>ing</w:t>
+      </w:r>
+      <w:proofErr w:type="spellEnd"/>
+      <w:r>
+        <w:t xml:space="preserve"> member of the Development Economics Network Berlin (</w:t>
+      </w:r>
+      <w:proofErr w:type="spellStart"/>
+      <w:r>
+        <w:t>DENeB</w:t>
+      </w:r>
+      <w:proofErr w:type="spellEnd"/>
+      <w:r>
+        <w:t>)</w:t>
       </w:r>
       <w:r>
         <w:t>.</w:t>
@@ -85,7 +133,17 @@
     <w:p/>
     <w:p>
       <w:r>
-        <w:t>*Get in touch at lukas.mogge [@] rwi-essen.de*</w:t>
+        <w:t xml:space="preserve">*Get in touch at </w:t>
+      </w:r>
+      <w:proofErr w:type="spellStart"/>
+      <w:proofErr w:type="gramStart"/>
+      <w:r>
+        <w:t>lukas.mogge</w:t>
+      </w:r>
+      <w:proofErr w:type="spellEnd"/>
+      <w:proofErr w:type="gramEnd"/>
+      <w:r>
+        <w:t xml:space="preserve"> [@] rwi-essen.de*</w:t>
       </w:r>
     </w:p>
     <w:p>
@@ -108,7 +166,23 @@
           <w:i/>
           <w:color w:val="808080"/>
         </w:rPr>
-        <w:t>Goes in: _pages/research.md (optional intro prose). A sentence or two framing your research as a whole. Draft here:</w:t>
+        <w:t xml:space="preserve">Goes in: _pages/research.md (optional intro prose). A sentence or two framing your </w:t>
+      </w:r>
+      <w:proofErr w:type="gramStart"/>
+      <w:r>
+        <w:rPr>
+          <w:i/>
+          <w:color w:val="808080"/>
+        </w:rPr>
+        <w:t>research as a whole</w:t>
+      </w:r>
+      <w:proofErr w:type="gramEnd"/>
+      <w:r>
+        <w:rPr>
+          <w:i/>
+          <w:color w:val="808080"/>
+        </w:rPr>
+        <w:t>. Draft here:</w:t>
       </w:r>
     </w:p>
     <w:p>
@@ -136,7 +210,23 @@
           <w:i/>
           <w:color w:val="808080"/>
         </w:rPr>
-        <w:t>Goes in: one _projects/&lt;slug&gt;.md per piece. For each, draft title + body text. Group each under one topic. You decide how much text each gets.</w:t>
+        <w:t xml:space="preserve">Goes </w:t>
+      </w:r>
+      <w:proofErr w:type="gramStart"/>
+      <w:r>
+        <w:rPr>
+          <w:i/>
+          <w:color w:val="808080"/>
+        </w:rPr>
+        <w:t>in:</w:t>
+      </w:r>
+      <w:proofErr w:type="gramEnd"/>
+      <w:r>
+        <w:rPr>
+          <w:i/>
+          <w:color w:val="808080"/>
+        </w:rPr>
+        <w:t xml:space="preserve"> one _projects/&lt;slug&gt;.md per piece. For each, draft title + body text. Group each under one topic. You decide how much text each gets.</w:t>
       </w:r>
     </w:p>
     <w:p>
@@ -157,102 +247,147 @@
       </w:r>
     </w:p>
     <w:p>
-      <w:r>
-        <w:t xml:space="preserve">[With picture]: </w:t>
-      </w:r>
-      <w:r>
-        <w:t>assets/img/</w:t>
-      </w:r>
-      <w:r>
-        <w:t>IBLI_demand_2012_2022</w:t>
-      </w:r>
-      <w:r>
-        <w:t>.png</w:t>
+      <w:pPr>
+        <w:rPr>
+          <w:rFonts w:ascii="Georgia" w:hAnsi="Georgia"/>
+          <w:b/>
+          <w:bCs/>
+        </w:rPr>
+      </w:pPr>
+      <w:r>
+        <w:rPr>
+          <w:rFonts w:ascii="Georgia" w:hAnsi="Georgia"/>
+          <w:b/>
+          <w:bCs/>
+        </w:rPr>
+        <w:t>[</w:t>
+      </w:r>
+      <w:r>
+        <w:rPr>
+          <w:rFonts w:ascii="Georgia" w:hAnsi="Georgia"/>
+          <w:b/>
+          <w:bCs/>
+        </w:rPr>
+        <w:t>title</w:t>
+      </w:r>
+      <w:r>
+        <w:rPr>
+          <w:rFonts w:ascii="Georgia" w:hAnsi="Georgia"/>
+          <w:b/>
+          <w:bCs/>
+        </w:rPr>
+        <w:t xml:space="preserve">] </w:t>
+      </w:r>
+      <w:r>
+        <w:rPr>
+          <w:rFonts w:ascii="Georgia" w:hAnsi="Georgia"/>
+          <w:b/>
+          <w:bCs/>
+        </w:rPr>
+        <w:t>Perception and protection: The effect of risk exposure on demand for index insurance in Mongolia (202</w:t>
+      </w:r>
+      <w:r>
+        <w:rPr>
+          <w:rFonts w:ascii="Georgia" w:hAnsi="Georgia"/>
+          <w:b/>
+          <w:bCs/>
+        </w:rPr>
+        <w:t>5</w:t>
+      </w:r>
+      <w:r>
+        <w:rPr>
+          <w:rFonts w:ascii="Georgia" w:hAnsi="Georgia"/>
+          <w:b/>
+          <w:bCs/>
+        </w:rPr>
+        <w:t>)</w:t>
       </w:r>
     </w:p>
     <w:p>
       <w:pPr>
         <w:rPr>
           <w:rFonts w:ascii="Georgia" w:hAnsi="Georgia"/>
-          <w:b/>
-          <w:bCs/>
         </w:rPr>
       </w:pPr>
       <w:r>
         <w:rPr>
           <w:rFonts w:ascii="Georgia" w:hAnsi="Georgia"/>
-          <w:b/>
-          <w:bCs/>
-        </w:rPr>
-        <w:t xml:space="preserve">[Title] </w:t>
-      </w:r>
-      <w:r>
-        <w:rPr>
-          <w:rFonts w:ascii="Georgia" w:hAnsi="Georgia"/>
-          <w:b/>
-          <w:bCs/>
-        </w:rPr>
-        <w:t>Perception and protection: The effect of risk exposure on demand for index insurance in Mongolia (202</w:t>
-      </w:r>
-      <w:r>
-        <w:rPr>
-          <w:rFonts w:ascii="Georgia" w:hAnsi="Georgia"/>
-          <w:b/>
-          <w:bCs/>
-        </w:rPr>
-        <w:t>5</w:t>
-      </w:r>
-      <w:r>
-        <w:rPr>
-          <w:rFonts w:ascii="Georgia" w:hAnsi="Georgia"/>
-          <w:b/>
-          <w:bCs/>
-        </w:rPr>
-        <w:t>)</w:t>
+        </w:rPr>
+        <w:t xml:space="preserve">[authors] </w:t>
+      </w:r>
+      <w:r>
+        <w:rPr>
+          <w:rFonts w:ascii="Georgia" w:hAnsi="Georgia"/>
+        </w:rPr>
+        <w:t>With Kati Kraehnert</w:t>
       </w:r>
     </w:p>
     <w:p>
       <w:pPr>
         <w:rPr>
           <w:rFonts w:ascii="Georgia" w:hAnsi="Georgia"/>
+          <w:i/>
+          <w:iCs/>
         </w:rPr>
       </w:pPr>
       <w:r>
         <w:rPr>
           <w:rFonts w:ascii="Georgia" w:hAnsi="Georgia"/>
-        </w:rPr>
-        <w:t xml:space="preserve">[Co-authors] </w:t>
-      </w:r>
-      <w:r>
-        <w:rPr>
-          <w:rFonts w:ascii="Georgia" w:hAnsi="Georgia"/>
-        </w:rPr>
-        <w:t>With Kati Kraehnert</w:t>
+          <w:i/>
+          <w:iCs/>
+        </w:rPr>
+        <w:t>[</w:t>
+      </w:r>
+      <w:r>
+        <w:rPr>
+          <w:rFonts w:ascii="Georgia" w:hAnsi="Georgia"/>
+          <w:i/>
+          <w:iCs/>
+        </w:rPr>
+        <w:t>journal</w:t>
+      </w:r>
+      <w:r>
+        <w:rPr>
+          <w:rFonts w:ascii="Georgia" w:hAnsi="Georgia"/>
+          <w:i/>
+          <w:iCs/>
+        </w:rPr>
+        <w:t xml:space="preserve">] </w:t>
+      </w:r>
+      <w:r>
+        <w:rPr>
+          <w:rFonts w:ascii="Georgia" w:hAnsi="Georgia"/>
+          <w:i/>
+          <w:iCs/>
+        </w:rPr>
+        <w:t xml:space="preserve">Journal of Environmental Economics and Management </w:t>
       </w:r>
     </w:p>
     <w:p>
-      <w:pPr>
-        <w:rPr>
-          <w:rFonts w:ascii="Georgia" w:hAnsi="Georgia"/>
-          <w:i/>
-          <w:iCs/>
-        </w:rPr>
-      </w:pPr>
-      <w:r>
-        <w:rPr>
-          <w:rFonts w:ascii="Georgia" w:hAnsi="Georgia"/>
-          <w:i/>
-          <w:iCs/>
-        </w:rPr>
-        <w:t xml:space="preserve">[Journal] </w:t>
-      </w:r>
-      <w:r>
-        <w:rPr>
-          <w:rFonts w:ascii="Georgia" w:hAnsi="Georgia"/>
-          <w:i/>
-          <w:iCs/>
-        </w:rPr>
-        <w:t xml:space="preserve">Journal of Environmental Economics and Management </w:t>
+      <w:r>
+        <w:t>[</w:t>
+      </w:r>
+      <w:proofErr w:type="spellStart"/>
+      <w:r>
+        <w:t>img</w:t>
+      </w:r>
+      <w:proofErr w:type="spellEnd"/>
+      <w:r>
+        <w:t>]: assets/</w:t>
+      </w:r>
+      <w:proofErr w:type="spellStart"/>
+      <w:r>
+        <w:t>img</w:t>
+      </w:r>
+      <w:proofErr w:type="spellEnd"/>
+      <w:r>
+        <w:t>/</w:t>
+      </w:r>
+      <w:r>
+        <w:t>IBLI_demand_2012_2022</w:t>
+      </w:r>
+      <w:r>
+        <w:t>.png</w:t>
       </w:r>
     </w:p>
     <w:p>
@@ -296,7 +431,15 @@
         <w:t xml:space="preserve"> and</w:t>
       </w:r>
       <w:r>
-        <w:t xml:space="preserve"> spanning eleven years. Results indicate that demand for index insurance increases in areas exposed to adverse winter conditions during the insurance sales period, when pastoralists have to decide about </w:t>
+        <w:t xml:space="preserve"> spanning eleven years. Results indicate that demand for index insurance increases in areas exposed to adverse winter conditions during the insurance sales period, when pastoralists </w:t>
+      </w:r>
+      <w:proofErr w:type="gramStart"/>
+      <w:r>
+        <w:t>have to</w:t>
+      </w:r>
+      <w:proofErr w:type="gramEnd"/>
+      <w:r>
+        <w:t xml:space="preserve"> decide about </w:t>
       </w:r>
       <w:r>
         <w:t>buying</w:t>
@@ -352,7 +495,7 @@
           <w:b/>
           <w:bCs/>
         </w:rPr>
-        <w:t xml:space="preserve">[Title] </w:t>
+        <w:t>[</w:t>
       </w:r>
       <w:r>
         <w:rPr>
@@ -360,18 +503,23 @@
           <w:b/>
           <w:bCs/>
         </w:rPr>
+        <w:t>title</w:t>
+      </w:r>
+      <w:r>
+        <w:rPr>
+          <w:rFonts w:ascii="Georgia" w:hAnsi="Georgia"/>
+          <w:b/>
+          <w:bCs/>
+        </w:rPr>
+        <w:t xml:space="preserve">] </w:t>
+      </w:r>
+      <w:r>
+        <w:rPr>
+          <w:rFonts w:ascii="Georgia" w:hAnsi="Georgia"/>
+          <w:b/>
+          <w:bCs/>
+        </w:rPr>
         <w:t>Anticipatory cash transfers in the context of weather disasters (2025)</w:t>
-      </w:r>
-    </w:p>
-    <w:p>
-      <w:r>
-        <w:t>[With picture]: assets/img/</w:t>
-      </w:r>
-      <w:r>
-        <w:t>dzud_risk_map_2021</w:t>
-      </w:r>
-      <w:r>
-        <w:t>.png</w:t>
       </w:r>
     </w:p>
     <w:p>
@@ -384,7 +532,7 @@
         <w:rPr>
           <w:rFonts w:ascii="Georgia" w:hAnsi="Georgia"/>
         </w:rPr>
-        <w:t xml:space="preserve">[Co-authors] </w:t>
+        <w:t xml:space="preserve">[authors] </w:t>
       </w:r>
       <w:r>
         <w:rPr>
@@ -407,7 +555,7 @@
           <w:i/>
           <w:iCs/>
         </w:rPr>
-        <w:t xml:space="preserve">[Journal] </w:t>
+        <w:t>[</w:t>
       </w:r>
       <w:r>
         <w:rPr>
@@ -415,7 +563,50 @@
           <w:i/>
           <w:iCs/>
         </w:rPr>
+        <w:t>j</w:t>
+      </w:r>
+      <w:r>
+        <w:rPr>
+          <w:rFonts w:ascii="Georgia" w:hAnsi="Georgia"/>
+          <w:i/>
+          <w:iCs/>
+        </w:rPr>
+        <w:t xml:space="preserve">ournal] </w:t>
+      </w:r>
+      <w:r>
+        <w:rPr>
+          <w:rFonts w:ascii="Georgia" w:hAnsi="Georgia"/>
+          <w:i/>
+          <w:iCs/>
+        </w:rPr>
         <w:t>Journal of the Association of Environmental and Resource Economists</w:t>
+      </w:r>
+    </w:p>
+    <w:p>
+      <w:r>
+        <w:t>[</w:t>
+      </w:r>
+      <w:proofErr w:type="spellStart"/>
+      <w:r>
+        <w:t>img</w:t>
+      </w:r>
+      <w:proofErr w:type="spellEnd"/>
+      <w:r>
+        <w:t>]: assets/</w:t>
+      </w:r>
+      <w:proofErr w:type="spellStart"/>
+      <w:r>
+        <w:t>img</w:t>
+      </w:r>
+      <w:proofErr w:type="spellEnd"/>
+      <w:r>
+        <w:t>/</w:t>
+      </w:r>
+      <w:r>
+        <w:t>dzud_risk_map_2021</w:t>
+      </w:r>
+      <w:r>
+        <w:t>.png</w:t>
       </w:r>
     </w:p>
     <w:p>
@@ -498,7 +689,7 @@
           <w:b/>
           <w:bCs/>
         </w:rPr>
-        <w:t xml:space="preserve">[Title] </w:t>
+        <w:t>[</w:t>
       </w:r>
       <w:r>
         <w:rPr>
@@ -506,7 +697,7 @@
           <w:b/>
           <w:bCs/>
         </w:rPr>
-        <w:t>Charity hazard in climate adaptation: The effect of anticipatory cash transfers on demand for weather insurance</w:t>
+        <w:t>title</w:t>
       </w:r>
       <w:r>
         <w:rPr>
@@ -514,7 +705,23 @@
           <w:b/>
           <w:bCs/>
         </w:rPr>
-        <w:t xml:space="preserve"> (Working Paper)</w:t>
+        <w:t xml:space="preserve">] </w:t>
+      </w:r>
+      <w:r>
+        <w:rPr>
+          <w:rFonts w:ascii="Georgia" w:hAnsi="Georgia"/>
+          <w:b/>
+          <w:bCs/>
+        </w:rPr>
+        <w:t>Charity hazard in climate adaptation: The effect of anticipatory cash transfers on demand for weather insurance</w:t>
+      </w:r>
+      <w:r>
+        <w:rPr>
+          <w:rFonts w:ascii="Georgia" w:hAnsi="Georgia"/>
+          <w:b/>
+          <w:bCs/>
+        </w:rPr>
+        <w:t xml:space="preserve"> </w:t>
       </w:r>
     </w:p>
     <w:p>
@@ -527,7 +734,7 @@
         <w:rPr>
           <w:rFonts w:ascii="Georgia" w:hAnsi="Georgia"/>
         </w:rPr>
-        <w:t xml:space="preserve">[Co-authors] </w:t>
+        <w:t xml:space="preserve">[authors] </w:t>
       </w:r>
       <w:r>
         <w:rPr>
@@ -562,7 +769,31 @@
           <w:i/>
           <w:iCs/>
         </w:rPr>
-        <w:t>[Journal] [N/A]</w:t>
+        <w:t>[</w:t>
+      </w:r>
+      <w:r>
+        <w:rPr>
+          <w:rFonts w:ascii="Georgia" w:hAnsi="Georgia"/>
+          <w:i/>
+          <w:iCs/>
+        </w:rPr>
+        <w:t>status</w:t>
+      </w:r>
+      <w:r>
+        <w:rPr>
+          <w:rFonts w:ascii="Georgia" w:hAnsi="Georgia"/>
+          <w:i/>
+          <w:iCs/>
+        </w:rPr>
+        <w:t xml:space="preserve">] </w:t>
+      </w:r>
+      <w:r>
+        <w:rPr>
+          <w:rFonts w:ascii="Georgia" w:hAnsi="Georgia"/>
+          <w:i/>
+          <w:iCs/>
+        </w:rPr>
+        <w:t>Working paper</w:t>
       </w:r>
     </w:p>
     <w:p>
@@ -576,7 +807,15 @@
         <w:t xml:space="preserve">receiving </w:t>
       </w:r>
       <w:r>
-        <w:t>anticipatory cash transfers crowds out demand for index-based livestock insurance in Mongolia, using a randomized cash transfer experiment during an extreme winter and linking household panel survey with insurance customer data. We find no evidence of charity hazard and can rule out large negative effects on insurance demand. Treatment effects differ by prior insurance experience. While previously uninsured households show no significant response, households with insurance experience are more likely to purchase insurance after the cash transfer. Our results suggest that, in contexts with incomplete assistance and established index insurance, anticipatory assistance need not undermine insurance demand.</w:t>
+        <w:t xml:space="preserve">anticipatory cash transfers crowds out demand for index-based livestock insurance in Mongolia, using a randomized cash transfer experiment during an extreme winter and linking household panel survey with insurance customer data. We find no evidence of charity hazard and can rule out large negative effects on insurance demand. Treatment effects differ </w:t>
+      </w:r>
+      <w:proofErr w:type="gramStart"/>
+      <w:r>
+        <w:t>by</w:t>
+      </w:r>
+      <w:proofErr w:type="gramEnd"/>
+      <w:r>
+        <w:t xml:space="preserve"> prior insurance experience. While previously uninsured households show no significant response, households with insurance experience are more likely to purchase insurance after the cash transfer. Our results suggest that, in contexts with incomplete assistance and established index insurance, anticipatory assistance need not undermine insurance demand.</w:t>
       </w:r>
     </w:p>
     <w:p>
@@ -617,7 +856,23 @@
           <w:b/>
           <w:bCs/>
         </w:rPr>
-        <w:t xml:space="preserve">[Title] </w:t>
+        <w:t>[</w:t>
+      </w:r>
+      <w:r>
+        <w:rPr>
+          <w:rFonts w:ascii="Georgia" w:hAnsi="Georgia"/>
+          <w:b/>
+          <w:bCs/>
+        </w:rPr>
+        <w:t>title</w:t>
+      </w:r>
+      <w:r>
+        <w:rPr>
+          <w:rFonts w:ascii="Georgia" w:hAnsi="Georgia"/>
+          <w:b/>
+          <w:bCs/>
+        </w:rPr>
+        <w:t xml:space="preserve">] </w:t>
       </w:r>
       <w:r>
         <w:rPr>
@@ -662,7 +917,7 @@
         <w:rPr>
           <w:rFonts w:ascii="Georgia" w:hAnsi="Georgia"/>
         </w:rPr>
-        <w:t xml:space="preserve">[Co-authors] With </w:t>
+        <w:t xml:space="preserve">[authors] With </w:t>
       </w:r>
       <w:r>
         <w:rPr>
@@ -712,12 +967,28 @@
         </w:rPr>
         <w:t xml:space="preserve">, </w:t>
       </w:r>
-      <w:r>
-        <w:rPr>
-          <w:rFonts w:ascii="Georgia" w:hAnsi="Georgia"/>
-        </w:rPr>
-        <w:t>Edzer Pebesma</w:t>
-      </w:r>
+      <w:proofErr w:type="spellStart"/>
+      <w:r>
+        <w:rPr>
+          <w:rFonts w:ascii="Georgia" w:hAnsi="Georgia"/>
+        </w:rPr>
+        <w:t>Edzer</w:t>
+      </w:r>
+      <w:proofErr w:type="spellEnd"/>
+      <w:r>
+        <w:rPr>
+          <w:rFonts w:ascii="Georgia" w:hAnsi="Georgia"/>
+        </w:rPr>
+        <w:t xml:space="preserve"> </w:t>
+      </w:r>
+      <w:proofErr w:type="spellStart"/>
+      <w:r>
+        <w:rPr>
+          <w:rFonts w:ascii="Georgia" w:hAnsi="Georgia"/>
+        </w:rPr>
+        <w:t>Pebesma</w:t>
+      </w:r>
+      <w:proofErr w:type="spellEnd"/>
       <w:r>
         <w:rPr>
           <w:rFonts w:ascii="Georgia" w:hAnsi="Georgia"/>
@@ -803,7 +1074,7 @@
           <w:b/>
           <w:bCs/>
         </w:rPr>
-        <w:t xml:space="preserve">[Title] </w:t>
+        <w:t>[</w:t>
       </w:r>
       <w:r>
         <w:rPr>
@@ -811,7 +1082,7 @@
           <w:b/>
           <w:bCs/>
         </w:rPr>
-        <w:t xml:space="preserve">Stated and </w:t>
+        <w:t>title</w:t>
       </w:r>
       <w:r>
         <w:rPr>
@@ -819,7 +1090,7 @@
           <w:b/>
           <w:bCs/>
         </w:rPr>
-        <w:t>r</w:t>
+        <w:t xml:space="preserve">] </w:t>
       </w:r>
       <w:r>
         <w:rPr>
@@ -827,7 +1098,7 @@
           <w:b/>
           <w:bCs/>
         </w:rPr>
-        <w:t xml:space="preserve">ealized </w:t>
+        <w:t xml:space="preserve">Stated and </w:t>
       </w:r>
       <w:r>
         <w:rPr>
@@ -835,7 +1106,7 @@
           <w:b/>
           <w:bCs/>
         </w:rPr>
-        <w:t>d</w:t>
+        <w:t>r</w:t>
       </w:r>
       <w:r>
         <w:rPr>
@@ -843,7 +1114,7 @@
           <w:b/>
           <w:bCs/>
         </w:rPr>
-        <w:t xml:space="preserve">emand for </w:t>
+        <w:t xml:space="preserve">ealized </w:t>
       </w:r>
       <w:r>
         <w:rPr>
@@ -851,7 +1122,7 @@
           <w:b/>
           <w:bCs/>
         </w:rPr>
-        <w:t>p</w:t>
+        <w:t>d</w:t>
       </w:r>
       <w:r>
         <w:rPr>
@@ -859,7 +1130,7 @@
           <w:b/>
           <w:bCs/>
         </w:rPr>
-        <w:t xml:space="preserve">arametric </w:t>
+        <w:t xml:space="preserve">emand for </w:t>
       </w:r>
       <w:r>
         <w:rPr>
@@ -867,7 +1138,7 @@
           <w:b/>
           <w:bCs/>
         </w:rPr>
-        <w:t>r</w:t>
+        <w:t>p</w:t>
       </w:r>
       <w:r>
         <w:rPr>
@@ -875,7 +1146,7 @@
           <w:b/>
           <w:bCs/>
         </w:rPr>
-        <w:t xml:space="preserve">ainfall </w:t>
+        <w:t xml:space="preserve">arametric </w:t>
       </w:r>
       <w:r>
         <w:rPr>
@@ -883,7 +1154,7 @@
           <w:b/>
           <w:bCs/>
         </w:rPr>
-        <w:t>i</w:t>
+        <w:t>r</w:t>
       </w:r>
       <w:r>
         <w:rPr>
@@ -891,7 +1162,7 @@
           <w:b/>
           <w:bCs/>
         </w:rPr>
-        <w:t xml:space="preserve">nsurance </w:t>
+        <w:t xml:space="preserve">ainfall </w:t>
       </w:r>
       <w:r>
         <w:rPr>
@@ -899,7 +1170,7 @@
           <w:b/>
           <w:bCs/>
         </w:rPr>
-        <w:t>a</w:t>
+        <w:t>i</w:t>
       </w:r>
       <w:r>
         <w:rPr>
@@ -907,7 +1178,7 @@
           <w:b/>
           <w:bCs/>
         </w:rPr>
-        <w:t xml:space="preserve">mong </w:t>
+        <w:t xml:space="preserve">nsurance </w:t>
       </w:r>
       <w:r>
         <w:rPr>
@@ -915,7 +1186,7 @@
           <w:b/>
           <w:bCs/>
         </w:rPr>
-        <w:t>r</w:t>
+        <w:t>a</w:t>
       </w:r>
       <w:r>
         <w:rPr>
@@ -923,7 +1194,7 @@
           <w:b/>
           <w:bCs/>
         </w:rPr>
-        <w:t xml:space="preserve">ice </w:t>
+        <w:t xml:space="preserve">mong </w:t>
       </w:r>
       <w:r>
         <w:rPr>
@@ -931,7 +1202,7 @@
           <w:b/>
           <w:bCs/>
         </w:rPr>
-        <w:t>f</w:t>
+        <w:t>r</w:t>
       </w:r>
       <w:r>
         <w:rPr>
@@ -939,7 +1210,7 @@
           <w:b/>
           <w:bCs/>
         </w:rPr>
-        <w:t xml:space="preserve">armers in Vietnam </w:t>
+        <w:t xml:space="preserve">ice </w:t>
       </w:r>
       <w:r>
         <w:rPr>
@@ -947,7 +1218,15 @@
           <w:b/>
           <w:bCs/>
         </w:rPr>
-        <w:t>(Working Paper)</w:t>
+        <w:t>f</w:t>
+      </w:r>
+      <w:r>
+        <w:rPr>
+          <w:rFonts w:ascii="Georgia" w:hAnsi="Georgia"/>
+          <w:b/>
+          <w:bCs/>
+        </w:rPr>
+        <w:t>armers in Vietnam</w:t>
       </w:r>
     </w:p>
     <w:p>
@@ -960,7 +1239,7 @@
         <w:rPr>
           <w:rFonts w:ascii="Georgia" w:hAnsi="Georgia"/>
         </w:rPr>
-        <w:t xml:space="preserve">[Co-authors] </w:t>
+        <w:t xml:space="preserve">[authors] </w:t>
       </w:r>
       <w:r>
         <w:rPr>
@@ -1019,7 +1298,7 @@
           <w:i/>
           <w:iCs/>
         </w:rPr>
-        <w:t xml:space="preserve">[Journal] </w:t>
+        <w:t>[</w:t>
       </w:r>
       <w:r>
         <w:rPr>
@@ -1027,6 +1306,30 @@
           <w:i/>
           <w:iCs/>
         </w:rPr>
+        <w:t>Status</w:t>
+      </w:r>
+      <w:r>
+        <w:rPr>
+          <w:rFonts w:ascii="Georgia" w:hAnsi="Georgia"/>
+          <w:i/>
+          <w:iCs/>
+        </w:rPr>
+        <w:t>]</w:t>
+      </w:r>
+      <w:r>
+        <w:rPr>
+          <w:rFonts w:ascii="Georgia" w:hAnsi="Georgia"/>
+          <w:i/>
+          <w:iCs/>
+        </w:rPr>
+        <w:t xml:space="preserve"> </w:t>
+      </w:r>
+      <w:r>
+        <w:rPr>
+          <w:rFonts w:ascii="Georgia" w:hAnsi="Georgia"/>
+          <w:i/>
+          <w:iCs/>
+        </w:rPr>
         <w:t>Under review at Geneva Papers on Risk and Insurance - Issues and Practice</w:t>
       </w:r>
     </w:p>
@@ -1041,7 +1344,23 @@
         <w:t xml:space="preserve">. </w:t>
       </w:r>
       <w:r>
-        <w:t>Using a household survey of 3,000 rice-farming households, we elicit willingness to pay: 33% of respondents report a WTP of at least half the market price, and 18% report a WTP equal to or higher than the market price. Yet when insurance agents offered the product at a subsidized price below respondents’ stated WTP, no respondent purchased it. We discuss mechanisms that may explain this discrepancy between stated and realized demand, including limited incentive compatibility of the WTP elicitation mechanism, changes in valuations, and contextual barriers to insurance adoption.</w:t>
+        <w:t xml:space="preserve">Using a household survey of 3,000 rice-farming households, we elicit willingness to pay: 33% of respondents report a WTP of at least half the market price, and 18% report a WTP equal to or higher than the market price. Yet when insurance agents offered the product at a subsidized price below </w:t>
+      </w:r>
+      <w:proofErr w:type="gramStart"/>
+      <w:r>
+        <w:t>respondents’</w:t>
+      </w:r>
+      <w:proofErr w:type="gramEnd"/>
+      <w:r>
+        <w:t xml:space="preserve"> stated WTP, no respondent purchased it. We </w:t>
+      </w:r>
+      <w:proofErr w:type="gramStart"/>
+      <w:r>
+        <w:t>discuss</w:t>
+      </w:r>
+      <w:proofErr w:type="gramEnd"/>
+      <w:r>
+        <w:t xml:space="preserve"> mechanisms that may explain this discrepancy between stated and realized demand, including limited incentive compatibility of the WTP elicitation mechanism, changes in valuations, and contextual barriers to insurance adoption.</w:t>
       </w:r>
     </w:p>
     <w:p>
@@ -1091,7 +1410,7 @@
           <w:b/>
           <w:bCs/>
         </w:rPr>
-        <w:t xml:space="preserve">[Title] </w:t>
+        <w:t>[</w:t>
       </w:r>
       <w:r>
         <w:rPr>
@@ -1099,7 +1418,7 @@
           <w:b/>
           <w:bCs/>
         </w:rPr>
-        <w:t>Heat and violence against children</w:t>
+        <w:t>title</w:t>
       </w:r>
       <w:r>
         <w:rPr>
@@ -1107,7 +1426,7 @@
           <w:b/>
           <w:bCs/>
         </w:rPr>
-        <w:t xml:space="preserve"> in schools and homes</w:t>
+        <w:t xml:space="preserve">] </w:t>
       </w:r>
       <w:r>
         <w:rPr>
@@ -1115,7 +1434,7 @@
           <w:b/>
           <w:bCs/>
         </w:rPr>
-        <w:t xml:space="preserve"> </w:t>
+        <w:t>Heat and violence against children</w:t>
       </w:r>
       <w:r>
         <w:rPr>
@@ -1123,7 +1442,15 @@
           <w:b/>
           <w:bCs/>
         </w:rPr>
-        <w:t>(Work in progress)</w:t>
+        <w:t xml:space="preserve"> in schools and homes</w:t>
+      </w:r>
+      <w:r>
+        <w:rPr>
+          <w:rFonts w:ascii="Georgia" w:hAnsi="Georgia"/>
+          <w:b/>
+          <w:bCs/>
+        </w:rPr>
+        <w:t xml:space="preserve"> </w:t>
       </w:r>
     </w:p>
     <w:p>
@@ -1136,7 +1463,7 @@
         <w:rPr>
           <w:rFonts w:ascii="Georgia" w:hAnsi="Georgia"/>
         </w:rPr>
-        <w:t xml:space="preserve">[Co-authors] </w:t>
+        <w:t xml:space="preserve">[authors] </w:t>
       </w:r>
       <w:r>
         <w:rPr>
@@ -1177,7 +1504,31 @@
           <w:i/>
           <w:iCs/>
         </w:rPr>
-        <w:t>[Journal] [N/A</w:t>
+        <w:t>[</w:t>
+      </w:r>
+      <w:r>
+        <w:rPr>
+          <w:rFonts w:ascii="Georgia" w:hAnsi="Georgia"/>
+          <w:i/>
+          <w:iCs/>
+        </w:rPr>
+        <w:t>status</w:t>
+      </w:r>
+      <w:r>
+        <w:rPr>
+          <w:rFonts w:ascii="Georgia" w:hAnsi="Georgia"/>
+          <w:i/>
+          <w:iCs/>
+        </w:rPr>
+        <w:t>] [</w:t>
+      </w:r>
+      <w:r>
+        <w:rPr>
+          <w:rFonts w:ascii="Georgia" w:hAnsi="Georgia"/>
+          <w:i/>
+          <w:iCs/>
+        </w:rPr>
+        <w:t>Work in progress</w:t>
       </w:r>
       <w:r>
         <w:rPr>
@@ -1209,13 +1560,21 @@
         <w:t xml:space="preserve">Topic: </w:t>
       </w:r>
       <w:r>
-        <w:t>Meta Science and many</w:t>
+        <w:t xml:space="preserve">Meta Science and </w:t>
+      </w:r>
+      <w:proofErr w:type="gramStart"/>
+      <w:r>
+        <w:t>many</w:t>
       </w:r>
       <w:r>
         <w:t>-</w:t>
       </w:r>
       <w:r>
-        <w:t>researcher projects</w:t>
+        <w:t>researcher</w:t>
+      </w:r>
+      <w:proofErr w:type="gramEnd"/>
+      <w:r>
+        <w:t xml:space="preserve"> projects</w:t>
       </w:r>
     </w:p>
     <w:p>
@@ -1249,7 +1608,7 @@
           <w:b/>
           <w:bCs/>
         </w:rPr>
-        <w:t xml:space="preserve">[Title] </w:t>
+        <w:t>[</w:t>
       </w:r>
       <w:r>
         <w:rPr>
@@ -1257,7 +1616,7 @@
           <w:b/>
           <w:bCs/>
         </w:rPr>
-        <w:t xml:space="preserve">The </w:t>
+        <w:t>title</w:t>
       </w:r>
       <w:r>
         <w:rPr>
@@ -1265,23 +1624,25 @@
           <w:b/>
           <w:bCs/>
         </w:rPr>
-        <w:t>s</w:t>
-      </w:r>
+        <w:t xml:space="preserve">] </w:t>
+      </w:r>
+      <w:proofErr w:type="gramStart"/>
       <w:r>
         <w:rPr>
           <w:rFonts w:ascii="Georgia" w:hAnsi="Georgia"/>
           <w:b/>
           <w:bCs/>
         </w:rPr>
-        <w:t xml:space="preserve">ources of </w:t>
-      </w:r>
+        <w:t>The</w:t>
+      </w:r>
+      <w:proofErr w:type="gramEnd"/>
       <w:r>
         <w:rPr>
           <w:rFonts w:ascii="Georgia" w:hAnsi="Georgia"/>
           <w:b/>
           <w:bCs/>
         </w:rPr>
-        <w:t>r</w:t>
+        <w:t xml:space="preserve"> </w:t>
       </w:r>
       <w:r>
         <w:rPr>
@@ -1289,7 +1650,7 @@
           <w:b/>
           <w:bCs/>
         </w:rPr>
-        <w:t xml:space="preserve">esearcher </w:t>
+        <w:t>s</w:t>
       </w:r>
       <w:r>
         <w:rPr>
@@ -1297,7 +1658,7 @@
           <w:b/>
           <w:bCs/>
         </w:rPr>
-        <w:t>v</w:t>
+        <w:t xml:space="preserve">ources of </w:t>
       </w:r>
       <w:r>
         <w:rPr>
@@ -1305,7 +1666,7 @@
           <w:b/>
           <w:bCs/>
         </w:rPr>
-        <w:t xml:space="preserve">ariation in </w:t>
+        <w:t>r</w:t>
       </w:r>
       <w:r>
         <w:rPr>
@@ -1313,7 +1674,7 @@
           <w:b/>
           <w:bCs/>
         </w:rPr>
-        <w:t>E</w:t>
+        <w:t xml:space="preserve">esearcher </w:t>
       </w:r>
       <w:r>
         <w:rPr>
@@ -1321,7 +1682,7 @@
           <w:b/>
           <w:bCs/>
         </w:rPr>
-        <w:t xml:space="preserve">conomics </w:t>
+        <w:t>v</w:t>
       </w:r>
       <w:r>
         <w:rPr>
@@ -1329,7 +1690,23 @@
           <w:b/>
           <w:bCs/>
         </w:rPr>
-        <w:t>(Working Paper)</w:t>
+        <w:t xml:space="preserve">ariation in </w:t>
+      </w:r>
+      <w:r>
+        <w:rPr>
+          <w:rFonts w:ascii="Georgia" w:hAnsi="Georgia"/>
+          <w:b/>
+          <w:bCs/>
+        </w:rPr>
+        <w:t>E</w:t>
+      </w:r>
+      <w:r>
+        <w:rPr>
+          <w:rFonts w:ascii="Georgia" w:hAnsi="Georgia"/>
+          <w:b/>
+          <w:bCs/>
+        </w:rPr>
+        <w:t>conomics</w:t>
       </w:r>
     </w:p>
     <w:p>
@@ -1342,7 +1719,7 @@
         <w:rPr>
           <w:rFonts w:ascii="Georgia" w:hAnsi="Georgia"/>
         </w:rPr>
-        <w:t xml:space="preserve">[Co-authors] </w:t>
+        <w:t xml:space="preserve">[authors] </w:t>
       </w:r>
       <w:r>
         <w:rPr>
@@ -1383,7 +1760,23 @@
           <w:i/>
           <w:iCs/>
         </w:rPr>
-        <w:t>[Journal] Accepted</w:t>
+        <w:t>[</w:t>
+      </w:r>
+      <w:r>
+        <w:rPr>
+          <w:rFonts w:ascii="Georgia" w:hAnsi="Georgia"/>
+          <w:i/>
+          <w:iCs/>
+        </w:rPr>
+        <w:t>status</w:t>
+      </w:r>
+      <w:r>
+        <w:rPr>
+          <w:rFonts w:ascii="Georgia" w:hAnsi="Georgia"/>
+          <w:i/>
+          <w:iCs/>
+        </w:rPr>
+        <w:t>] Accepted</w:t>
       </w:r>
       <w:r>
         <w:rPr>
@@ -1450,15 +1843,63 @@
           <w:b/>
           <w:bCs/>
         </w:rPr>
-        <w:t>[Title] #ManyDaughters (Research project)</w:t>
+        <w:t>[</w:t>
+      </w:r>
+      <w:proofErr w:type="gramStart"/>
+      <w:r>
+        <w:rPr>
+          <w:rFonts w:ascii="Georgia" w:hAnsi="Georgia"/>
+          <w:b/>
+          <w:bCs/>
+        </w:rPr>
+        <w:t>title</w:t>
+      </w:r>
+      <w:r>
+        <w:rPr>
+          <w:rFonts w:ascii="Georgia" w:hAnsi="Georgia"/>
+          <w:b/>
+          <w:bCs/>
+        </w:rPr>
+        <w:t>] #</w:t>
+      </w:r>
+      <w:proofErr w:type="gramEnd"/>
+      <w:r>
+        <w:rPr>
+          <w:rFonts w:ascii="Georgia" w:hAnsi="Georgia"/>
+          <w:b/>
+          <w:bCs/>
+        </w:rPr>
+        <w:t xml:space="preserve">ManyDaughters </w:t>
       </w:r>
     </w:p>
     <w:p>
       <w:r>
-        <w:t xml:space="preserve">[Project coordinators] </w:t>
-      </w:r>
-      <w:r>
-        <w:t>David Albrecht, Aurélien Baillon, Anna Dreber, Felix Holzmeister, Taisuke Imai, Magnus Johannesson, Levent Neyse, Severine Toussaert</w:t>
+        <w:t>[</w:t>
+      </w:r>
+      <w:r>
+        <w:t>authors</w:t>
+      </w:r>
+      <w:r>
+        <w:t>]</w:t>
+      </w:r>
+      <w:r>
+        <w:t xml:space="preserve"> Project coordinators:</w:t>
+      </w:r>
+      <w:r>
+        <w:t xml:space="preserve"> </w:t>
+      </w:r>
+      <w:r>
+        <w:t xml:space="preserve">David Albrecht, Aurélien Baillon, Anna Dreber, Felix Holzmeister, Taisuke Imai, Magnus Johannesson, Levent Neyse, Severine </w:t>
+      </w:r>
+      <w:proofErr w:type="spellStart"/>
+      <w:r>
+        <w:t>Toussaert</w:t>
+      </w:r>
+      <w:proofErr w:type="spellEnd"/>
+    </w:p>
+    <w:p>
+      <w:r>
+        <w:t>[status] Work in progress</w:t>
       </w:r>
     </w:p>
     <w:p>
@@ -1536,7 +1977,7 @@
           <w:b/>
           <w:bCs/>
         </w:rPr>
-        <w:t xml:space="preserve">[Title] </w:t>
+        <w:t>[</w:t>
       </w:r>
       <w:r>
         <w:rPr>
@@ -1544,7 +1985,7 @@
           <w:b/>
           <w:bCs/>
         </w:rPr>
-        <w:t xml:space="preserve">Robustness and Replicability in Economics </w:t>
+        <w:t>title</w:t>
       </w:r>
       <w:r>
         <w:rPr>
@@ -1552,12 +1993,56 @@
           <w:b/>
           <w:bCs/>
         </w:rPr>
-        <w:t>(Research project)</w:t>
+        <w:t xml:space="preserve">] </w:t>
+      </w:r>
+      <w:r>
+        <w:rPr>
+          <w:rFonts w:ascii="Georgia" w:hAnsi="Georgia"/>
+          <w:b/>
+          <w:bCs/>
+        </w:rPr>
+        <w:t xml:space="preserve">Robustness and Replicability in Economics </w:t>
+      </w:r>
+      <w:r>
+        <w:rPr>
+          <w:rFonts w:ascii="Georgia" w:hAnsi="Georgia"/>
+          <w:b/>
+          <w:bCs/>
+        </w:rPr>
+        <w:t>(</w:t>
+      </w:r>
+      <w:r>
+        <w:rPr>
+          <w:rFonts w:ascii="Georgia" w:hAnsi="Georgia"/>
+          <w:b/>
+          <w:bCs/>
+        </w:rPr>
+        <w:t>Work in progress</w:t>
+      </w:r>
+      <w:r>
+        <w:rPr>
+          <w:rFonts w:ascii="Georgia" w:hAnsi="Georgia"/>
+          <w:b/>
+          <w:bCs/>
+        </w:rPr>
+        <w:t>)</w:t>
       </w:r>
     </w:p>
     <w:p>
       <w:r>
-        <w:t>[Project coordinators] Jörg</w:t>
+        <w:t>[</w:t>
+      </w:r>
+      <w:r>
+        <w:t>authors</w:t>
+      </w:r>
+      <w:r>
+        <w:t xml:space="preserve">] </w:t>
+      </w:r>
+      <w:r>
+        <w:t xml:space="preserve">Project coordinators: </w:t>
+      </w:r>
+      <w:r>
+        <w:t>Jörg</w:t>
       </w:r>
       <w:r>
         <w:t xml:space="preserve"> Ankel-Peters</w:t>
@@ -1573,6 +2058,11 @@
       </w:r>
       <w:r>
         <w:t>Julian Rose</w:t>
+      </w:r>
+    </w:p>
+    <w:p>
+      <w:r>
+        <w:t>[status] Work in progress</w:t>
       </w:r>
     </w:p>
     <w:p>
@@ -1635,7 +2125,6 @@
         <w:pStyle w:val="Heading1"/>
       </w:pPr>
       <w:r>
-        <w:lastRenderedPageBreak/>
         <w:t>4. CV page intro (optional)</w:t>
       </w:r>
     </w:p>
@@ -1645,7 +2134,23 @@
           <w:i/>
           <w:color w:val="808080"/>
         </w:rPr>
-        <w:t>Goes in: _pages/cv.md. One short line, or leave blank. The CV itself is the uploaded PDF.</w:t>
+        <w:t xml:space="preserve">Goes in: _pages/cv.md. One short </w:t>
+      </w:r>
+      <w:proofErr w:type="gramStart"/>
+      <w:r>
+        <w:rPr>
+          <w:i/>
+          <w:color w:val="808080"/>
+        </w:rPr>
+        <w:t>line, or</w:t>
+      </w:r>
+      <w:proofErr w:type="gramEnd"/>
+      <w:r>
+        <w:rPr>
+          <w:i/>
+          <w:color w:val="808080"/>
+        </w:rPr>
+        <w:t xml:space="preserve"> leave blank. The CV itself is the uploaded PDF.</w:t>
       </w:r>
     </w:p>
     <w:p>
@@ -2469,7 +2974,6 @@
   <w:style w:type="character" w:default="1" w:styleId="DefaultParagraphFont">
     <w:name w:val="Default Paragraph Font"/>
     <w:uiPriority w:val="1"/>
-    <w:semiHidden/>
     <w:unhideWhenUsed/>
   </w:style>
   <w:style w:type="table" w:default="1" w:styleId="TableNormal">

</xml_diff>

<commit_message>
Deploying to gh-pages from @ lukasmogge/lukasmogge.github.io@ae7801aa1a5060316d6562dafe5ab395bae3f25b 🚀
</commit_message>
<xml_diff>
--- a/content/website-texts.docx
+++ b/content/website-texts.docx
@@ -16,7 +16,23 @@
           <w:i/>
           <w:color w:val="808080"/>
         </w:rPr>
-        <w:t>Source of truth for all site prose. Rule: edit text HERE, then copy into the site files. Never edit prose directly in the site files (avoids drift). Keep this in your knowledge base; it is not part of the repo.</w:t>
+        <w:t xml:space="preserve">Source of truth for all site prose. Rule: edit text HERE, then </w:t>
+      </w:r>
+      <w:proofErr w:type="gramStart"/>
+      <w:r>
+        <w:rPr>
+          <w:i/>
+          <w:color w:val="808080"/>
+        </w:rPr>
+        <w:t>copy</w:t>
+      </w:r>
+      <w:proofErr w:type="gramEnd"/>
+      <w:r>
+        <w:rPr>
+          <w:i/>
+          <w:color w:val="808080"/>
+        </w:rPr>
+        <w:t xml:space="preserve"> into the site files. Never edit prose directly in the site files (avoids drift). Keep this in your knowledge base; it is not part of the repo.</w:t>
       </w:r>
     </w:p>
     <w:p>
@@ -44,7 +60,23 @@
         </w:rPr>
       </w:pPr>
       <w:r>
-        <w:t>I am an applied economist working in environmental and development economics. My research studies how households, governments and international and non-governmental organisations in low- and middle-income countries respond to environmental shocks. I combine (quasi-)experimental research designs with household survey, administrative and spatial data.</w:t>
+        <w:t xml:space="preserve">I am an applied economist working in environmental and development economics. My research studies how households, governments and international and non-governmental </w:t>
+      </w:r>
+      <w:proofErr w:type="spellStart"/>
+      <w:r>
+        <w:t>organisations</w:t>
+      </w:r>
+      <w:proofErr w:type="spellEnd"/>
+      <w:r>
+        <w:t xml:space="preserve"> in low- and middle-income countries respond to environmental shocks. I combine (quasi-)experimental research designs with household </w:t>
+      </w:r>
+      <w:proofErr w:type="gramStart"/>
+      <w:r>
+        <w:t>survey</w:t>
+      </w:r>
+      <w:proofErr w:type="gramEnd"/>
+      <w:r>
+        <w:t>, administrative and spatial data.</w:t>
       </w:r>
       <w:r>
         <w:t xml:space="preserve"> </w:t>
@@ -64,13 +96,29 @@
         <w:t xml:space="preserve"> (</w:t>
       </w:r>
       <w:r>
-        <w:t>Berlin Office), where I am part of the research group on "Climate Impacts and Adaptation" and the Policy Lab on "Climate Change, Development and Migration". I am a J-PAL Invited Researcher and an organi</w:t>
+        <w:t xml:space="preserve">Berlin Office), where I am part of the research group on "Climate Impacts and Adaptation" and the Policy Lab on "Climate Change, Development and Migration". I am a J-PAL Invited Researcher and an </w:t>
+      </w:r>
+      <w:proofErr w:type="spellStart"/>
+      <w:r>
+        <w:t>organi</w:t>
       </w:r>
       <w:r>
         <w:t>s</w:t>
       </w:r>
       <w:r>
-        <w:t>ing member of the Development Economics Network Berlin (DENeB)</w:t>
+        <w:t>ing</w:t>
+      </w:r>
+      <w:proofErr w:type="spellEnd"/>
+      <w:r>
+        <w:t xml:space="preserve"> member of the Development Economics Network Berlin (</w:t>
+      </w:r>
+      <w:proofErr w:type="spellStart"/>
+      <w:r>
+        <w:t>DENeB</w:t>
+      </w:r>
+      <w:proofErr w:type="spellEnd"/>
+      <w:r>
+        <w:t>)</w:t>
       </w:r>
       <w:r>
         <w:t>.</w:t>
@@ -85,7 +133,17 @@
     <w:p/>
     <w:p>
       <w:r>
-        <w:t>*Get in touch at lukas.mogge [@] rwi-essen.de*</w:t>
+        <w:t xml:space="preserve">*Get in touch at </w:t>
+      </w:r>
+      <w:proofErr w:type="spellStart"/>
+      <w:proofErr w:type="gramStart"/>
+      <w:r>
+        <w:t>lukas.mogge</w:t>
+      </w:r>
+      <w:proofErr w:type="spellEnd"/>
+      <w:proofErr w:type="gramEnd"/>
+      <w:r>
+        <w:t xml:space="preserve"> [@] rwi-essen.de*</w:t>
       </w:r>
     </w:p>
     <w:p>
@@ -108,7 +166,23 @@
           <w:i/>
           <w:color w:val="808080"/>
         </w:rPr>
-        <w:t>Goes in: _pages/research.md (optional intro prose). A sentence or two framing your research as a whole. Draft here:</w:t>
+        <w:t xml:space="preserve">Goes in: _pages/research.md (optional intro prose). A sentence or two framing your </w:t>
+      </w:r>
+      <w:proofErr w:type="gramStart"/>
+      <w:r>
+        <w:rPr>
+          <w:i/>
+          <w:color w:val="808080"/>
+        </w:rPr>
+        <w:t>research as a whole</w:t>
+      </w:r>
+      <w:proofErr w:type="gramEnd"/>
+      <w:r>
+        <w:rPr>
+          <w:i/>
+          <w:color w:val="808080"/>
+        </w:rPr>
+        <w:t>. Draft here:</w:t>
       </w:r>
     </w:p>
     <w:p>
@@ -136,7 +210,23 @@
           <w:i/>
           <w:color w:val="808080"/>
         </w:rPr>
-        <w:t>Goes in: one _projects/&lt;slug&gt;.md per piece. For each, draft title + body text. Group each under one topic. You decide how much text each gets.</w:t>
+        <w:t xml:space="preserve">Goes </w:t>
+      </w:r>
+      <w:proofErr w:type="gramStart"/>
+      <w:r>
+        <w:rPr>
+          <w:i/>
+          <w:color w:val="808080"/>
+        </w:rPr>
+        <w:t>in:</w:t>
+      </w:r>
+      <w:proofErr w:type="gramEnd"/>
+      <w:r>
+        <w:rPr>
+          <w:i/>
+          <w:color w:val="808080"/>
+        </w:rPr>
+        <w:t xml:space="preserve"> one _projects/&lt;slug&gt;.md per piece. For each, draft title + body text. Group each under one topic. You decide how much text each gets.</w:t>
       </w:r>
     </w:p>
     <w:p>
@@ -157,102 +247,147 @@
       </w:r>
     </w:p>
     <w:p>
-      <w:r>
-        <w:t xml:space="preserve">[With picture]: </w:t>
-      </w:r>
-      <w:r>
-        <w:t>assets/img/</w:t>
-      </w:r>
-      <w:r>
-        <w:t>IBLI_demand_2012_2022</w:t>
-      </w:r>
-      <w:r>
-        <w:t>.png</w:t>
+      <w:pPr>
+        <w:rPr>
+          <w:rFonts w:ascii="Georgia" w:hAnsi="Georgia"/>
+          <w:b/>
+          <w:bCs/>
+        </w:rPr>
+      </w:pPr>
+      <w:r>
+        <w:rPr>
+          <w:rFonts w:ascii="Georgia" w:hAnsi="Georgia"/>
+          <w:b/>
+          <w:bCs/>
+        </w:rPr>
+        <w:t>[</w:t>
+      </w:r>
+      <w:r>
+        <w:rPr>
+          <w:rFonts w:ascii="Georgia" w:hAnsi="Georgia"/>
+          <w:b/>
+          <w:bCs/>
+        </w:rPr>
+        <w:t>title</w:t>
+      </w:r>
+      <w:r>
+        <w:rPr>
+          <w:rFonts w:ascii="Georgia" w:hAnsi="Georgia"/>
+          <w:b/>
+          <w:bCs/>
+        </w:rPr>
+        <w:t xml:space="preserve">] </w:t>
+      </w:r>
+      <w:r>
+        <w:rPr>
+          <w:rFonts w:ascii="Georgia" w:hAnsi="Georgia"/>
+          <w:b/>
+          <w:bCs/>
+        </w:rPr>
+        <w:t>Perception and protection: The effect of risk exposure on demand for index insurance in Mongolia (202</w:t>
+      </w:r>
+      <w:r>
+        <w:rPr>
+          <w:rFonts w:ascii="Georgia" w:hAnsi="Georgia"/>
+          <w:b/>
+          <w:bCs/>
+        </w:rPr>
+        <w:t>5</w:t>
+      </w:r>
+      <w:r>
+        <w:rPr>
+          <w:rFonts w:ascii="Georgia" w:hAnsi="Georgia"/>
+          <w:b/>
+          <w:bCs/>
+        </w:rPr>
+        <w:t>)</w:t>
       </w:r>
     </w:p>
     <w:p>
       <w:pPr>
         <w:rPr>
           <w:rFonts w:ascii="Georgia" w:hAnsi="Georgia"/>
-          <w:b/>
-          <w:bCs/>
         </w:rPr>
       </w:pPr>
       <w:r>
         <w:rPr>
           <w:rFonts w:ascii="Georgia" w:hAnsi="Georgia"/>
-          <w:b/>
-          <w:bCs/>
-        </w:rPr>
-        <w:t xml:space="preserve">[Title] </w:t>
-      </w:r>
-      <w:r>
-        <w:rPr>
-          <w:rFonts w:ascii="Georgia" w:hAnsi="Georgia"/>
-          <w:b/>
-          <w:bCs/>
-        </w:rPr>
-        <w:t>Perception and protection: The effect of risk exposure on demand for index insurance in Mongolia (202</w:t>
-      </w:r>
-      <w:r>
-        <w:rPr>
-          <w:rFonts w:ascii="Georgia" w:hAnsi="Georgia"/>
-          <w:b/>
-          <w:bCs/>
-        </w:rPr>
-        <w:t>5</w:t>
-      </w:r>
-      <w:r>
-        <w:rPr>
-          <w:rFonts w:ascii="Georgia" w:hAnsi="Georgia"/>
-          <w:b/>
-          <w:bCs/>
-        </w:rPr>
-        <w:t>)</w:t>
+        </w:rPr>
+        <w:t xml:space="preserve">[authors] </w:t>
+      </w:r>
+      <w:r>
+        <w:rPr>
+          <w:rFonts w:ascii="Georgia" w:hAnsi="Georgia"/>
+        </w:rPr>
+        <w:t>With Kati Kraehnert</w:t>
       </w:r>
     </w:p>
     <w:p>
       <w:pPr>
         <w:rPr>
           <w:rFonts w:ascii="Georgia" w:hAnsi="Georgia"/>
+          <w:i/>
+          <w:iCs/>
         </w:rPr>
       </w:pPr>
       <w:r>
         <w:rPr>
           <w:rFonts w:ascii="Georgia" w:hAnsi="Georgia"/>
-        </w:rPr>
-        <w:t xml:space="preserve">[Co-authors] </w:t>
-      </w:r>
-      <w:r>
-        <w:rPr>
-          <w:rFonts w:ascii="Georgia" w:hAnsi="Georgia"/>
-        </w:rPr>
-        <w:t>With Kati Kraehnert</w:t>
+          <w:i/>
+          <w:iCs/>
+        </w:rPr>
+        <w:t>[</w:t>
+      </w:r>
+      <w:r>
+        <w:rPr>
+          <w:rFonts w:ascii="Georgia" w:hAnsi="Georgia"/>
+          <w:i/>
+          <w:iCs/>
+        </w:rPr>
+        <w:t>journal</w:t>
+      </w:r>
+      <w:r>
+        <w:rPr>
+          <w:rFonts w:ascii="Georgia" w:hAnsi="Georgia"/>
+          <w:i/>
+          <w:iCs/>
+        </w:rPr>
+        <w:t xml:space="preserve">] </w:t>
+      </w:r>
+      <w:r>
+        <w:rPr>
+          <w:rFonts w:ascii="Georgia" w:hAnsi="Georgia"/>
+          <w:i/>
+          <w:iCs/>
+        </w:rPr>
+        <w:t xml:space="preserve">Journal of Environmental Economics and Management </w:t>
       </w:r>
     </w:p>
     <w:p>
-      <w:pPr>
-        <w:rPr>
-          <w:rFonts w:ascii="Georgia" w:hAnsi="Georgia"/>
-          <w:i/>
-          <w:iCs/>
-        </w:rPr>
-      </w:pPr>
-      <w:r>
-        <w:rPr>
-          <w:rFonts w:ascii="Georgia" w:hAnsi="Georgia"/>
-          <w:i/>
-          <w:iCs/>
-        </w:rPr>
-        <w:t xml:space="preserve">[Journal] </w:t>
-      </w:r>
-      <w:r>
-        <w:rPr>
-          <w:rFonts w:ascii="Georgia" w:hAnsi="Georgia"/>
-          <w:i/>
-          <w:iCs/>
-        </w:rPr>
-        <w:t xml:space="preserve">Journal of Environmental Economics and Management </w:t>
+      <w:r>
+        <w:t>[</w:t>
+      </w:r>
+      <w:proofErr w:type="spellStart"/>
+      <w:r>
+        <w:t>img</w:t>
+      </w:r>
+      <w:proofErr w:type="spellEnd"/>
+      <w:r>
+        <w:t>]: assets/</w:t>
+      </w:r>
+      <w:proofErr w:type="spellStart"/>
+      <w:r>
+        <w:t>img</w:t>
+      </w:r>
+      <w:proofErr w:type="spellEnd"/>
+      <w:r>
+        <w:t>/</w:t>
+      </w:r>
+      <w:r>
+        <w:t>IBLI_demand_2012_2022</w:t>
+      </w:r>
+      <w:r>
+        <w:t>.png</w:t>
       </w:r>
     </w:p>
     <w:p>
@@ -296,7 +431,15 @@
         <w:t xml:space="preserve"> and</w:t>
       </w:r>
       <w:r>
-        <w:t xml:space="preserve"> spanning eleven years. Results indicate that demand for index insurance increases in areas exposed to adverse winter conditions during the insurance sales period, when pastoralists have to decide about </w:t>
+        <w:t xml:space="preserve"> spanning eleven years. Results indicate that demand for index insurance increases in areas exposed to adverse winter conditions during the insurance sales period, when pastoralists </w:t>
+      </w:r>
+      <w:proofErr w:type="gramStart"/>
+      <w:r>
+        <w:t>have to</w:t>
+      </w:r>
+      <w:proofErr w:type="gramEnd"/>
+      <w:r>
+        <w:t xml:space="preserve"> decide about </w:t>
       </w:r>
       <w:r>
         <w:t>buying</w:t>
@@ -352,7 +495,7 @@
           <w:b/>
           <w:bCs/>
         </w:rPr>
-        <w:t xml:space="preserve">[Title] </w:t>
+        <w:t>[</w:t>
       </w:r>
       <w:r>
         <w:rPr>
@@ -360,18 +503,23 @@
           <w:b/>
           <w:bCs/>
         </w:rPr>
+        <w:t>title</w:t>
+      </w:r>
+      <w:r>
+        <w:rPr>
+          <w:rFonts w:ascii="Georgia" w:hAnsi="Georgia"/>
+          <w:b/>
+          <w:bCs/>
+        </w:rPr>
+        <w:t xml:space="preserve">] </w:t>
+      </w:r>
+      <w:r>
+        <w:rPr>
+          <w:rFonts w:ascii="Georgia" w:hAnsi="Georgia"/>
+          <w:b/>
+          <w:bCs/>
+        </w:rPr>
         <w:t>Anticipatory cash transfers in the context of weather disasters (2025)</w:t>
-      </w:r>
-    </w:p>
-    <w:p>
-      <w:r>
-        <w:t>[With picture]: assets/img/</w:t>
-      </w:r>
-      <w:r>
-        <w:t>dzud_risk_map_2021</w:t>
-      </w:r>
-      <w:r>
-        <w:t>.png</w:t>
       </w:r>
     </w:p>
     <w:p>
@@ -384,7 +532,7 @@
         <w:rPr>
           <w:rFonts w:ascii="Georgia" w:hAnsi="Georgia"/>
         </w:rPr>
-        <w:t xml:space="preserve">[Co-authors] </w:t>
+        <w:t xml:space="preserve">[authors] </w:t>
       </w:r>
       <w:r>
         <w:rPr>
@@ -407,7 +555,7 @@
           <w:i/>
           <w:iCs/>
         </w:rPr>
-        <w:t xml:space="preserve">[Journal] </w:t>
+        <w:t>[</w:t>
       </w:r>
       <w:r>
         <w:rPr>
@@ -415,7 +563,50 @@
           <w:i/>
           <w:iCs/>
         </w:rPr>
+        <w:t>j</w:t>
+      </w:r>
+      <w:r>
+        <w:rPr>
+          <w:rFonts w:ascii="Georgia" w:hAnsi="Georgia"/>
+          <w:i/>
+          <w:iCs/>
+        </w:rPr>
+        <w:t xml:space="preserve">ournal] </w:t>
+      </w:r>
+      <w:r>
+        <w:rPr>
+          <w:rFonts w:ascii="Georgia" w:hAnsi="Georgia"/>
+          <w:i/>
+          <w:iCs/>
+        </w:rPr>
         <w:t>Journal of the Association of Environmental and Resource Economists</w:t>
+      </w:r>
+    </w:p>
+    <w:p>
+      <w:r>
+        <w:t>[</w:t>
+      </w:r>
+      <w:proofErr w:type="spellStart"/>
+      <w:r>
+        <w:t>img</w:t>
+      </w:r>
+      <w:proofErr w:type="spellEnd"/>
+      <w:r>
+        <w:t>]: assets/</w:t>
+      </w:r>
+      <w:proofErr w:type="spellStart"/>
+      <w:r>
+        <w:t>img</w:t>
+      </w:r>
+      <w:proofErr w:type="spellEnd"/>
+      <w:r>
+        <w:t>/</w:t>
+      </w:r>
+      <w:r>
+        <w:t>dzud_risk_map_2021</w:t>
+      </w:r>
+      <w:r>
+        <w:t>.png</w:t>
       </w:r>
     </w:p>
     <w:p>
@@ -498,7 +689,7 @@
           <w:b/>
           <w:bCs/>
         </w:rPr>
-        <w:t xml:space="preserve">[Title] </w:t>
+        <w:t>[</w:t>
       </w:r>
       <w:r>
         <w:rPr>
@@ -506,7 +697,7 @@
           <w:b/>
           <w:bCs/>
         </w:rPr>
-        <w:t>Charity hazard in climate adaptation: The effect of anticipatory cash transfers on demand for weather insurance</w:t>
+        <w:t>title</w:t>
       </w:r>
       <w:r>
         <w:rPr>
@@ -514,7 +705,23 @@
           <w:b/>
           <w:bCs/>
         </w:rPr>
-        <w:t xml:space="preserve"> (Working Paper)</w:t>
+        <w:t xml:space="preserve">] </w:t>
+      </w:r>
+      <w:r>
+        <w:rPr>
+          <w:rFonts w:ascii="Georgia" w:hAnsi="Georgia"/>
+          <w:b/>
+          <w:bCs/>
+        </w:rPr>
+        <w:t>Charity hazard in climate adaptation: The effect of anticipatory cash transfers on demand for weather insurance</w:t>
+      </w:r>
+      <w:r>
+        <w:rPr>
+          <w:rFonts w:ascii="Georgia" w:hAnsi="Georgia"/>
+          <w:b/>
+          <w:bCs/>
+        </w:rPr>
+        <w:t xml:space="preserve"> </w:t>
       </w:r>
     </w:p>
     <w:p>
@@ -527,7 +734,7 @@
         <w:rPr>
           <w:rFonts w:ascii="Georgia" w:hAnsi="Georgia"/>
         </w:rPr>
-        <w:t xml:space="preserve">[Co-authors] </w:t>
+        <w:t xml:space="preserve">[authors] </w:t>
       </w:r>
       <w:r>
         <w:rPr>
@@ -562,7 +769,31 @@
           <w:i/>
           <w:iCs/>
         </w:rPr>
-        <w:t>[Journal] [N/A]</w:t>
+        <w:t>[</w:t>
+      </w:r>
+      <w:r>
+        <w:rPr>
+          <w:rFonts w:ascii="Georgia" w:hAnsi="Georgia"/>
+          <w:i/>
+          <w:iCs/>
+        </w:rPr>
+        <w:t>status</w:t>
+      </w:r>
+      <w:r>
+        <w:rPr>
+          <w:rFonts w:ascii="Georgia" w:hAnsi="Georgia"/>
+          <w:i/>
+          <w:iCs/>
+        </w:rPr>
+        <w:t xml:space="preserve">] </w:t>
+      </w:r>
+      <w:r>
+        <w:rPr>
+          <w:rFonts w:ascii="Georgia" w:hAnsi="Georgia"/>
+          <w:i/>
+          <w:iCs/>
+        </w:rPr>
+        <w:t>Working paper</w:t>
       </w:r>
     </w:p>
     <w:p>
@@ -576,7 +807,15 @@
         <w:t xml:space="preserve">receiving </w:t>
       </w:r>
       <w:r>
-        <w:t>anticipatory cash transfers crowds out demand for index-based livestock insurance in Mongolia, using a randomized cash transfer experiment during an extreme winter and linking household panel survey with insurance customer data. We find no evidence of charity hazard and can rule out large negative effects on insurance demand. Treatment effects differ by prior insurance experience. While previously uninsured households show no significant response, households with insurance experience are more likely to purchase insurance after the cash transfer. Our results suggest that, in contexts with incomplete assistance and established index insurance, anticipatory assistance need not undermine insurance demand.</w:t>
+        <w:t xml:space="preserve">anticipatory cash transfers crowds out demand for index-based livestock insurance in Mongolia, using a randomized cash transfer experiment during an extreme winter and linking household panel survey with insurance customer data. We find no evidence of charity hazard and can rule out large negative effects on insurance demand. Treatment effects differ </w:t>
+      </w:r>
+      <w:proofErr w:type="gramStart"/>
+      <w:r>
+        <w:t>by</w:t>
+      </w:r>
+      <w:proofErr w:type="gramEnd"/>
+      <w:r>
+        <w:t xml:space="preserve"> prior insurance experience. While previously uninsured households show no significant response, households with insurance experience are more likely to purchase insurance after the cash transfer. Our results suggest that, in contexts with incomplete assistance and established index insurance, anticipatory assistance need not undermine insurance demand.</w:t>
       </w:r>
     </w:p>
     <w:p>
@@ -617,7 +856,23 @@
           <w:b/>
           <w:bCs/>
         </w:rPr>
-        <w:t xml:space="preserve">[Title] </w:t>
+        <w:t>[</w:t>
+      </w:r>
+      <w:r>
+        <w:rPr>
+          <w:rFonts w:ascii="Georgia" w:hAnsi="Georgia"/>
+          <w:b/>
+          <w:bCs/>
+        </w:rPr>
+        <w:t>title</w:t>
+      </w:r>
+      <w:r>
+        <w:rPr>
+          <w:rFonts w:ascii="Georgia" w:hAnsi="Georgia"/>
+          <w:b/>
+          <w:bCs/>
+        </w:rPr>
+        <w:t xml:space="preserve">] </w:t>
       </w:r>
       <w:r>
         <w:rPr>
@@ -662,7 +917,7 @@
         <w:rPr>
           <w:rFonts w:ascii="Georgia" w:hAnsi="Georgia"/>
         </w:rPr>
-        <w:t xml:space="preserve">[Co-authors] With </w:t>
+        <w:t xml:space="preserve">[authors] With </w:t>
       </w:r>
       <w:r>
         <w:rPr>
@@ -712,12 +967,28 @@
         </w:rPr>
         <w:t xml:space="preserve">, </w:t>
       </w:r>
-      <w:r>
-        <w:rPr>
-          <w:rFonts w:ascii="Georgia" w:hAnsi="Georgia"/>
-        </w:rPr>
-        <w:t>Edzer Pebesma</w:t>
-      </w:r>
+      <w:proofErr w:type="spellStart"/>
+      <w:r>
+        <w:rPr>
+          <w:rFonts w:ascii="Georgia" w:hAnsi="Georgia"/>
+        </w:rPr>
+        <w:t>Edzer</w:t>
+      </w:r>
+      <w:proofErr w:type="spellEnd"/>
+      <w:r>
+        <w:rPr>
+          <w:rFonts w:ascii="Georgia" w:hAnsi="Georgia"/>
+        </w:rPr>
+        <w:t xml:space="preserve"> </w:t>
+      </w:r>
+      <w:proofErr w:type="spellStart"/>
+      <w:r>
+        <w:rPr>
+          <w:rFonts w:ascii="Georgia" w:hAnsi="Georgia"/>
+        </w:rPr>
+        <w:t>Pebesma</w:t>
+      </w:r>
+      <w:proofErr w:type="spellEnd"/>
       <w:r>
         <w:rPr>
           <w:rFonts w:ascii="Georgia" w:hAnsi="Georgia"/>
@@ -803,7 +1074,7 @@
           <w:b/>
           <w:bCs/>
         </w:rPr>
-        <w:t xml:space="preserve">[Title] </w:t>
+        <w:t>[</w:t>
       </w:r>
       <w:r>
         <w:rPr>
@@ -811,7 +1082,7 @@
           <w:b/>
           <w:bCs/>
         </w:rPr>
-        <w:t xml:space="preserve">Stated and </w:t>
+        <w:t>title</w:t>
       </w:r>
       <w:r>
         <w:rPr>
@@ -819,7 +1090,7 @@
           <w:b/>
           <w:bCs/>
         </w:rPr>
-        <w:t>r</w:t>
+        <w:t xml:space="preserve">] </w:t>
       </w:r>
       <w:r>
         <w:rPr>
@@ -827,7 +1098,7 @@
           <w:b/>
           <w:bCs/>
         </w:rPr>
-        <w:t xml:space="preserve">ealized </w:t>
+        <w:t xml:space="preserve">Stated and </w:t>
       </w:r>
       <w:r>
         <w:rPr>
@@ -835,7 +1106,7 @@
           <w:b/>
           <w:bCs/>
         </w:rPr>
-        <w:t>d</w:t>
+        <w:t>r</w:t>
       </w:r>
       <w:r>
         <w:rPr>
@@ -843,7 +1114,7 @@
           <w:b/>
           <w:bCs/>
         </w:rPr>
-        <w:t xml:space="preserve">emand for </w:t>
+        <w:t xml:space="preserve">ealized </w:t>
       </w:r>
       <w:r>
         <w:rPr>
@@ -851,7 +1122,7 @@
           <w:b/>
           <w:bCs/>
         </w:rPr>
-        <w:t>p</w:t>
+        <w:t>d</w:t>
       </w:r>
       <w:r>
         <w:rPr>
@@ -859,7 +1130,7 @@
           <w:b/>
           <w:bCs/>
         </w:rPr>
-        <w:t xml:space="preserve">arametric </w:t>
+        <w:t xml:space="preserve">emand for </w:t>
       </w:r>
       <w:r>
         <w:rPr>
@@ -867,7 +1138,7 @@
           <w:b/>
           <w:bCs/>
         </w:rPr>
-        <w:t>r</w:t>
+        <w:t>p</w:t>
       </w:r>
       <w:r>
         <w:rPr>
@@ -875,7 +1146,7 @@
           <w:b/>
           <w:bCs/>
         </w:rPr>
-        <w:t xml:space="preserve">ainfall </w:t>
+        <w:t xml:space="preserve">arametric </w:t>
       </w:r>
       <w:r>
         <w:rPr>
@@ -883,7 +1154,7 @@
           <w:b/>
           <w:bCs/>
         </w:rPr>
-        <w:t>i</w:t>
+        <w:t>r</w:t>
       </w:r>
       <w:r>
         <w:rPr>
@@ -891,7 +1162,7 @@
           <w:b/>
           <w:bCs/>
         </w:rPr>
-        <w:t xml:space="preserve">nsurance </w:t>
+        <w:t xml:space="preserve">ainfall </w:t>
       </w:r>
       <w:r>
         <w:rPr>
@@ -899,7 +1170,7 @@
           <w:b/>
           <w:bCs/>
         </w:rPr>
-        <w:t>a</w:t>
+        <w:t>i</w:t>
       </w:r>
       <w:r>
         <w:rPr>
@@ -907,7 +1178,7 @@
           <w:b/>
           <w:bCs/>
         </w:rPr>
-        <w:t xml:space="preserve">mong </w:t>
+        <w:t xml:space="preserve">nsurance </w:t>
       </w:r>
       <w:r>
         <w:rPr>
@@ -915,7 +1186,7 @@
           <w:b/>
           <w:bCs/>
         </w:rPr>
-        <w:t>r</w:t>
+        <w:t>a</w:t>
       </w:r>
       <w:r>
         <w:rPr>
@@ -923,7 +1194,7 @@
           <w:b/>
           <w:bCs/>
         </w:rPr>
-        <w:t xml:space="preserve">ice </w:t>
+        <w:t xml:space="preserve">mong </w:t>
       </w:r>
       <w:r>
         <w:rPr>
@@ -931,7 +1202,7 @@
           <w:b/>
           <w:bCs/>
         </w:rPr>
-        <w:t>f</w:t>
+        <w:t>r</w:t>
       </w:r>
       <w:r>
         <w:rPr>
@@ -939,7 +1210,7 @@
           <w:b/>
           <w:bCs/>
         </w:rPr>
-        <w:t xml:space="preserve">armers in Vietnam </w:t>
+        <w:t xml:space="preserve">ice </w:t>
       </w:r>
       <w:r>
         <w:rPr>
@@ -947,7 +1218,15 @@
           <w:b/>
           <w:bCs/>
         </w:rPr>
-        <w:t>(Working Paper)</w:t>
+        <w:t>f</w:t>
+      </w:r>
+      <w:r>
+        <w:rPr>
+          <w:rFonts w:ascii="Georgia" w:hAnsi="Georgia"/>
+          <w:b/>
+          <w:bCs/>
+        </w:rPr>
+        <w:t>armers in Vietnam</w:t>
       </w:r>
     </w:p>
     <w:p>
@@ -960,7 +1239,7 @@
         <w:rPr>
           <w:rFonts w:ascii="Georgia" w:hAnsi="Georgia"/>
         </w:rPr>
-        <w:t xml:space="preserve">[Co-authors] </w:t>
+        <w:t xml:space="preserve">[authors] </w:t>
       </w:r>
       <w:r>
         <w:rPr>
@@ -1019,7 +1298,7 @@
           <w:i/>
           <w:iCs/>
         </w:rPr>
-        <w:t xml:space="preserve">[Journal] </w:t>
+        <w:t>[</w:t>
       </w:r>
       <w:r>
         <w:rPr>
@@ -1027,6 +1306,30 @@
           <w:i/>
           <w:iCs/>
         </w:rPr>
+        <w:t>Status</w:t>
+      </w:r>
+      <w:r>
+        <w:rPr>
+          <w:rFonts w:ascii="Georgia" w:hAnsi="Georgia"/>
+          <w:i/>
+          <w:iCs/>
+        </w:rPr>
+        <w:t>]</w:t>
+      </w:r>
+      <w:r>
+        <w:rPr>
+          <w:rFonts w:ascii="Georgia" w:hAnsi="Georgia"/>
+          <w:i/>
+          <w:iCs/>
+        </w:rPr>
+        <w:t xml:space="preserve"> </w:t>
+      </w:r>
+      <w:r>
+        <w:rPr>
+          <w:rFonts w:ascii="Georgia" w:hAnsi="Georgia"/>
+          <w:i/>
+          <w:iCs/>
+        </w:rPr>
         <w:t>Under review at Geneva Papers on Risk and Insurance - Issues and Practice</w:t>
       </w:r>
     </w:p>
@@ -1041,7 +1344,23 @@
         <w:t xml:space="preserve">. </w:t>
       </w:r>
       <w:r>
-        <w:t>Using a household survey of 3,000 rice-farming households, we elicit willingness to pay: 33% of respondents report a WTP of at least half the market price, and 18% report a WTP equal to or higher than the market price. Yet when insurance agents offered the product at a subsidized price below respondents’ stated WTP, no respondent purchased it. We discuss mechanisms that may explain this discrepancy between stated and realized demand, including limited incentive compatibility of the WTP elicitation mechanism, changes in valuations, and contextual barriers to insurance adoption.</w:t>
+        <w:t xml:space="preserve">Using a household survey of 3,000 rice-farming households, we elicit willingness to pay: 33% of respondents report a WTP of at least half the market price, and 18% report a WTP equal to or higher than the market price. Yet when insurance agents offered the product at a subsidized price below </w:t>
+      </w:r>
+      <w:proofErr w:type="gramStart"/>
+      <w:r>
+        <w:t>respondents’</w:t>
+      </w:r>
+      <w:proofErr w:type="gramEnd"/>
+      <w:r>
+        <w:t xml:space="preserve"> stated WTP, no respondent purchased it. We </w:t>
+      </w:r>
+      <w:proofErr w:type="gramStart"/>
+      <w:r>
+        <w:t>discuss</w:t>
+      </w:r>
+      <w:proofErr w:type="gramEnd"/>
+      <w:r>
+        <w:t xml:space="preserve"> mechanisms that may explain this discrepancy between stated and realized demand, including limited incentive compatibility of the WTP elicitation mechanism, changes in valuations, and contextual barriers to insurance adoption.</w:t>
       </w:r>
     </w:p>
     <w:p>
@@ -1091,7 +1410,7 @@
           <w:b/>
           <w:bCs/>
         </w:rPr>
-        <w:t xml:space="preserve">[Title] </w:t>
+        <w:t>[</w:t>
       </w:r>
       <w:r>
         <w:rPr>
@@ -1099,7 +1418,7 @@
           <w:b/>
           <w:bCs/>
         </w:rPr>
-        <w:t>Heat and violence against children</w:t>
+        <w:t>title</w:t>
       </w:r>
       <w:r>
         <w:rPr>
@@ -1107,7 +1426,7 @@
           <w:b/>
           <w:bCs/>
         </w:rPr>
-        <w:t xml:space="preserve"> in schools and homes</w:t>
+        <w:t xml:space="preserve">] </w:t>
       </w:r>
       <w:r>
         <w:rPr>
@@ -1115,7 +1434,7 @@
           <w:b/>
           <w:bCs/>
         </w:rPr>
-        <w:t xml:space="preserve"> </w:t>
+        <w:t>Heat and violence against children</w:t>
       </w:r>
       <w:r>
         <w:rPr>
@@ -1123,7 +1442,15 @@
           <w:b/>
           <w:bCs/>
         </w:rPr>
-        <w:t>(Work in progress)</w:t>
+        <w:t xml:space="preserve"> in schools and homes</w:t>
+      </w:r>
+      <w:r>
+        <w:rPr>
+          <w:rFonts w:ascii="Georgia" w:hAnsi="Georgia"/>
+          <w:b/>
+          <w:bCs/>
+        </w:rPr>
+        <w:t xml:space="preserve"> </w:t>
       </w:r>
     </w:p>
     <w:p>
@@ -1136,7 +1463,7 @@
         <w:rPr>
           <w:rFonts w:ascii="Georgia" w:hAnsi="Georgia"/>
         </w:rPr>
-        <w:t xml:space="preserve">[Co-authors] </w:t>
+        <w:t xml:space="preserve">[authors] </w:t>
       </w:r>
       <w:r>
         <w:rPr>
@@ -1177,7 +1504,31 @@
           <w:i/>
           <w:iCs/>
         </w:rPr>
-        <w:t>[Journal] [N/A</w:t>
+        <w:t>[</w:t>
+      </w:r>
+      <w:r>
+        <w:rPr>
+          <w:rFonts w:ascii="Georgia" w:hAnsi="Georgia"/>
+          <w:i/>
+          <w:iCs/>
+        </w:rPr>
+        <w:t>status</w:t>
+      </w:r>
+      <w:r>
+        <w:rPr>
+          <w:rFonts w:ascii="Georgia" w:hAnsi="Georgia"/>
+          <w:i/>
+          <w:iCs/>
+        </w:rPr>
+        <w:t>] [</w:t>
+      </w:r>
+      <w:r>
+        <w:rPr>
+          <w:rFonts w:ascii="Georgia" w:hAnsi="Georgia"/>
+          <w:i/>
+          <w:iCs/>
+        </w:rPr>
+        <w:t>Work in progress</w:t>
       </w:r>
       <w:r>
         <w:rPr>
@@ -1209,13 +1560,21 @@
         <w:t xml:space="preserve">Topic: </w:t>
       </w:r>
       <w:r>
-        <w:t>Meta Science and many</w:t>
+        <w:t xml:space="preserve">Meta Science and </w:t>
+      </w:r>
+      <w:proofErr w:type="gramStart"/>
+      <w:r>
+        <w:t>many</w:t>
       </w:r>
       <w:r>
         <w:t>-</w:t>
       </w:r>
       <w:r>
-        <w:t>researcher projects</w:t>
+        <w:t>researcher</w:t>
+      </w:r>
+      <w:proofErr w:type="gramEnd"/>
+      <w:r>
+        <w:t xml:space="preserve"> projects</w:t>
       </w:r>
     </w:p>
     <w:p>
@@ -1249,7 +1608,7 @@
           <w:b/>
           <w:bCs/>
         </w:rPr>
-        <w:t xml:space="preserve">[Title] </w:t>
+        <w:t>[</w:t>
       </w:r>
       <w:r>
         <w:rPr>
@@ -1257,7 +1616,7 @@
           <w:b/>
           <w:bCs/>
         </w:rPr>
-        <w:t xml:space="preserve">The </w:t>
+        <w:t>title</w:t>
       </w:r>
       <w:r>
         <w:rPr>
@@ -1265,23 +1624,25 @@
           <w:b/>
           <w:bCs/>
         </w:rPr>
-        <w:t>s</w:t>
-      </w:r>
+        <w:t xml:space="preserve">] </w:t>
+      </w:r>
+      <w:proofErr w:type="gramStart"/>
       <w:r>
         <w:rPr>
           <w:rFonts w:ascii="Georgia" w:hAnsi="Georgia"/>
           <w:b/>
           <w:bCs/>
         </w:rPr>
-        <w:t xml:space="preserve">ources of </w:t>
-      </w:r>
+        <w:t>The</w:t>
+      </w:r>
+      <w:proofErr w:type="gramEnd"/>
       <w:r>
         <w:rPr>
           <w:rFonts w:ascii="Georgia" w:hAnsi="Georgia"/>
           <w:b/>
           <w:bCs/>
         </w:rPr>
-        <w:t>r</w:t>
+        <w:t xml:space="preserve"> </w:t>
       </w:r>
       <w:r>
         <w:rPr>
@@ -1289,7 +1650,7 @@
           <w:b/>
           <w:bCs/>
         </w:rPr>
-        <w:t xml:space="preserve">esearcher </w:t>
+        <w:t>s</w:t>
       </w:r>
       <w:r>
         <w:rPr>
@@ -1297,7 +1658,7 @@
           <w:b/>
           <w:bCs/>
         </w:rPr>
-        <w:t>v</w:t>
+        <w:t xml:space="preserve">ources of </w:t>
       </w:r>
       <w:r>
         <w:rPr>
@@ -1305,7 +1666,7 @@
           <w:b/>
           <w:bCs/>
         </w:rPr>
-        <w:t xml:space="preserve">ariation in </w:t>
+        <w:t>r</w:t>
       </w:r>
       <w:r>
         <w:rPr>
@@ -1313,7 +1674,7 @@
           <w:b/>
           <w:bCs/>
         </w:rPr>
-        <w:t>E</w:t>
+        <w:t xml:space="preserve">esearcher </w:t>
       </w:r>
       <w:r>
         <w:rPr>
@@ -1321,7 +1682,7 @@
           <w:b/>
           <w:bCs/>
         </w:rPr>
-        <w:t xml:space="preserve">conomics </w:t>
+        <w:t>v</w:t>
       </w:r>
       <w:r>
         <w:rPr>
@@ -1329,7 +1690,23 @@
           <w:b/>
           <w:bCs/>
         </w:rPr>
-        <w:t>(Working Paper)</w:t>
+        <w:t xml:space="preserve">ariation in </w:t>
+      </w:r>
+      <w:r>
+        <w:rPr>
+          <w:rFonts w:ascii="Georgia" w:hAnsi="Georgia"/>
+          <w:b/>
+          <w:bCs/>
+        </w:rPr>
+        <w:t>E</w:t>
+      </w:r>
+      <w:r>
+        <w:rPr>
+          <w:rFonts w:ascii="Georgia" w:hAnsi="Georgia"/>
+          <w:b/>
+          <w:bCs/>
+        </w:rPr>
+        <w:t>conomics</w:t>
       </w:r>
     </w:p>
     <w:p>
@@ -1342,7 +1719,7 @@
         <w:rPr>
           <w:rFonts w:ascii="Georgia" w:hAnsi="Georgia"/>
         </w:rPr>
-        <w:t xml:space="preserve">[Co-authors] </w:t>
+        <w:t xml:space="preserve">[authors] </w:t>
       </w:r>
       <w:r>
         <w:rPr>
@@ -1383,7 +1760,23 @@
           <w:i/>
           <w:iCs/>
         </w:rPr>
-        <w:t>[Journal] Accepted</w:t>
+        <w:t>[</w:t>
+      </w:r>
+      <w:r>
+        <w:rPr>
+          <w:rFonts w:ascii="Georgia" w:hAnsi="Georgia"/>
+          <w:i/>
+          <w:iCs/>
+        </w:rPr>
+        <w:t>status</w:t>
+      </w:r>
+      <w:r>
+        <w:rPr>
+          <w:rFonts w:ascii="Georgia" w:hAnsi="Georgia"/>
+          <w:i/>
+          <w:iCs/>
+        </w:rPr>
+        <w:t>] Accepted</w:t>
       </w:r>
       <w:r>
         <w:rPr>
@@ -1450,15 +1843,63 @@
           <w:b/>
           <w:bCs/>
         </w:rPr>
-        <w:t>[Title] #ManyDaughters (Research project)</w:t>
+        <w:t>[</w:t>
+      </w:r>
+      <w:proofErr w:type="gramStart"/>
+      <w:r>
+        <w:rPr>
+          <w:rFonts w:ascii="Georgia" w:hAnsi="Georgia"/>
+          <w:b/>
+          <w:bCs/>
+        </w:rPr>
+        <w:t>title</w:t>
+      </w:r>
+      <w:r>
+        <w:rPr>
+          <w:rFonts w:ascii="Georgia" w:hAnsi="Georgia"/>
+          <w:b/>
+          <w:bCs/>
+        </w:rPr>
+        <w:t>] #</w:t>
+      </w:r>
+      <w:proofErr w:type="gramEnd"/>
+      <w:r>
+        <w:rPr>
+          <w:rFonts w:ascii="Georgia" w:hAnsi="Georgia"/>
+          <w:b/>
+          <w:bCs/>
+        </w:rPr>
+        <w:t xml:space="preserve">ManyDaughters </w:t>
       </w:r>
     </w:p>
     <w:p>
       <w:r>
-        <w:t xml:space="preserve">[Project coordinators] </w:t>
-      </w:r>
-      <w:r>
-        <w:t>David Albrecht, Aurélien Baillon, Anna Dreber, Felix Holzmeister, Taisuke Imai, Magnus Johannesson, Levent Neyse, Severine Toussaert</w:t>
+        <w:t>[</w:t>
+      </w:r>
+      <w:r>
+        <w:t>authors</w:t>
+      </w:r>
+      <w:r>
+        <w:t>]</w:t>
+      </w:r>
+      <w:r>
+        <w:t xml:space="preserve"> Project coordinators:</w:t>
+      </w:r>
+      <w:r>
+        <w:t xml:space="preserve"> </w:t>
+      </w:r>
+      <w:r>
+        <w:t xml:space="preserve">David Albrecht, Aurélien Baillon, Anna Dreber, Felix Holzmeister, Taisuke Imai, Magnus Johannesson, Levent Neyse, Severine </w:t>
+      </w:r>
+      <w:proofErr w:type="spellStart"/>
+      <w:r>
+        <w:t>Toussaert</w:t>
+      </w:r>
+      <w:proofErr w:type="spellEnd"/>
+    </w:p>
+    <w:p>
+      <w:r>
+        <w:t>[status] Work in progress</w:t>
       </w:r>
     </w:p>
     <w:p>
@@ -1536,7 +1977,7 @@
           <w:b/>
           <w:bCs/>
         </w:rPr>
-        <w:t xml:space="preserve">[Title] </w:t>
+        <w:t>[</w:t>
       </w:r>
       <w:r>
         <w:rPr>
@@ -1544,7 +1985,7 @@
           <w:b/>
           <w:bCs/>
         </w:rPr>
-        <w:t xml:space="preserve">Robustness and Replicability in Economics </w:t>
+        <w:t>title</w:t>
       </w:r>
       <w:r>
         <w:rPr>
@@ -1552,12 +1993,56 @@
           <w:b/>
           <w:bCs/>
         </w:rPr>
-        <w:t>(Research project)</w:t>
+        <w:t xml:space="preserve">] </w:t>
+      </w:r>
+      <w:r>
+        <w:rPr>
+          <w:rFonts w:ascii="Georgia" w:hAnsi="Georgia"/>
+          <w:b/>
+          <w:bCs/>
+        </w:rPr>
+        <w:t xml:space="preserve">Robustness and Replicability in Economics </w:t>
+      </w:r>
+      <w:r>
+        <w:rPr>
+          <w:rFonts w:ascii="Georgia" w:hAnsi="Georgia"/>
+          <w:b/>
+          <w:bCs/>
+        </w:rPr>
+        <w:t>(</w:t>
+      </w:r>
+      <w:r>
+        <w:rPr>
+          <w:rFonts w:ascii="Georgia" w:hAnsi="Georgia"/>
+          <w:b/>
+          <w:bCs/>
+        </w:rPr>
+        <w:t>Work in progress</w:t>
+      </w:r>
+      <w:r>
+        <w:rPr>
+          <w:rFonts w:ascii="Georgia" w:hAnsi="Georgia"/>
+          <w:b/>
+          <w:bCs/>
+        </w:rPr>
+        <w:t>)</w:t>
       </w:r>
     </w:p>
     <w:p>
       <w:r>
-        <w:t>[Project coordinators] Jörg</w:t>
+        <w:t>[</w:t>
+      </w:r>
+      <w:r>
+        <w:t>authors</w:t>
+      </w:r>
+      <w:r>
+        <w:t xml:space="preserve">] </w:t>
+      </w:r>
+      <w:r>
+        <w:t xml:space="preserve">Project coordinators: </w:t>
+      </w:r>
+      <w:r>
+        <w:t>Jörg</w:t>
       </w:r>
       <w:r>
         <w:t xml:space="preserve"> Ankel-Peters</w:t>
@@ -1573,6 +2058,11 @@
       </w:r>
       <w:r>
         <w:t>Julian Rose</w:t>
+      </w:r>
+    </w:p>
+    <w:p>
+      <w:r>
+        <w:t>[status] Work in progress</w:t>
       </w:r>
     </w:p>
     <w:p>
@@ -1635,7 +2125,6 @@
         <w:pStyle w:val="Heading1"/>
       </w:pPr>
       <w:r>
-        <w:lastRenderedPageBreak/>
         <w:t>4. CV page intro (optional)</w:t>
       </w:r>
     </w:p>
@@ -1645,7 +2134,23 @@
           <w:i/>
           <w:color w:val="808080"/>
         </w:rPr>
-        <w:t>Goes in: _pages/cv.md. One short line, or leave blank. The CV itself is the uploaded PDF.</w:t>
+        <w:t xml:space="preserve">Goes in: _pages/cv.md. One short </w:t>
+      </w:r>
+      <w:proofErr w:type="gramStart"/>
+      <w:r>
+        <w:rPr>
+          <w:i/>
+          <w:color w:val="808080"/>
+        </w:rPr>
+        <w:t>line, or</w:t>
+      </w:r>
+      <w:proofErr w:type="gramEnd"/>
+      <w:r>
+        <w:rPr>
+          <w:i/>
+          <w:color w:val="808080"/>
+        </w:rPr>
+        <w:t xml:space="preserve"> leave blank. The CV itself is the uploaded PDF.</w:t>
       </w:r>
     </w:p>
     <w:p>
@@ -2469,7 +2974,6 @@
   <w:style w:type="character" w:default="1" w:styleId="DefaultParagraphFont">
     <w:name w:val="Default Paragraph Font"/>
     <w:uiPriority w:val="1"/>
-    <w:semiHidden/>
     <w:unhideWhenUsed/>
   </w:style>
   <w:style w:type="table" w:default="1" w:styleId="TableNormal">

</xml_diff>